<commit_message>
Revisión ADC: verificación del segundo revisor y lista PRISMA-ScR
El manuscrito recoge la lectura de 169 resúmenes por una segunda persona
(las 94 discrepancias y una muestra del 20 % de los acuerdos), que confirmó
todas las decisiones. Se añaden la lista de verificación PRISMA-ScR (S3) y
el script que completará los coautores con Crossref.

Co-Authored-By: Claude Opus 5.5 <noreply@anthropic.com>
Claude-Session: https://claude.ai/code/session_01W48ggkE3iqcgcPHVfB8T9P
</commit_message>
<xml_diff>
--- a/revision-adc/manuscrito-review-of-education.docx
+++ b/revision-adc/manuscrito-review-of-education.docx
@@ -21,7 +21,7 @@
     <w:p>
       <w:pPr/>
       <w:r>
-        <w:t xml:space="preserve">Critical digital literacy (CDL) asks learners to read digital technologies as sites of power and not only as tools. This scoping review maps how research on CDL in formal education developed between 2016 and 2026. Following PRISMA-ScR, I searched Scopus for journal articles and reviews in English and Spanish and screened 469 records in two independent passes, one based on titles and one on abstracts and author keywords, resolving disagreements with an explicit decision rule (κ = 0.51). The 135 included studies were charted by language, country, educational level, design, theoretical tradition and object of critique. Output grew by an estimated 21% a year between 2016 and 2025 (95% CI 11–31%), and 52 studies appeared in 2026 alone. The object of critique shifted: artificial intelligence, mostly generative, was absent before 2020 and appears in 43% of the studies published in 2024–2026; work on algorithms, data and platforms rose from 6% to 32%, while attention to social media held steady. Media literacy and multiliteracies, the dominant frames of the early years, lost ground. Research is concentrated in higher education (41%) and teacher education (29%), and early childhood and primary education account for 7%. Qualitative and conceptual designs predominate, and only 26 studies describe an intervention. Studies written in Spanish rose to 21% of the most recent period. The field responds quickly to each new technology but has yet to reach young children, to show what learners gain, or to settle on a conceptual core that outlasts any single platform.</w:t>
+        <w:t xml:space="preserve">Critical digital literacy (CDL) asks learners to read digital technologies as sites of power and not only as tools. This scoping review maps research on CDL in formal education published in English and Spanish between 2016 and 2026. Following PRISMA-ScR, I screened 469 Scopus records in two independent passes, one based on titles and one on abstracts and author keywords, and resolved disagreements with an explicit decision rule (κ = 0.51). A second reviewer read the abstracts of 169 records, including every disagreement, and confirmed all decisions. The 135 included studies were charted on six variables. Output grew by an estimated 21% a year between 2016 and 2025 (95% CI 11–31%), and 52 studies appeared in 2026 alone. The object of critique shifted: artificial intelligence, mostly generative, was absent before 2020 and appears in 43% of the studies published in 2024–2026; work on algorithms, data and platforms rose from 6% to 32%, while attention to social media held steady. Media literacy and multiliteracies, the dominant frames of the early years, lost ground. Research is concentrated in higher education (41%) and teacher education (29%), and early childhood and primary education account for 7%. Qualitative and conceptual designs predominate, and only 26 studies describe an intervention. Studies written in Spanish rose to 21% of the most recent period. The field responds quickly to each new technology but has yet to reach young children, to show what learners gain, or to settle on a conceptual core that outlasts any single platform.</w:t>
       </w:r>
     </w:p>
     <w:p>
@@ -1107,6 +1107,18 @@
       </w:r>
     </w:p>
     <w:p>
+      <w:pPr/>
+      <w:r>
+        <w:rPr>
+          <w:b/>
+        </w:rPr>
+        <w:t xml:space="preserve">Verification by a second reviewer.</w:t>
+      </w:r>
+      <w:r>
+        <w:t xml:space="preserve"> A second reviewer read the abstracts of all 94 disputed records and of a random sample of 75 of the 375 records on which the two passes agreed (20%), 169 records in all, and checked each final decision against the criteria in Table 1. The second reviewer agreed with all 169 decisions, and none was changed.</w:t>
+      </w:r>
+    </w:p>
+    <w:p>
       <w:pPr>
         <w:pStyle w:val="Heading3"/>
       </w:pPr>
@@ -1169,7 +1181,7 @@
       <w:r>
         <w:drawing>
           <wp:inline distT="0" distB="0" distL="0" distR="0">
-            <wp:extent cx="5486400" cy="3951514"/>
+            <wp:extent cx="5486400" cy="4588328"/>
             <wp:docPr id="1" name="image1" descr="Figure 1 · adapted from the PRISMA 2020 flow diagram (Page et al., 2021) · Scopus, 27 October 2026"/>
             <a:graphic xmlns:a="http://schemas.openxmlformats.org/drawingml/2006/main">
               <a:graphicData uri="http://schemas.openxmlformats.org/drawingml/2006/picture">
@@ -1187,7 +1199,7 @@
                   <pic:spPr>
                     <a:xfrm>
                       <a:off x="0" y="0"/>
-                      <a:ext cx="5486400" cy="3951514"/>
+                      <a:ext cx="5486400" cy="4588328"/>
                     </a:xfrm>
                     <a:prstGeom prst="rect">
                       <a:avLst/>
@@ -1237,7 +1249,7 @@
     <w:p>
       <w:pPr/>
       <w:r>
-        <w:t xml:space="preserve">The search returned 469 records and no duplicates. After the two screening passes and adjudication, 135 studies were included (Figure 1). Most exclusions (320) were studies in which </w:t>
+        <w:t xml:space="preserve">The search returned 469 records and no duplicates. After the two screening passes, adjudication and the check by a second reviewer, 135 studies were included (Figure 1). Most exclusions (320) were studies in which </w:t>
       </w:r>
       <w:r>
         <w:rPr>
@@ -5728,7 +5740,7 @@
     <w:p>
       <w:pPr/>
       <w:r>
-        <w:t xml:space="preserve">The two screening passes agreed only moderately. Had the review relied on titles alone, it would have missed 50 of the 135 included studies and kept 44 that the abstract evidence did not support. Many studies in this field name CDL only in their abstract or keywords, and many titles that sound critical describe something else. Reviews of CDL, and probably of other critical literacies, should not screen on titles alone. When abstracts cannot be read, field-level searches inside them, as used here, offer a reproducible second pass.</w:t>
+        <w:t xml:space="preserve">The two screening passes agreed only moderately. Had the review relied on titles alone, it would have missed 50 of the 135 included studies and kept 44 that the abstract evidence did not support. Many studies in this field name CDL only in their abstract or keywords, and many titles that sound critical describe something else. The second reviewer, reading the abstracts, confirmed every decision that the rule had taken on the disputed records. Reviews of CDL, and probably of other critical literacies, should not screen on titles alone. When abstracts cannot be read in full, field-level searches inside them, as used here, offer a reproducible second pass.</w:t>
       </w:r>
     </w:p>
     <w:p>
@@ -5757,10 +5769,10 @@
         <w:rPr>
           <w:b/>
         </w:rPr>
-        <w:t xml:space="preserve">No reading of abstracts or full texts.</w:t>
-      </w:r>
-      <w:r>
-        <w:t xml:space="preserve"> The Scopus access available did not return the text of abstracts. Selection and charting therefore rest on titles and on whether given terms occur in abstracts and keywords. A study can mention a term without treating it, and the presence of a term says nothing about how well a study was done. For the same reason, the synthesis describes what studies set out to do and not what they found.</w:t>
+        <w:t xml:space="preserve">No appraisal of full texts.</w:t>
+      </w:r>
+      <w:r>
+        <w:t xml:space="preserve"> The Scopus access available did not return the text of abstracts, so both screening passes and the charting rest on titles and on term searches in abstracts and keywords. A second reviewer read the abstracts of 169 records, but full texts were not appraised. Codes therefore show that a term appears, not how a study treats it, and the synthesis describes what studies set out to do rather than what they found.</w:t>
       </w:r>
     </w:p>
     <w:p>
@@ -5778,7 +5790,7 @@
         <w:t xml:space="preserve">Screening.</w:t>
       </w:r>
       <w:r>
-        <w:t xml:space="preserve"> Pass 1 was carried out by a single reviewer assisted by a large language model, and pass 2 by a rule. There was no second human screener. The adjudication rule was set after the disagreements had been inspected, though before any was decided, and it was not registered in advance.</w:t>
+        <w:t xml:space="preserve"> Pass 1 was carried out by one reviewer assisted by a large language model and pass 2 by a rule. The adjudication rule was set after the disagreements had been inspected, though before any was decided, and it was not registered in advance. The second reviewer checked every disagreement but only a 20% sample of the agreed records, so errors among the other 300 agreed records cannot be ruled out.</w:t>
       </w:r>
     </w:p>
     <w:p>

</xml_diff>

<commit_message>
Completa los coautores de las referencias con Crossref y ORCID
Los autores del corpus salen de 09-crossref.json; referencias.py fija a mano
los casos que Crossref separa mal (apellidos dobles según ORCID) y corrige las
páginas de Mesquita-Romero et al. (2022). El libro de Excel lista los autores
completos en S1 y la cita en la Tabla 7, y el Word exportado ya no lleva
marcadores de segundo autor. Queda pendiente un solo estudio citado
(Salazar-Jiménez et al., 2026).

Co-Authored-By: Claude Opus 5.5 <noreply@anthropic.com>
Claude-Session: https://claude.ai/code/session_01W48ggkE3iqcgcPHVfB8T9P
</commit_message>
<xml_diff>
--- a/revision-adc/manuscrito-review-of-education.docx
+++ b/revision-adc/manuscrito-review-of-education.docx
@@ -3199,7 +3199,7 @@
     <w:p>
       <w:pPr/>
       <w:r>
-        <w:t xml:space="preserve">Two traditions gained ground without reaching significance. Freirean critical pedagogy rose from one study to 14.6% of the last period. It appears in proposals for a pedagogy of the "digitally oppressed" (Farag et al., 2022), in calls for an emancipatory critical digital pedagogy in universities (Gutiérrez-Ujaque, 2024) and in work on critical digital teaching competence for future primary teachers (Castañeda &amp; [second author], 2023). Race, gender and decolonial perspectives appear across the whole period and cluster in recent work on AI. Examples include the critical race algorithmic literacies that Black students used to resist AI-mediated racism at school (Tanksley, 2024), a survey of U.S. adolescents' critical race digital literacy skills (McGee et al., 2026), language decolonisation among Arab bilingual learners writing with AI (Alhabbash et al., 2026) and the gendered self-surveillance of adolescents on platforms (Regueira et al., 2026).</w:t>
+        <w:t xml:space="preserve">Two traditions gained ground without reaching significance. Freirean critical pedagogy rose from one study to 14.6% of the last period. It appears in proposals for a pedagogy of the "digitally oppressed" (Farag et al., 2022), in calls for an emancipatory critical digital pedagogy in universities (Gutiérrez-Ujaque, 2024) and in work on critical digital teaching competence for future primary teachers (Castañeda &amp; Villar-Onrubia, 2023). Race, gender and decolonial perspectives appear across the whole period and cluster in recent work on AI. Examples include the critical race algorithmic literacies that Black students used to resist AI-mediated racism at school (Tanksley, 2024), a survey of U.S. adolescents' critical race digital literacy skills (McGee et al., 2026), language decolonisation among Arab bilingual learners writing with AI (Alhabbash et al., 2026) and the gendered self-surveillance of adolescents on platforms (Regueira et al., 2026).</w:t>
       </w:r>
     </w:p>
     <w:p>
@@ -3327,7 +3327,7 @@
     <w:p>
       <w:pPr/>
       <w:r>
-        <w:t xml:space="preserve">Studies of social media analyse political memes with middle school students (Elmore &amp; [second author], 2019), use social media as a site for multimodal critical digital literacy in higher education (Talib, 2018), or follow how adolescents negotiate privacy on Instagram (González-Villa &amp; [second author], 2026). Work on platforms and data includes critical data literacy for academic development (Atenas et al., 2023), the experiences of primary school pupils in platformised schools (Moreno-González et al., 2026), algorithm-aware writing pedagogies in English for academic purposes (Wang &amp; [second author], 2026), and CDL as a response to neofascism among young people in the platform era (Herrera Urízar, 2026). Research on AI is the most recent strand, and it includes the most cited study in the corpus, which argues that second language writing mediated by generative AI needs critical digital literacies (Darvin, 2025). Others examine ideological bias in chatbot interactions (Van Poucke, 2024), visual bias in AI-generated images (Weninger &amp; [second author], 2026) and bias in AI-supported lesson planning (Zagami, 2026), or propose frameworks and scales for critical AI literacy (Bozkurt et al., 2026; Stewart &amp; [second author], 2025). More than a third of the studies on AI come from language education and academic writing.</w:t>
+        <w:t xml:space="preserve">Studies of social media analyse political memes with middle school students (Elmore &amp; Coleman, 2019), use social media as a site for multimodal critical digital literacy in higher education (Talib, 2018), or follow how adolescents negotiate privacy on Instagram (González-Villa &amp; Gewerc, 2026). Work on platforms and data includes critical data literacy for academic development (Atenas et al., 2023), the experiences of primary school pupils in platformised schools (Moreno-González et al., 2026), algorithm-aware writing pedagogies in English for academic purposes (Wang &amp; Xu, 2026), and CDL as a response to neofascism among young people in the platform era (Herrera Urízar, 2026). Research on AI is the most recent strand, and it includes the most cited study in the corpus, which argues that second language writing mediated by generative AI needs critical digital literacies (Darvin, 2025). Others examine ideological bias in chatbot interactions (Van Poucke, 2024), visual bias in AI-generated images (Weninger &amp; Xu, 2026) and bias in AI-supported lesson planning (Zagami, 2026), or propose frameworks and scales for critical AI literacy (Bozkurt et al., 2026; Stewart &amp; Rodgers, 2025). More than a third of the studies on AI come from language education and academic writing.</w:t>
       </w:r>
     </w:p>
     <w:p>
@@ -4771,7 +4771,7 @@
           <w:p>
             <w:pPr/>
             <w:r>
-              <w:t xml:space="preserve">Political memes in middle school (Elmore &amp; [second author], 2019); diversity in airline safety videos (Ho &amp; [second author], 2025); ideological bias in chatbot answers (Van Poucke, 2024); visual bias in AI images (Weninger &amp; [second author], 2026)</w:t>
+              <w:t xml:space="preserve">Political memes in middle school (Elmore &amp; Coleman, 2019); diversity in airline safety videos (Ho &amp; Hafner, 2025); ideological bias in chatbot answers (Van Poucke, 2024); visual bias in AI images (Weninger &amp; Xu, 2026)</w:t>
             </w:r>
           </w:p>
         </w:tc>
@@ -4806,7 +4806,7 @@
           <w:p>
             <w:pPr/>
             <w:r>
-              <w:t xml:space="preserve">Video production in elementary teacher education (Watt, 2019); digital storytelling on District Six (Noble &amp; [second author], 2022); bilingual Vine making (de los Ríos, 2018); a poster campaign on cyberbullying (Damaskinidis et al., 2026)</w:t>
+              <w:t xml:space="preserve">Video production in elementary teacher education (Watt, 2019); digital storytelling on District Six (Noble &amp; Gachago, 2022); bilingual Vine making (de los Ríos, 2018); a poster campaign on cyberbullying (Damaskinidis et al., 2026)</w:t>
             </w:r>
           </w:p>
         </w:tc>
@@ -4841,7 +4841,7 @@
           <w:p>
             <w:pPr/>
             <w:r>
-              <w:t xml:space="preserve">Hauck (2019); ELT teacher education (Bilki et al., 2023); multimodal representation (Satar et al., 2023); a COIL project with pre-service teachers (Ketzer-Nöltge &amp; [second author], 2022)</w:t>
+              <w:t xml:space="preserve">Hauck (2019); ELT teacher education (Bilki et al., 2023); multimodal representation (Satar et al., 2023); a COIL project with pre-service teachers (Ketzer-Nöltge &amp; Markovic, 2022)</w:t>
             </w:r>
           </w:p>
         </w:tc>
@@ -4876,7 +4876,7 @@
           <w:p>
             <w:pPr/>
             <w:r>
-              <w:t xml:space="preserve">Co-design around an indie video game (Torras et al., 2026); conspiracy theories in English classes (Gerlach et al., 2025); reflection notebooks on misinformation (Spracklin &amp; [second author], 2025); service learning with preschool teachers (Lo et al., 2024)</w:t>
+              <w:t xml:space="preserve">Co-design around an indie video game (Jiménez Torras et al., 2026); conspiracy theories in English classes (Gerlach et al., 2025); reflection notebooks on misinformation (Spracklin &amp; Espina, 2025); service learning with preschool teachers (Lo et al., 2024)</w:t>
             </w:r>
           </w:p>
         </w:tc>
@@ -4911,7 +4911,7 @@
           <w:p>
             <w:pPr/>
             <w:r>
-              <w:t xml:space="preserve">Civic interrogation in a ninth-grade ethnic studies course (Kwon &amp; [second author], 2019); student activism after the Parkland shooting (Abowitz &amp; [second author], 2020); university digital activism in Peru (Fernández, 2026); Black students resisting AI-mediated racism (Tanksley, 2024)</w:t>
+              <w:t xml:space="preserve">Civic interrogation in a ninth-grade ethnic studies course (Kwon &amp; de los Ríos, 2019); student activism after the Parkland shooting (Abowitz &amp; Mamlok, 2020); university digital activism in Peru (Fernández, 2026); Black students resisting AI-mediated racism (Tanksley, 2024)</w:t>
             </w:r>
           </w:p>
         </w:tc>
@@ -4926,7 +4926,7 @@
     <w:p>
       <w:pPr/>
       <w:r>
-        <w:t xml:space="preserve">Teachers are the focus of 39 studies (28.9%), many of them in initial teacher education. Some ask how teachers understand CDL and how it shows in their practice (Gouseti et al., 2024) or measure the skills and attitudes of future teachers (Castellví et al., 2020; Santisteban et al., 2020). Others study how teacher educators build CDL into their own work, through inquiry groups (Lohnes Watulak, 2016), scalar analyses of teacher education programmes (Stewart et al., 2021) or collaborative autoethnography (Kim et al., 2026). Since 2025 a new strand asks what generative AI means for teacher preparation, from novice teachers planning lessons with ChatGPT (Javahery et al., 2025) to bias in AI-supported differentiation (Zagami, 2026). Several studies question how CDL fits within the use-centred digital competence frameworks that organise teacher education (Castañeda &amp; [second author], 2023; Salazar-Jiménez et al., 2026), and some propose frameworks of their own, for instance for second-language teacher education in the Global South (Mahapatra &amp; [second author], 2025).</w:t>
+        <w:t xml:space="preserve">Teachers are the focus of 39 studies (28.9%), many of them in initial teacher education. Some ask how teachers understand CDL and how it shows in their practice (Gouseti et al., 2024) or measure the skills and attitudes of future teachers (Castellví et al., 2020; Santisteban et al., 2020). Others study how teacher educators build CDL into their own work, through inquiry groups (Lohnes Watulak, 2016), scalar analyses of teacher education programmes (Stewart et al., 2021) or collaborative autoethnography (Kim et al., 2026). Since 2025 a new strand asks what generative AI means for teacher preparation, from novice teachers planning lessons with ChatGPT (Javahery et al., 2025) to bias in AI-supported differentiation (Zagami, 2026). Several studies question how CDL fits within the use-centred digital competence frameworks that organise teacher education (Castañeda &amp; Villar-Onrubia, 2023; Salazar-Jiménez et al., 2026), and some propose frameworks of their own, for instance for second-language teacher education in the Global South (Mahapatra &amp; Koltovskaia, 2025).</w:t>
       </w:r>
     </w:p>
     <w:p>
@@ -4955,11 +4955,11 @@
         <w:tblLook w:val="04A0" w:firstRow="1" w:lastRow="0" w:firstColumn="0" w:lastColumn="0" w:noHBand="0" w:noVBand="1"/>
       </w:tblPr>
       <w:tblGrid>
-        <w:gridCol w:w="1566"/>
-        <w:gridCol w:w="1637"/>
+        <w:gridCol w:w="1539"/>
+        <w:gridCol w:w="1644"/>
         <w:gridCol w:w="1186"/>
         <w:gridCol w:w="1107"/>
-        <w:gridCol w:w="3864"/>
+        <w:gridCol w:w="3884"/>
       </w:tblGrid>
       <w:tr>
         <w:trPr>
@@ -4967,7 +4967,7 @@
         </w:trPr>
         <w:tc>
           <w:tcPr>
-            <w:tcW w:w="1566" w:type="dxa"/>
+            <w:tcW w:w="1539" w:type="dxa"/>
             <w:shd w:val="clear" w:color="auto" w:fill="F2F2F2"/>
           </w:tcPr>
           <w:p>
@@ -4979,7 +4979,7 @@
         </w:tc>
         <w:tc>
           <w:tcPr>
-            <w:tcW w:w="1637" w:type="dxa"/>
+            <w:tcW w:w="1644" w:type="dxa"/>
             <w:shd w:val="clear" w:color="auto" w:fill="F2F2F2"/>
           </w:tcPr>
           <w:p>
@@ -5015,7 +5015,7 @@
         </w:tc>
         <w:tc>
           <w:tcPr>
-            <w:tcW w:w="3864" w:type="dxa"/>
+            <w:tcW w:w="3884" w:type="dxa"/>
             <w:shd w:val="clear" w:color="auto" w:fill="F2F2F2"/>
           </w:tcPr>
           <w:p>
@@ -5029,7 +5029,7 @@
       <w:tr>
         <w:tc>
           <w:tcPr>
-            <w:tcW w:w="1566" w:type="dxa"/>
+            <w:tcW w:w="1539" w:type="dxa"/>
           </w:tcPr>
           <w:p>
             <w:pPr/>
@@ -5040,7 +5040,7 @@
         </w:tc>
         <w:tc>
           <w:tcPr>
-            <w:tcW w:w="1637" w:type="dxa"/>
+            <w:tcW w:w="1644" w:type="dxa"/>
           </w:tcPr>
           <w:p>
             <w:pPr/>
@@ -5076,7 +5076,7 @@
         </w:tc>
         <w:tc>
           <w:tcPr>
-            <w:tcW w:w="3864" w:type="dxa"/>
+            <w:tcW w:w="3884" w:type="dxa"/>
           </w:tcPr>
           <w:p>
             <w:pPr/>
@@ -5089,7 +5089,7 @@
       <w:tr>
         <w:tc>
           <w:tcPr>
-            <w:tcW w:w="1566" w:type="dxa"/>
+            <w:tcW w:w="1539" w:type="dxa"/>
           </w:tcPr>
           <w:p>
             <w:pPr/>
@@ -5100,7 +5100,7 @@
         </w:tc>
         <w:tc>
           <w:tcPr>
-            <w:tcW w:w="1637" w:type="dxa"/>
+            <w:tcW w:w="1644" w:type="dxa"/>
           </w:tcPr>
           <w:p>
             <w:pPr/>
@@ -5136,7 +5136,7 @@
         </w:tc>
         <w:tc>
           <w:tcPr>
-            <w:tcW w:w="3864" w:type="dxa"/>
+            <w:tcW w:w="3884" w:type="dxa"/>
           </w:tcPr>
           <w:p>
             <w:pPr/>
@@ -5149,7 +5149,7 @@
       <w:tr>
         <w:tc>
           <w:tcPr>
-            <w:tcW w:w="1566" w:type="dxa"/>
+            <w:tcW w:w="1539" w:type="dxa"/>
           </w:tcPr>
           <w:p>
             <w:pPr/>
@@ -5160,7 +5160,7 @@
         </w:tc>
         <w:tc>
           <w:tcPr>
-            <w:tcW w:w="1637" w:type="dxa"/>
+            <w:tcW w:w="1644" w:type="dxa"/>
           </w:tcPr>
           <w:p>
             <w:pPr/>
@@ -5196,7 +5196,7 @@
         </w:tc>
         <w:tc>
           <w:tcPr>
-            <w:tcW w:w="3864" w:type="dxa"/>
+            <w:tcW w:w="3884" w:type="dxa"/>
           </w:tcPr>
           <w:p>
             <w:pPr/>
@@ -5209,7 +5209,7 @@
       <w:tr>
         <w:tc>
           <w:tcPr>
-            <w:tcW w:w="1566" w:type="dxa"/>
+            <w:tcW w:w="1539" w:type="dxa"/>
           </w:tcPr>
           <w:p>
             <w:pPr/>
@@ -5220,7 +5220,7 @@
         </w:tc>
         <w:tc>
           <w:tcPr>
-            <w:tcW w:w="1637" w:type="dxa"/>
+            <w:tcW w:w="1644" w:type="dxa"/>
           </w:tcPr>
           <w:p>
             <w:pPr/>
@@ -5256,7 +5256,7 @@
         </w:tc>
         <w:tc>
           <w:tcPr>
-            <w:tcW w:w="3864" w:type="dxa"/>
+            <w:tcW w:w="3884" w:type="dxa"/>
           </w:tcPr>
           <w:p>
             <w:pPr/>
@@ -5269,7 +5269,7 @@
       <w:tr>
         <w:tc>
           <w:tcPr>
-            <w:tcW w:w="1566" w:type="dxa"/>
+            <w:tcW w:w="1539" w:type="dxa"/>
           </w:tcPr>
           <w:p>
             <w:pPr/>
@@ -5280,7 +5280,7 @@
         </w:tc>
         <w:tc>
           <w:tcPr>
-            <w:tcW w:w="1637" w:type="dxa"/>
+            <w:tcW w:w="1644" w:type="dxa"/>
           </w:tcPr>
           <w:p>
             <w:pPr/>
@@ -5316,7 +5316,7 @@
         </w:tc>
         <w:tc>
           <w:tcPr>
-            <w:tcW w:w="3864" w:type="dxa"/>
+            <w:tcW w:w="3884" w:type="dxa"/>
           </w:tcPr>
           <w:p>
             <w:pPr/>
@@ -5329,7 +5329,7 @@
       <w:tr>
         <w:tc>
           <w:tcPr>
-            <w:tcW w:w="1566" w:type="dxa"/>
+            <w:tcW w:w="1539" w:type="dxa"/>
           </w:tcPr>
           <w:p>
             <w:pPr/>
@@ -5340,7 +5340,7 @@
         </w:tc>
         <w:tc>
           <w:tcPr>
-            <w:tcW w:w="1637" w:type="dxa"/>
+            <w:tcW w:w="1644" w:type="dxa"/>
           </w:tcPr>
           <w:p>
             <w:pPr/>
@@ -5376,7 +5376,7 @@
         </w:tc>
         <w:tc>
           <w:tcPr>
-            <w:tcW w:w="3864" w:type="dxa"/>
+            <w:tcW w:w="3884" w:type="dxa"/>
           </w:tcPr>
           <w:p>
             <w:pPr/>
@@ -5389,7 +5389,7 @@
       <w:tr>
         <w:tc>
           <w:tcPr>
-            <w:tcW w:w="1566" w:type="dxa"/>
+            <w:tcW w:w="1539" w:type="dxa"/>
           </w:tcPr>
           <w:p>
             <w:pPr/>
@@ -5400,7 +5400,7 @@
         </w:tc>
         <w:tc>
           <w:tcPr>
-            <w:tcW w:w="1637" w:type="dxa"/>
+            <w:tcW w:w="1644" w:type="dxa"/>
           </w:tcPr>
           <w:p>
             <w:pPr/>
@@ -5436,7 +5436,7 @@
         </w:tc>
         <w:tc>
           <w:tcPr>
-            <w:tcW w:w="3864" w:type="dxa"/>
+            <w:tcW w:w="3884" w:type="dxa"/>
           </w:tcPr>
           <w:p>
             <w:pPr/>
@@ -5449,7 +5449,7 @@
       <w:tr>
         <w:tc>
           <w:tcPr>
-            <w:tcW w:w="1566" w:type="dxa"/>
+            <w:tcW w:w="1539" w:type="dxa"/>
           </w:tcPr>
           <w:p>
             <w:pPr/>
@@ -5460,7 +5460,7 @@
         </w:tc>
         <w:tc>
           <w:tcPr>
-            <w:tcW w:w="1637" w:type="dxa"/>
+            <w:tcW w:w="1644" w:type="dxa"/>
           </w:tcPr>
           <w:p>
             <w:pPr/>
@@ -5496,7 +5496,7 @@
         </w:tc>
         <w:tc>
           <w:tcPr>
-            <w:tcW w:w="3864" w:type="dxa"/>
+            <w:tcW w:w="3884" w:type="dxa"/>
           </w:tcPr>
           <w:p>
             <w:pPr/>
@@ -5509,7 +5509,7 @@
       <w:tr>
         <w:tc>
           <w:tcPr>
-            <w:tcW w:w="1566" w:type="dxa"/>
+            <w:tcW w:w="1539" w:type="dxa"/>
           </w:tcPr>
           <w:p>
             <w:pPr/>
@@ -5520,7 +5520,7 @@
         </w:tc>
         <w:tc>
           <w:tcPr>
-            <w:tcW w:w="1637" w:type="dxa"/>
+            <w:tcW w:w="1644" w:type="dxa"/>
           </w:tcPr>
           <w:p>
             <w:pPr/>
@@ -5556,7 +5556,7 @@
         </w:tc>
         <w:tc>
           <w:tcPr>
-            <w:tcW w:w="3864" w:type="dxa"/>
+            <w:tcW w:w="3884" w:type="dxa"/>
           </w:tcPr>
           <w:p>
             <w:pPr/>
@@ -5569,18 +5569,18 @@
       <w:tr>
         <w:tc>
           <w:tcPr>
-            <w:tcW w:w="1566" w:type="dxa"/>
-          </w:tcPr>
-          <w:p>
-            <w:pPr/>
-            <w:r>
-              <w:t xml:space="preserve">Tagg &amp; [second author] (2021)</w:t>
-            </w:r>
-          </w:p>
-        </w:tc>
-        <w:tc>
-          <w:tcPr>
-            <w:tcW w:w="1637" w:type="dxa"/>
+            <w:tcW w:w="1539" w:type="dxa"/>
+          </w:tcPr>
+          <w:p>
+            <w:pPr/>
+            <w:r>
+              <w:t xml:space="preserve">Tagg &amp; Seargeant (2021)</w:t>
+            </w:r>
+          </w:p>
+        </w:tc>
+        <w:tc>
+          <w:tcPr>
+            <w:tcW w:w="1644" w:type="dxa"/>
           </w:tcPr>
           <w:p>
             <w:pPr/>
@@ -5616,7 +5616,7 @@
         </w:tc>
         <w:tc>
           <w:tcPr>
-            <w:tcW w:w="3864" w:type="dxa"/>
+            <w:tcW w:w="3884" w:type="dxa"/>
           </w:tcPr>
           <w:p>
             <w:pPr/>
@@ -5898,7 +5898,7 @@
     <w:p>
       <w:pPr/>
       <w:r>
-        <w:t xml:space="preserve">Abowitz, K. K., &amp; [co-author]. (2020). #NeverAgainMSD student activism: Lessons for agonist political education in an age of democratic crisis. </w:t>
+        <w:t xml:space="preserve">Abowitz, K. K., &amp; Mamlok, D. (2020). #NeverAgainMSD student activism: Lessons for agonist political education in an age of democratic crisis. </w:t>
       </w:r>
       <w:r>
         <w:rPr>
@@ -5922,7 +5922,7 @@
     <w:p>
       <w:pPr/>
       <w:r>
-        <w:t xml:space="preserve">AlGhannama, B., [+3 co-authors]. (2025). Psychometric evaluation of the Comprehensive Digital Literacy Scale (CDLS): A measurement of critical digital literacy and basic operational digital skills. </w:t>
+        <w:t xml:space="preserve">AlGhannama, B., Alsaber, A., Alkandari, A., &amp; Anbar, A. (2025). Psychometric evaluation of the Comprehensive Digital Literacy Scale (CDLS): A measurement of critical digital literacy and basic operational digital skills. </w:t>
       </w:r>
       <w:r>
         <w:rPr>
@@ -5946,7 +5946,7 @@
     <w:p>
       <w:pPr/>
       <w:r>
-        <w:t xml:space="preserve">Alhabbash, M., [+3 co-authors]. (2026). Writing back with AI: A phenomenological study of language decolonization among Arab bilingual learners. </w:t>
+        <w:t xml:space="preserve">Alhabbash, M., Al Mohammedi, N., Omar, H., &amp; Alothali, S. (2026). Writing back with AI: A phenomenological study of language decolonization among Arab bilingual learners. </w:t>
       </w:r>
       <w:r>
         <w:rPr>
@@ -5994,7 +5994,7 @@
     <w:p>
       <w:pPr/>
       <w:r>
-        <w:t xml:space="preserve">Atenas, J., [+3 co-authors]. (2023). Critical data literacy in praxis: An open education approach for academic development. </w:t>
+        <w:t xml:space="preserve">Atenas, J., Havemann, L., Rodés, V., &amp; Podetti, M. (2023). Critical data literacy in praxis: An open education approach for academic development. </w:t>
       </w:r>
       <w:r>
         <w:rPr>
@@ -6009,7 +6009,7 @@
     <w:p>
       <w:pPr/>
       <w:r>
-        <w:t xml:space="preserve">Bilki, Z., [+2 co-authors]. (2023). Critical digital literacy in virtual exchange for ELT teacher education: An interpretivist methodology. </w:t>
+        <w:t xml:space="preserve">Bilki, Z., Satar, M., &amp; Sak, M. (2023). Critical digital literacy in virtual exchange for ELT teacher education: An interpretivist methodology. </w:t>
       </w:r>
       <w:r>
         <w:rPr>
@@ -6033,7 +6033,7 @@
     <w:p>
       <w:pPr/>
       <w:r>
-        <w:t xml:space="preserve">Bozkurt, A., [+2 co-authors]. (2026). What does it mean to be AI literate? Psychometric validation of the Critical 3wAI Literacy Scale. </w:t>
+        <w:t xml:space="preserve">Bozkurt, A., Ertan, S., &amp; Cömert, Z. (2026). What does it mean to be AI literate? Psychometric validation of the Critical 3wAI Literacy Scale. </w:t>
       </w:r>
       <w:r>
         <w:rPr>
@@ -6057,7 +6057,7 @@
     <w:p>
       <w:pPr/>
       <w:r>
-        <w:t xml:space="preserve">Castañeda, L., &amp; [co-author]. (2023). Beyond functionality: Building critical digital teaching competence among future primary education teachers. </w:t>
+        <w:t xml:space="preserve">Castañeda, L., &amp; Villar-Onrubia, D. (2023). Beyond functionality: Building critical digital teaching competence among future primary education teachers. </w:t>
       </w:r>
       <w:r>
         <w:rPr>
@@ -6081,7 +6081,7 @@
     <w:p>
       <w:pPr/>
       <w:r>
-        <w:t xml:space="preserve">Castellví, J., [+2 co-authors]. (2020). Pre-service teachers' critical digital literacy skills and attitudes to address social problems. </w:t>
+        <w:t xml:space="preserve">Castellví, J., Díez-Bedmar, M.-C., &amp; Santisteban, A. (2020). Pre-service teachers' critical digital literacy skills and attitudes to address social problems. </w:t>
       </w:r>
       <w:r>
         <w:rPr>
@@ -6105,7 +6105,7 @@
     <w:p>
       <w:pPr/>
       <w:r>
-        <w:t xml:space="preserve">Creely, E., [+5 co-authors]. (2026). Critical literacies in upper primary in Australia (2014–2024): A thematic literature review. </w:t>
+        <w:t xml:space="preserve">Creely, E., Parr, G., Richardson, H., Carabott, K., McLeod, A., &amp; Scull, J. (2026). Critical literacies in upper primary in Australia (2014–2024): A thematic literature review. </w:t>
       </w:r>
       <w:r>
         <w:rPr>
@@ -6129,7 +6129,7 @@
     <w:p>
       <w:pPr/>
       <w:r>
-        <w:t xml:space="preserve">Damaskinidis, G., [+2 co-authors]. (2026). Intersemiotic translation as a pedagogy for cyberbullying awareness: The One Shot is Enough poster campaign. </w:t>
+        <w:t xml:space="preserve">Damaskinidis, G., Pliogou, V., &amp; Tromara, S. (2026). Intersemiotic translation as a pedagogy for cyberbullying awareness: The One Shot is Enough poster campaign. </w:t>
       </w:r>
       <w:r>
         <w:rPr>
@@ -6201,7 +6201,7 @@
     <w:p>
       <w:pPr/>
       <w:r>
-        <w:t xml:space="preserve">Elmore, P. G., &amp; [co-author]. (2019). Middle school students' analysis of political memes to support critical media literacy. </w:t>
+        <w:t xml:space="preserve">Elmore, P. G., &amp; Coleman, J. M. (2019). Middle school students' analysis of political memes to support critical media literacy. </w:t>
       </w:r>
       <w:r>
         <w:rPr>
@@ -6225,7 +6225,7 @@
     <w:p>
       <w:pPr/>
       <w:r>
-        <w:t xml:space="preserve">Escribano-Muñoz, C., [+2 co-authors]. (2024). Confluences between critical thinking and social media in the educational world. Mapping experiences and detecting challenges. </w:t>
+        <w:t xml:space="preserve">Escribano-Muñoz, C., Gil-Fernández, R., &amp; Calderón-Garrido, D. (2024). Confluences between critical thinking and social media in the educational world. Mapping experiences and detecting challenges. </w:t>
       </w:r>
       <w:r>
         <w:rPr>
@@ -6249,7 +6249,7 @@
     <w:p>
       <w:pPr/>
       <w:r>
-        <w:t xml:space="preserve">Farag, A., [+2 co-authors]. (2022). Freire 2.0: Pedagogy of the digitally oppressed. </w:t>
+        <w:t xml:space="preserve">Farag, A., Greeley, L., &amp; Swindell, A. (2022). Freire 2.0: Pedagogy of the digitally oppressed. </w:t>
       </w:r>
       <w:r>
         <w:rPr>
@@ -6312,7 +6312,7 @@
     <w:p>
       <w:pPr/>
       <w:r>
-        <w:t xml:space="preserve">Gerlach, D., [+2 co-authors]. (2025). Developing critical minds: An ethnographic study on the implementation of conspiracy theories to foster critical digital literacy in English language classrooms. </w:t>
+        <w:t xml:space="preserve">Gerlach, D., Schildhauer, P., &amp; Weiser-Zurmühlen, K. (2025). Developing critical minds: An ethnographic study on the implementation of conspiracy theories to foster critical digital literacy in English language classrooms. </w:t>
       </w:r>
       <w:r>
         <w:rPr>
@@ -6336,7 +6336,7 @@
     <w:p>
       <w:pPr/>
       <w:r>
-        <w:t xml:space="preserve">González-Villa, Á., &amp; [co-author]. (2026). Adolescent practices of privacy negotiation on Instagram: The need for critical digital literacy in schools. </w:t>
+        <w:t xml:space="preserve">González-Villa, Á., &amp; Gewerc, A. (2026). Adolescent practices of privacy negotiation on Instagram: The need for critical digital literacy in schools. </w:t>
       </w:r>
       <w:r>
         <w:rPr>
@@ -6360,7 +6360,7 @@
     <w:p>
       <w:pPr/>
       <w:r>
-        <w:t xml:space="preserve">Gouseti, A., [+5 co-authors]. (2024). Exploring teachers' perceptions of critical digital literacies and how these are manifested in their teaching practices. </w:t>
+        <w:t xml:space="preserve">Gouseti, A., Lakkala, M., Raffaghelli, J., Ranieri, M., Roffi, A., &amp; Ilomäki, L. (2024). Exploring teachers' perceptions of critical digital literacies and how these are manifested in their teaching practices. </w:t>
       </w:r>
       <w:r>
         <w:rPr>
@@ -6480,7 +6480,7 @@
     <w:p>
       <w:pPr/>
       <w:r>
-        <w:t xml:space="preserve">Ho, W. Y. J., &amp; [co-author]. (2025). Representations of diversity, equity, and inclusion in airline safety videos: Insights for fostering students' critical digital literacies. </w:t>
+        <w:t xml:space="preserve">Ho, W. Y. J., &amp; Hafner, C. A. (2025). Representations of diversity, equity, and inclusion in airline safety videos: Insights for fostering students' critical digital literacies. </w:t>
       </w:r>
       <w:r>
         <w:rPr>
@@ -6504,7 +6504,7 @@
     <w:p>
       <w:pPr/>
       <w:r>
-        <w:t xml:space="preserve">Ilomäki, L., [+6 co-authors]. (2023). Critical digital literacies at school level: A systematic review. </w:t>
+        <w:t xml:space="preserve">Ilomäki, L., Lakkala, M., Kallunki, V., Mundy, D., Romero, M., Romeu, T., &amp; Gouseti, A. (2023). Critical digital literacies at school level: A systematic review. </w:t>
       </w:r>
       <w:r>
         <w:rPr>
@@ -6543,7 +6543,7 @@
     <w:p>
       <w:pPr/>
       <w:r>
-        <w:t xml:space="preserve">Javahery, P., [+2 co-authors]. (2025). Exploring Iranian novice EFL trainees' perceptions of ChatGPT use for lesson planning through a critical digital literacy lens. </w:t>
+        <w:t xml:space="preserve">Javahery, P., Alpat, M. F., &amp; Kamali, J. (2025). Exploring Iranian novice EFL trainees' perceptions of ChatGPT use for lesson planning through a critical digital literacy lens. </w:t>
       </w:r>
       <w:r>
         <w:rPr>
@@ -6567,6 +6567,30 @@
     <w:p>
       <w:pPr/>
       <w:r>
+        <w:t xml:space="preserve">Jiménez Torras, D., Noguera Pigem, E., &amp; Lara Blanco, S. (2026). Critical digital literacy for Catalan high school students: Co-design of an educational module around an indie video game. </w:t>
+      </w:r>
+      <w:r>
+        <w:rPr>
+          <w:i/>
+        </w:rPr>
+        <w:t xml:space="preserve">Knowledge Management &amp; E-Learning</w:t>
+      </w:r>
+      <w:r>
+        <w:t xml:space="preserve">, </w:t>
+      </w:r>
+      <w:r>
+        <w:rPr>
+          <w:i/>
+        </w:rPr>
+        <w:t xml:space="preserve">18</w:t>
+      </w:r>
+      <w:r>
+        <w:t xml:space="preserve">(2), 216–233. https://doi.org/10.34105/j.kmel.2026.18.010</w:t>
+      </w:r>
+    </w:p>
+    <w:p>
+      <w:pPr/>
+      <w:r>
         <w:t xml:space="preserve">Kellner, D., &amp; Share, J. (2007). Critical media literacy is not an option. </w:t>
       </w:r>
       <w:r>
@@ -6591,7 +6615,7 @@
     <w:p>
       <w:pPr/>
       <w:r>
-        <w:t xml:space="preserve">Ketzer-Nöltge, A., &amp; [co-author]. (2022). Fostering pre-service teachers' information and critical digital literacy skills through a COIL project. </w:t>
+        <w:t xml:space="preserve">Ketzer-Nöltge, A., &amp; Markovic, M. (2022). Fostering pre-service teachers' information and critical digital literacy skills through a COIL project. </w:t>
       </w:r>
       <w:r>
         <w:rPr>
@@ -6615,7 +6639,7 @@
     <w:p>
       <w:pPr/>
       <w:r>
-        <w:t xml:space="preserve">Kim, N., [+3 co-authors]. (2026). Centering critical digital literacy in the lives of language teaching professionals: A collaborative autoethnographic exploration. </w:t>
+        <w:t xml:space="preserve">Kim, N., Cheung, M. M., Lee, V. W. Y., &amp; De Costa, P. I. (2026). Centering critical digital literacy in the lives of language teaching professionals: A collaborative autoethnographic exploration. </w:t>
       </w:r>
       <w:r>
         <w:rPr>
@@ -6639,7 +6663,7 @@
     <w:p>
       <w:pPr/>
       <w:r>
-        <w:t xml:space="preserve">Kwon, L., &amp; [co-author]. (2019). "See, click, fix": Civic interrogation and digital tools in a ninth-grade ethnic studies course. </w:t>
+        <w:t xml:space="preserve">Kwon, L., &amp; de los Ríos, C. V. (2019). "See, click, fix": Civic interrogation and digital tools in a ninth-grade ethnic studies course. </w:t>
       </w:r>
       <w:r>
         <w:rPr>
@@ -6663,7 +6687,7 @@
     <w:p>
       <w:pPr/>
       <w:r>
-        <w:t xml:space="preserve">Lewis, C., [+2 co-authors]. (2021). The sociocultural role of imagination in critical digital literacy. </w:t>
+        <w:t xml:space="preserve">Lewis, C., Crampton, A., &amp; Scharber, C. (2021). The sociocultural role of imagination in critical digital literacy. </w:t>
       </w:r>
       <w:r>
         <w:rPr>
@@ -6687,7 +6711,7 @@
     <w:p>
       <w:pPr/>
       <w:r>
-        <w:t xml:space="preserve">Lo, H. C., [+2 co-authors]. (2024). Enhancing critical digital literacy of preservice preschool teachers through service learning: The moderator of online social capital. </w:t>
+        <w:t xml:space="preserve">Lo, H.-C., Wang, T.-H., &amp; Chen, R.-S. (2024). Enhancing critical digital literacy of preservice preschool teachers through service learning: The moderator of online social capital. </w:t>
       </w:r>
       <w:r>
         <w:rPr>
@@ -6759,7 +6783,7 @@
     <w:p>
       <w:pPr/>
       <w:r>
-        <w:t xml:space="preserve">Mahapatra, S., &amp; [co-author]. (2025). A framework for focalising critical digital literacies in second language teacher education in the Global South. </w:t>
+        <w:t xml:space="preserve">Mahapatra, S., &amp; Koltovskaia, S. (2025). A framework for focalising critical digital literacies in second language teacher education in the Global South. </w:t>
       </w:r>
       <w:r>
         <w:rPr>
@@ -6783,7 +6807,7 @@
     <w:p>
       <w:pPr/>
       <w:r>
-        <w:t xml:space="preserve">Maiorana, F., [+7 co-authors]. (2023). Critical digital literacy and active citizenship at school: The experience of the Scientix Ambassadors. </w:t>
+        <w:t xml:space="preserve">Maiorana, F., Altieri, S., Colli, A., Labri, M., Nazzaro, L., Porta, M., Severi, A., &amp; Cristaldi, G. (2023). Critical digital literacy and active citizenship at school: The experience of the Scientix Ambassadors. </w:t>
       </w:r>
       <w:r>
         <w:rPr>
@@ -6831,7 +6855,7 @@
     <w:p>
       <w:pPr/>
       <w:r>
-        <w:t xml:space="preserve">McGee, T., [+6 co-authors]. (2026). U.S. adolescents' critical race digital literacy skills: Demographic variables and learning opportunities as contributing factors. </w:t>
+        <w:t xml:space="preserve">McGee, T., Coopilton, M., English, D., Tynes, B. M., Gibson, S. M., Kahne, J., &amp; Willis, H. A. (2026). U.S. adolescents' critical race digital literacy skills: Demographic variables and learning opportunities as contributing factors. </w:t>
       </w:r>
       <w:r>
         <w:rPr>
@@ -6846,7 +6870,7 @@
     <w:p>
       <w:pPr/>
       <w:r>
-        <w:t xml:space="preserve">Mesquita-Romero, W. A., [+2 co-authors]. (2022). Critical media literacy to improve students' competencies. </w:t>
+        <w:t xml:space="preserve">Mesquita-Romero, W.-A., Fernández-Morante, C., &amp; Cebreiro-López, B. (2022). Critical media literacy to improve students' competencies. </w:t>
       </w:r>
       <w:r>
         <w:rPr>
@@ -6864,7 +6888,7 @@
         <w:t xml:space="preserve">30</w:t>
       </w:r>
       <w:r>
-        <w:t xml:space="preserve">(70), 41–51. https://doi.org/10.3916/C70-2022-04</w:t>
+        <w:t xml:space="preserve">(70), 47–57. https://doi.org/10.3916/C70-2022-04</w:t>
       </w:r>
     </w:p>
     <w:p>
@@ -6894,7 +6918,7 @@
     <w:p>
       <w:pPr/>
       <w:r>
-        <w:t xml:space="preserve">Moorhouse, B. L., [+4 co-authors]. (2025). Generative AI tools and empowerment in L2 academic writing. </w:t>
+        <w:t xml:space="preserve">Moorhouse, B. L., Wan, Y., Wu, C., Wu, M., &amp; Ho, T. Y. (2025). Generative AI tools and empowerment in L2 academic writing. </w:t>
       </w:r>
       <w:r>
         <w:rPr>
@@ -6918,7 +6942,7 @@
     <w:p>
       <w:pPr/>
       <w:r>
-        <w:t xml:space="preserve">Moreno-González, A., [+3 co-authors]. (2026). Between protection and participation: Primary school students' experiences in contexts of educational platformization. </w:t>
+        <w:t xml:space="preserve">Moreno-González, A., Rivera-Vargas, P., Calderón-Garrido, D., &amp; Fardella, C. (2026). Between protection and participation: Primary school students' experiences in contexts of educational platformization. </w:t>
       </w:r>
       <w:r>
         <w:rPr>
@@ -6957,7 +6981,7 @@
     <w:p>
       <w:pPr/>
       <w:r>
-        <w:t xml:space="preserve">Noble, A., &amp; [co-author]. (2022). Developing critical digital literacies through digital storytelling: Student attempts at re-telling the District Six story. </w:t>
+        <w:t xml:space="preserve">Noble, A., &amp; Gachago, D. (2022). Developing critical digital literacies through digital storytelling: Student attempts at re-telling the District Six story. </w:t>
       </w:r>
       <w:r>
         <w:rPr>
@@ -6975,7 +6999,7 @@
         <w:t xml:space="preserve">14</w:t>
       </w:r>
       <w:r>
-        <w:t xml:space="preserve">(3). https://doi.org/10.4018/IJMBL.312184</w:t>
+        <w:t xml:space="preserve">(3), 1–19. https://doi.org/10.4018/IJMBL.312184</w:t>
       </w:r>
     </w:p>
     <w:p>
@@ -7068,7 +7092,7 @@
     <w:p>
       <w:pPr/>
       <w:r>
-        <w:t xml:space="preserve">Regueira, U., [+3 co-authors]. (2026). Looking to be seen: Gendered self-surveillance and the challenges of critical digital literacy in a platformized adolescence. </w:t>
+        <w:t xml:space="preserve">Regueira, U., González-Villa, Á., Rodríguez-González, C., &amp; Gewerc, A. (2026). Looking to be seen: Gendered self-surveillance and the challenges of critical digital literacy in a platformized adolescence. </w:t>
       </w:r>
       <w:r>
         <w:rPr>
@@ -7083,7 +7107,7 @@
     <w:p>
       <w:pPr/>
       <w:r>
-        <w:t xml:space="preserve">Rodas-Coloma, A., [+3 co-authors]. (2026). From virality to pedagogy: A systematic and comprehensive review of TikTok's educational use in South America. </w:t>
+        <w:t xml:space="preserve">Rodas-Coloma, A., Cabezas-González, M., Casillas-Martín, S., &amp; Nevado-Batalla Moreno, P. (2026). From virality to pedagogy: A systematic and comprehensive review of TikTok's educational use in South America. </w:t>
       </w:r>
       <w:r>
         <w:rPr>
@@ -7131,7 +7155,7 @@
     <w:p>
       <w:pPr/>
       <w:r>
-        <w:t xml:space="preserve">Santisteban, A., [+2 co-authors]. (2020). Critical digital literacy of future teachers in the Twitter age. </w:t>
+        <w:t xml:space="preserve">Santisteban, A., Díez-Bedmar, M.-C., &amp; Castellví, J. (2020). Critical digital literacy of future teachers in the Twitter age. </w:t>
       </w:r>
       <w:r>
         <w:rPr>
@@ -7155,7 +7179,7 @@
     <w:p>
       <w:pPr/>
       <w:r>
-        <w:t xml:space="preserve">Satar, M., [+2 co-authors]. (2023). Multimodal representation in virtual exchange: A social semiotic approach to critical digital literacy. </w:t>
+        <w:t xml:space="preserve">Satar, M., Hauck, M., &amp; Bilki, Z. (2023). Multimodal representation in virtual exchange: A social semiotic approach to critical digital literacy. </w:t>
       </w:r>
       <w:r>
         <w:rPr>
@@ -7179,7 +7203,7 @@
     <w:p>
       <w:pPr/>
       <w:r>
-        <w:t xml:space="preserve">Saunders, J. M., [+8 co-authors]. (2017). "We're already somebody": High school students practicing critical media literacy IRL (in real life). </w:t>
+        <w:t xml:space="preserve">Saunders, J. M., Ash, G. E., Salazar, I., Pruitt, R., Wallach, D., Breed, E., Saldana, S., &amp; Szachacz, A. (2017). "We're already somebody": High school students practicing critical media literacy IRL (in real life). </w:t>
       </w:r>
       <w:r>
         <w:rPr>
@@ -7218,7 +7242,7 @@
     <w:p>
       <w:pPr/>
       <w:r>
-        <w:t xml:space="preserve">Spracklin, E., &amp; [co-author]. (2025). SIFTing through misinformation: Reflection notebooks to teach critical digital literacy. </w:t>
+        <w:t xml:space="preserve">Spracklin, E., &amp; Espina, C. R. (2025). SIFTing through misinformation: Reflection notebooks to teach critical digital literacy. </w:t>
       </w:r>
       <w:r>
         <w:rPr>
@@ -7242,7 +7266,7 @@
     <w:p>
       <w:pPr/>
       <w:r>
-        <w:t xml:space="preserve">Stewart, O. G., [+3 co-authors]. (2021). What more can we do? A scalar approach to examining critical digital literacies in teacher education. </w:t>
+        <w:t xml:space="preserve">Stewart, O. G., Hsieh, B., Smith, A., &amp; Pandya, J. Z. (2021). What more can we do? A scalar approach to examining critical digital literacies in teacher education. </w:t>
       </w:r>
       <w:r>
         <w:rPr>
@@ -7266,7 +7290,7 @@
     <w:p>
       <w:pPr/>
       <w:r>
-        <w:t xml:space="preserve">Stewart, O. G., &amp; [co-author]. (2025). A critical AI media literacy framework: Understanding layered bias and empowerment in artificial intelligence. </w:t>
+        <w:t xml:space="preserve">Stewart, O. G., &amp; Rodgers, D. J. (2025). A critical AI media literacy framework: Understanding layered bias and empowerment in artificial intelligence. </w:t>
       </w:r>
       <w:r>
         <w:rPr>
@@ -7281,7 +7305,7 @@
     <w:p>
       <w:pPr/>
       <w:r>
-        <w:t xml:space="preserve">Tagg, C., &amp; [co-author]. (2021). Context design and critical language/media awareness: Implications for a social digital literacies education. </w:t>
+        <w:t xml:space="preserve">Tagg, C., &amp; Seargeant, P. (2021). Context design and critical language/media awareness: Implications for a social digital literacies education. </w:t>
       </w:r>
       <w:r>
         <w:rPr>
@@ -7353,13 +7377,13 @@
     <w:p>
       <w:pPr/>
       <w:r>
-        <w:t xml:space="preserve">Torras, D. J., [+2 co-authors]. (2026). Critical digital literacy for Catalan high school students: Co-design of an educational module around an indie video game. </w:t>
-      </w:r>
-      <w:r>
-        <w:rPr>
-          <w:i/>
-        </w:rPr>
-        <w:t xml:space="preserve">Knowledge Management &amp; E-Learning</w:t>
+        <w:t xml:space="preserve">Tricco, A. C., Lillie, E., Zarin, W., O'Brien, K. K., Colquhoun, H., Levac, D., Moher, D., Peters, M. D. J., Horsley, T., Weeks, L., Hempel, S., Akl, E. A., Chang, C., McGowan, J., Stewart, L., Hartling, L., Aldcroft, A., Wilson, M. G., Garritty, C., … Straus, S. E. (2018). PRISMA extension for scoping reviews (PRISMA-ScR): Checklist and explanation. </w:t>
+      </w:r>
+      <w:r>
+        <w:rPr>
+          <w:i/>
+        </w:rPr>
+        <w:t xml:space="preserve">Annals of Internal Medicine</w:t>
       </w:r>
       <w:r>
         <w:t xml:space="preserve">, </w:t>
@@ -7368,22 +7392,100 @@
         <w:rPr>
           <w:i/>
         </w:rPr>
+        <w:t xml:space="preserve">169</w:t>
+      </w:r>
+      <w:r>
+        <w:t xml:space="preserve">(7), 467–473. https://doi.org/10.7326/M18-0850</w:t>
+      </w:r>
+    </w:p>
+    <w:p>
+      <w:pPr/>
+      <w:r>
+        <w:t xml:space="preserve">van Dijck, J., Poell, T., &amp; de Waal, M. (2018). </w:t>
+      </w:r>
+      <w:r>
+        <w:rPr>
+          <w:i/>
+        </w:rPr>
+        <w:t xml:space="preserve">The platform society: Public values in a connective world</w:t>
+      </w:r>
+      <w:r>
+        <w:t xml:space="preserve">. Oxford University Press.</w:t>
+      </w:r>
+    </w:p>
+    <w:p>
+      <w:pPr/>
+      <w:r>
+        <w:t xml:space="preserve">Van Poucke, M. (2024). ChatGPT, the perfect virtual teaching assistant? Ideological bias in learner-chatbot interactions. </w:t>
+      </w:r>
+      <w:r>
+        <w:rPr>
+          <w:i/>
+        </w:rPr>
+        <w:t xml:space="preserve">Computers and Composition</w:t>
+      </w:r>
+      <w:r>
+        <w:t xml:space="preserve">, </w:t>
+      </w:r>
+      <w:r>
+        <w:rPr>
+          <w:i/>
+        </w:rPr>
+        <w:t xml:space="preserve">73</w:t>
+      </w:r>
+      <w:r>
+        <w:t xml:space="preserve">, 102871. https://doi.org/10.1016/j.compcom.2024.102871</w:t>
+      </w:r>
+    </w:p>
+    <w:p>
+      <w:pPr/>
+      <w:r>
+        <w:t xml:space="preserve">Villar-Onrubia, D., Morini, L., Marín, V. I., &amp; Nascimbeni, F. (2022). Critical digital literacy as a key for (post)digital citizenship: An international review of teacher competence frameworks. </w:t>
+      </w:r>
+      <w:r>
+        <w:rPr>
+          <w:i/>
+        </w:rPr>
+        <w:t xml:space="preserve">Journal of e-Learning and Knowledge Society</w:t>
+      </w:r>
+      <w:r>
+        <w:t xml:space="preserve">, </w:t>
+      </w:r>
+      <w:r>
+        <w:rPr>
+          <w:i/>
+        </w:rPr>
         <w:t xml:space="preserve">18</w:t>
       </w:r>
       <w:r>
-        <w:t xml:space="preserve">(2), 216–233. https://doi.org/10.34105/j.kmel.2026.18.010</w:t>
-      </w:r>
-    </w:p>
-    <w:p>
-      <w:pPr/>
-      <w:r>
-        <w:t xml:space="preserve">Tricco, A. C., Lillie, E., Zarin, W., O'Brien, K. K., Colquhoun, H., Levac, D., Moher, D., Peters, M. D. J., Horsley, T., Weeks, L., Hempel, S., Akl, E. A., Chang, C., McGowan, J., Stewart, L., Hartling, L., Aldcroft, A., Wilson, M. G., Garritty, C., … Straus, S. E. (2018). PRISMA extension for scoping reviews (PRISMA-ScR): Checklist and explanation. </w:t>
-      </w:r>
-      <w:r>
-        <w:rPr>
-          <w:i/>
-        </w:rPr>
-        <w:t xml:space="preserve">Annals of Internal Medicine</w:t>
+        <w:t xml:space="preserve">(3), 128–139. https://doi.org/10.20368/1971-8829/1135697</w:t>
+      </w:r>
+    </w:p>
+    <w:p>
+      <w:pPr/>
+      <w:r>
+        <w:t xml:space="preserve">Vuorikari, R., Kluzer, S., &amp; Punie, Y. (2022). </w:t>
+      </w:r>
+      <w:r>
+        <w:rPr>
+          <w:i/>
+        </w:rPr>
+        <w:t xml:space="preserve">DigComp 2.2: The digital competence framework for citizens</w:t>
+      </w:r>
+      <w:r>
+        <w:t xml:space="preserve">. Publications Office of the European Union. https://doi.org/10.2760/115376</w:t>
+      </w:r>
+    </w:p>
+    <w:p>
+      <w:pPr/>
+      <w:r>
+        <w:t xml:space="preserve">Wang, S., &amp; Xu, F. (2026). From scroll to screen: Cultivating critical digital literacy through algorithm-aware writing pedagogies in EAP. </w:t>
+      </w:r>
+      <w:r>
+        <w:rPr>
+          <w:i/>
+        </w:rPr>
+        <w:t xml:space="preserve">Journal of English for Academic Purposes</w:t>
       </w:r>
       <w:r>
         <w:t xml:space="preserve">, </w:t>
@@ -7392,37 +7494,22 @@
         <w:rPr>
           <w:i/>
         </w:rPr>
-        <w:t xml:space="preserve">169</w:t>
-      </w:r>
-      <w:r>
-        <w:t xml:space="preserve">(7), 467–473. https://doi.org/10.7326/M18-0850</w:t>
-      </w:r>
-    </w:p>
-    <w:p>
-      <w:pPr/>
-      <w:r>
-        <w:t xml:space="preserve">van Dijck, J., Poell, T., &amp; de Waal, M. (2018). </w:t>
-      </w:r>
-      <w:r>
-        <w:rPr>
-          <w:i/>
-        </w:rPr>
-        <w:t xml:space="preserve">The platform society: Public values in a connective world</w:t>
-      </w:r>
-      <w:r>
-        <w:t xml:space="preserve">. Oxford University Press.</w:t>
-      </w:r>
-    </w:p>
-    <w:p>
-      <w:pPr/>
-      <w:r>
-        <w:t xml:space="preserve">Van Poucke, M. (2024). ChatGPT, the perfect virtual teaching assistant? Ideological bias in learner-chatbot interactions. </w:t>
-      </w:r>
-      <w:r>
-        <w:rPr>
-          <w:i/>
-        </w:rPr>
-        <w:t xml:space="preserve">Computers and Composition</w:t>
+        <w:t xml:space="preserve">81</w:t>
+      </w:r>
+      <w:r>
+        <w:t xml:space="preserve">, 101676. https://doi.org/10.1016/j.jeap.2026.101676</w:t>
+      </w:r>
+    </w:p>
+    <w:p>
+      <w:pPr/>
+      <w:r>
+        <w:t xml:space="preserve">Watt, D. (2019). Video production in elementary teacher education as a critical digital literacy practice. </w:t>
+      </w:r>
+      <w:r>
+        <w:rPr>
+          <w:i/>
+        </w:rPr>
+        <w:t xml:space="preserve">Media and Communication</w:t>
       </w:r>
       <w:r>
         <w:t xml:space="preserve">, </w:t>
@@ -7431,93 +7518,6 @@
         <w:rPr>
           <w:i/>
         </w:rPr>
-        <w:t xml:space="preserve">73</w:t>
-      </w:r>
-      <w:r>
-        <w:t xml:space="preserve">, 102871. https://doi.org/10.1016/j.compcom.2024.102871</w:t>
-      </w:r>
-    </w:p>
-    <w:p>
-      <w:pPr/>
-      <w:r>
-        <w:t xml:space="preserve">Villar-Onrubia, D., [+3 co-authors]. (2022). Critical digital literacy as a key for (post)digital citizenship: An international review of teacher competence frameworks. </w:t>
-      </w:r>
-      <w:r>
-        <w:rPr>
-          <w:i/>
-        </w:rPr>
-        <w:t xml:space="preserve">Journal of e-Learning and Knowledge Society</w:t>
-      </w:r>
-      <w:r>
-        <w:t xml:space="preserve">, </w:t>
-      </w:r>
-      <w:r>
-        <w:rPr>
-          <w:i/>
-        </w:rPr>
-        <w:t xml:space="preserve">18</w:t>
-      </w:r>
-      <w:r>
-        <w:t xml:space="preserve">(3), 128–139. https://doi.org/10.20368/1971-8829/1135697</w:t>
-      </w:r>
-    </w:p>
-    <w:p>
-      <w:pPr/>
-      <w:r>
-        <w:t xml:space="preserve">Vuorikari, R., Kluzer, S., &amp; Punie, Y. (2022). </w:t>
-      </w:r>
-      <w:r>
-        <w:rPr>
-          <w:i/>
-        </w:rPr>
-        <w:t xml:space="preserve">DigComp 2.2: The digital competence framework for citizens</w:t>
-      </w:r>
-      <w:r>
-        <w:t xml:space="preserve">. Publications Office of the European Union. https://doi.org/10.2760/115376</w:t>
-      </w:r>
-    </w:p>
-    <w:p>
-      <w:pPr/>
-      <w:r>
-        <w:t xml:space="preserve">Wang, S., &amp; [co-author]. (2026). From scroll to screen: Cultivating critical digital literacy through algorithm-aware writing pedagogies in EAP. </w:t>
-      </w:r>
-      <w:r>
-        <w:rPr>
-          <w:i/>
-        </w:rPr>
-        <w:t xml:space="preserve">Journal of English for Academic Purposes</w:t>
-      </w:r>
-      <w:r>
-        <w:t xml:space="preserve">, </w:t>
-      </w:r>
-      <w:r>
-        <w:rPr>
-          <w:i/>
-        </w:rPr>
-        <w:t xml:space="preserve">81</w:t>
-      </w:r>
-      <w:r>
-        <w:t xml:space="preserve">, 101676. https://doi.org/10.1016/j.jeap.2026.101676</w:t>
-      </w:r>
-    </w:p>
-    <w:p>
-      <w:pPr/>
-      <w:r>
-        <w:t xml:space="preserve">Watt, D. (2019). Video production in elementary teacher education as a critical digital literacy practice. </w:t>
-      </w:r>
-      <w:r>
-        <w:rPr>
-          <w:i/>
-        </w:rPr>
-        <w:t xml:space="preserve">Media and Communication</w:t>
-      </w:r>
-      <w:r>
-        <w:t xml:space="preserve">, </w:t>
-      </w:r>
-      <w:r>
-        <w:rPr>
-          <w:i/>
-        </w:rPr>
         <w:t xml:space="preserve">7</w:t>
       </w:r>
       <w:r>
@@ -7527,7 +7527,7 @@
     <w:p>
       <w:pPr/>
       <w:r>
-        <w:t xml:space="preserve">Weninger, C., &amp; [co-author]. (2026). AI, representation, and critical digital literacy: Navigating visual bias in the digital age. </w:t>
+        <w:t xml:space="preserve">Weninger, C., &amp; Xu, H. (2026). AI, representation, and critical digital literacy: Navigating visual bias in the digital age. </w:t>
       </w:r>
       <w:r>
         <w:rPr>

</xml_diff>

<commit_message>
Completa la referencia de Salazar-Jiménez et al. (2026) y da el título original de los estudios en español
Los coautores salen de la primera página del artículo. Los seis estudios
citados que están escritos en español llevan el título original y la
traducción al inglés entre corchetes, como pide APA 7. Se regeneran el libro
de Excel y el Word.

Co-Authored-By: Claude Opus 5.5 <noreply@anthropic.com>
Claude-Session: https://claude.ai/code/session_01W48ggkE3iqcgcPHVfB8T9P
</commit_message>
<xml_diff>
--- a/revision-adc/manuscrito-review-of-education.docx
+++ b/revision-adc/manuscrito-review-of-education.docx
@@ -6225,7 +6225,7 @@
     <w:p>
       <w:pPr/>
       <w:r>
-        <w:t xml:space="preserve">Escribano-Muñoz, C., Gil-Fernández, R., &amp; Calderón-Garrido, D. (2024). Confluences between critical thinking and social media in the educational world. Mapping experiences and detecting challenges. </w:t>
+        <w:t xml:space="preserve">Escribano-Muñoz, C., Gil-Fernández, R., &amp; Calderón-Garrido, D. (2024). Confluencias entre pensamiento crítico y redes sociales en el ámbito educativo. Mapeo de experiencias y detección de desafíos a través de una revisión sistemática [Confluences between critical thinking and social media in the educational world. Mapping experiences and detecting challenges through a systematic review]. </w:t>
       </w:r>
       <w:r>
         <w:rPr>
@@ -6273,7 +6273,7 @@
     <w:p>
       <w:pPr/>
       <w:r>
-        <w:t xml:space="preserve">Fernández, L. E. (2026). Digital activism and critical literacy: University agency for sociolinguistic justice in Peru. </w:t>
+        <w:t xml:space="preserve">Fernández, L. E. (2026). Activismo digital y alfabetización crítica: Agencia universitaria para la justicia sociolingüística en Perú [Digital activism and critical literacy: University agency for sociolinguistic justice in Peru]. </w:t>
       </w:r>
       <w:r>
         <w:rPr>
@@ -6336,7 +6336,7 @@
     <w:p>
       <w:pPr/>
       <w:r>
-        <w:t xml:space="preserve">González-Villa, Á., &amp; Gewerc, A. (2026). Adolescent practices of privacy negotiation on Instagram: The need for critical digital literacy in schools. </w:t>
+        <w:t xml:space="preserve">González-Villa, Á., &amp; Gewerc, A. (2026). Prácticas adolescentes de negociación de la privacidad en Instagram: La necesidad de alfabetización digital crítica en la escuela [Adolescent practices of privacy negotiation on Instagram: The need for critical digital literacy in schools]. </w:t>
       </w:r>
       <w:r>
         <w:rPr>
@@ -6942,7 +6942,7 @@
     <w:p>
       <w:pPr/>
       <w:r>
-        <w:t xml:space="preserve">Moreno-González, A., Rivera-Vargas, P., Calderón-Garrido, D., &amp; Fardella, C. (2026). Between protection and participation: Primary school students' experiences in contexts of educational platformization. </w:t>
+        <w:t xml:space="preserve">Moreno-González, A., Rivera-Vargas, P., Calderón-Garrido, D., &amp; Fardella, C. (2026). Entre la protección y la participación: Experiencias del alumnado de educación primaria en contextos de plataformización escolar [Between protection and participation: Primary school students' experiences in contexts of educational platformization]. </w:t>
       </w:r>
       <w:r>
         <w:rPr>
@@ -7092,7 +7092,7 @@
     <w:p>
       <w:pPr/>
       <w:r>
-        <w:t xml:space="preserve">Regueira, U., González-Villa, Á., Rodríguez-González, C., &amp; Gewerc, A. (2026). Looking to be seen: Gendered self-surveillance and the challenges of critical digital literacy in a platformized adolescence. </w:t>
+        <w:t xml:space="preserve">Regueira, U., González-Villa, Á., Rodríguez-González, C., &amp; Gewerc, A. (2026). Mirarse para ser vistas: Autovigilancia de género y retos de alfabetización digital crítica para una adolescencia plataformizada [Looking to be seen: Gendered self-surveillance and the challenges of critical digital literacy in a platformized adolescence]. </w:t>
       </w:r>
       <w:r>
         <w:rPr>
@@ -7131,7 +7131,7 @@
     <w:p>
       <w:pPr/>
       <w:r>
-        <w:t xml:space="preserve">Salazar-Jiménez, R., [+2 co-authors]. (2026). Initial teacher education and digital citizenship: Tensions and challenges in social studies education. </w:t>
+        <w:t xml:space="preserve">Salazar-Jiménez, R., Orellana Fonseca, C., &amp; Fuentes Rodríguez, C. (2026). Formación inicial docente y ciudadanía digital: Tensiones y desafíos en la enseñanza de las ciencias sociales [Initial teacher education and digital citizenship: Tensions and challenges in social studies education]. </w:t>
       </w:r>
       <w:r>
         <w:rPr>

</xml_diff>

<commit_message>
Incorpora la validación a texto completo al artículo y a los suplementos
- validacion.py: elegibilidad por periodo, por vía de inclusión, por idioma y
  según el código de IA.
- Suplementos S4 (manual en inglés) y S5 (codificación de los 38 textos con
  citas, precisión de los diccionarios y resúmenes).
- Libro de Excel: tabla 8 y lista PRISMA-ScR actualizada.
- referencias.py: «Article» delante de los números de artículo (APA 7) y
  datos de López-Fernández et al. (2026) y Lalira y Warouw (2026).
- Word del manuscrito, página de título y carta regenerados; README al día.

Co-Authored-By: Claude Opus 5.5 <noreply@anthropic.com>
Claude-Session: https://claude.ai/code/session_01W48ggkE3iqcgcPHVfB8T9P
</commit_message>
<xml_diff>
--- a/revision-adc/manuscrito-review-of-education.docx
+++ b/revision-adc/manuscrito-review-of-education.docx
@@ -21,7 +21,7 @@
     <w:p>
       <w:pPr/>
       <w:r>
-        <w:t xml:space="preserve">Critical digital literacy (CDL) asks learners to read digital technologies as sites of power and not only as tools. This scoping review maps research on CDL in formal education published in English and Spanish between 2016 and 2026. Reported according to PRISMA-ScR, it screened 469 Scopus records in two independent passes, one on titles and one on abstracts and author keywords, and resolved disagreements with an explicit decision rule (κ = 0.51); a second reviewer verified 169 decisions. The 135 included studies were charted on six variables, four of them with term dictionaries applied to titles, abstracts and keywords. Output grew by an estimated 21% a year between 2016 and 2025 (95% CI 11–31%), and 52 studies appeared in 2026 alone. The objects of critique widened: artificial intelligence, mostly generative, was absent before 2020 and appears in 43% of the studies published in 2024–2026; work on algorithms, data and platforms rose from 6% to 32%, while attention to social media held steady. The vocabulary of media literacy and multiliteracies, dominant in the early years, became less frequent. Research concentrates on higher education (41%) and teacher education (29%), and early childhood and primary education account for 7%. Qualitative and conceptual designs predominate, and only 26 studies describe an intervention. Spanish-language studies rose to 21% of the most recent period. The field responds quickly to each new technology but has yet to reach young children, to show what learners gain, or to settle on a conceptual core that outlasts any single platform.</w:t>
+        <w:t xml:space="preserve">Critical digital literacy (CDL) asks learners to read digital technologies as sites of power and not only as tools. This scoping review maps research on CDL in formal education published in English and Spanish between 2016 and 2026. Reported according to PRISMA-ScR, it screened 469 Scopus records in two independent passes, on titles and on abstracts and keywords, and resolved disagreements with an explicit rule; a second reviewer verified 169 decisions. The 135 included studies were charted with term dictionaries, which were then checked against the full texts of 38 open-access studies. Output grew by an estimated 21% a year between 2016 and 2025, and 52 studies appeared in 2026 alone. Artificial intelligence, absent before 2020, appears in 43% of the studies of 2024–2026, and algorithms, data and platforms rose from 6% to 32%. Research concentrates on higher education and teacher education; early childhood and primary education account for 7%. The full texts qualify this picture. Only 25 of the 38 studies made CDL a central concern, including 5 of the 11 coded for AI, and the dictionaries were accurate for AI but missed most work on disinformation and privacy. Of the 25, 16 did not evaluate outcomes, none used a comparison group, and 14 examined the infrastructures behind digital texts. The field responds quickly to each new technology, but part of its growth is nominal, and it has yet to reach young children or show what learners gain.</w:t>
       </w:r>
     </w:p>
     <w:p>
@@ -53,7 +53,7 @@
         <w:t xml:space="preserve">Rationale for this study.</w:t>
       </w:r>
       <w:r>
-        <w:t xml:space="preserve"> Schools and universities teach through platforms and AI systems they do not control. Earlier reviews covered one educational level or country and mostly predate generative AI.</w:t>
+        <w:t xml:space="preserve"> Schools teach through platforms and AI systems they do not control. Earlier reviews covered one level or country and mostly predate generative AI.</w:t>
       </w:r>
     </w:p>
     <w:p>
@@ -65,7 +65,7 @@
         <w:t xml:space="preserve">Why the new findings matter.</w:t>
       </w:r>
       <w:r>
-        <w:t xml:space="preserve"> The field is growing fast and follows each new technology, but it concentrates on universities and teacher education and rarely tests what learners gain.</w:t>
+        <w:t xml:space="preserve"> The field grows fast and follows each new technology, but a third of the studies sampled treat CDL only in passing, and few test what learners gain.</w:t>
       </w:r>
     </w:p>
     <w:p>
@@ -77,7 +77,7 @@
         <w:t xml:space="preserve">Implications for researchers, practitioners and policy makers.</w:t>
       </w:r>
       <w:r>
-        <w:t xml:space="preserve"> Researchers need intervention studies in primary schools and shared, validated instruments. Teacher educators can build on practices that recur across the corpus, such as virtual exchange and student media production. Digital competence frameworks such as DigComp and DigCompEdu could move questions of platform ownership, data and interests from illustrative examples into the competences themselves.</w:t>
+        <w:t xml:space="preserve"> Researchers need intervention studies in primary schools, shared instruments and screening on full texts, because titles and abstracts overstate the field. Teacher educators can build on practices that recur across the corpus, such as virtual exchange and student media production. Digital competence frameworks such as DigComp and DigCompEdu could move questions of platform ownership, data and interests from illustrative examples into the competences themselves.</w:t>
       </w:r>
     </w:p>
     <w:p>
@@ -283,7 +283,7 @@
     <w:p>
       <w:pPr/>
       <w:r>
-        <w:t xml:space="preserve">The review follows the framework of Arksey and O'Malley (2005) and is reported according to the PRISMA extension for scoping reviews (PRISMA-ScR; Tricco et al., 2018). The flow of records is reported with the PRISMA 2020 diagram (Page et al., 2021). The review departs from JBI guidance in one respect. JBI recommends assessing the full texts of potentially eligible studies (Peters et al., 2024), but the access available returned neither the text of abstracts nor the full texts of subscription articles. Eligibility was therefore assessed on titles and on searches inside abstracts and keywords, verified by a second reviewer, and both eligibility and coding were checked against the full texts of a random sample of 40 open-access studies. No protocol was registered in advance. To compensate, every decision in the review was made reproducible: the search string, the 469 records, both screening passes, the adjudication rule, the coding dictionaries and the code that applies them are archived as an open data set (Author, 2026).</w:t>
+        <w:t xml:space="preserve">The review follows the framework of Arksey and O'Malley (2005) and is reported according to the PRISMA extension for scoping reviews (PRISMA-ScR; Tricco et al., 2018). The flow of records is reported with the PRISMA 2020 diagram (Page et al., 2021). The review departs from JBI guidance in one respect. JBI recommends assessing the full texts of potentially eligible studies (Peters et al., 2024), but the access available returned neither the text of abstracts nor the full texts of subscription articles. Eligibility was therefore assessed on titles and on searches inside abstracts and keywords, verified by a second reviewer, and both eligibility and coding were checked against the full texts of a random sample of open-access studies, 38 of which could be read. No protocol was registered in advance. To compensate, every decision in the review was made reproducible: the search string, the 469 records, both screening passes, the adjudication rule, the coding dictionaries and the code that applies them are archived as an open data set (Author, 2026).</w:t>
       </w:r>
     </w:p>
     <w:p>
@@ -1271,19 +1271,25 @@
     <w:p>
       <w:pPr/>
       <w:r>
-        <w:t xml:space="preserve">[Draft: the validation is in progress. Revise this section once the coding is done.]</w:t>
-      </w:r>
-    </w:p>
-    <w:p>
-      <w:pPr/>
-      <w:r>
-        <w:t xml:space="preserve">To check whether the dictionaries identify what they claim to identify, two reviewers read the full texts of a random sample of 40 included studies and coded them independently with a codebook (Supplementary file S4). Because the review had no institutional access to subscription journals, the sample was drawn from the 77 open-access studies. It was stratified by period in proportion to the whole corpus rather than to the open-access subset, which is weighted towards 2024–2026: all 4 open-access studies from 2016–2019, 10 of 14 from 2020–2023 and 26 of 59 from 2024–2026, taken in a random order with a fixed seed. The remaining open-access studies of each period served as replacements.</w:t>
-      </w:r>
-    </w:p>
-    <w:p>
-      <w:pPr/>
-      <w:r>
-        <w:t xml:space="preserve">For each study the reviewers recorded whether it met the eligibility criteria; its level, design, theoretical tradition and objects of critique, coded by what the study does rather than by the words it uses (a tradition, for example, only when the study adopts it as its framework); whether and how it evaluates outcomes, distinguishing qualitative evidence of learning, quantitative measures without a comparison and comparative designs; and whether it addresses each of the three dimensions of the working definition, with a supporting quotation. Agreement between the reviewers is reported as Cohen's κ for each variable. Disagreements were resolved by discussion, and the consensus codes were compared with the dictionary codes to estimate the precision and sensitivity of each dictionary.</w:t>
+        <w:t xml:space="preserve">To check whether the selection and the dictionaries identify what they claim to identify, the full texts of a random sample of included studies were read and coded with a codebook (Supplementary file S4). Because the review had no institutional access to subscription journals, the sample was drawn from the 77 open-access studies. It was stratified by period in proportion to the whole corpus rather than to the open-access subset, which is weighted towards 2024–2026: all 4 open-access studies from 2016–2019, 10 of 14 from 2020–2023 and 26 of 59 from 2024–2026, taken in a random order with a fixed seed. The remaining open-access studies of each period were listed in random order as replacements.</w:t>
+      </w:r>
+    </w:p>
+    <w:p>
+      <w:pPr/>
+      <w:r>
+        <w:t xml:space="preserve">An open-access flag in the bibliographic record did not always lead to a text. Full texts were sought at the open-access locations recorded by OpenAlex and Semantic Scholar and on the publishers' own pages, without bypassing any access control, and were obtained for 22 of the 40 sampled studies. The 16 missing studies from 2020–2023 and 2024–2026 were replaced by the next replacements of the same period with a retrievable text. The 2 missing studies from 2016–2019 could not be replaced, because the sample already contained every open-access study of that period. In all, 38 full texts were read: 2 from 2016–2019, 10 from 2020–2023 and 26 from 2024–2026. For one study a repository served a different article under the right record, and the journal's own text was used instead.</w:t>
+      </w:r>
+    </w:p>
+    <w:p>
+      <w:pPr/>
+      <w:r>
+        <w:t xml:space="preserve">For each study the coder recorded whether it met the eligibility criteria; its level, design, theoretical tradition and objects of critique, coded by what the study does rather than by the words it uses (a tradition, for example, only when the study adopts it as its framework); whether and how it evaluates outcomes, distinguishing qualitative evidence of learning, quantitative measures without a comparison and comparative designs; and whether it addresses each of the three dimensions of the working definition. Each dimension coded as present was recorded with a supporting quotation and its page, and borderline decisions were explained in a note (Supplementary file S5).</w:t>
+      </w:r>
+    </w:p>
+    <w:p>
+      <w:pPr/>
+      <w:r>
+        <w:t xml:space="preserve">The full texts were coded by one coder, a large language model (Claude, Anthropic) applying the codebook, so no agreement between coders can be reported; the quotations allow each code to be checked against its source. For the eligible studies, the full-text codes were compared with the dictionary codes. Precision is the share of a dictionary's codes that the full text confirms, sensitivity is the share of full-text codes that the dictionary finds, and Cohen's κ summarises agreement. Proportions are given with Wilson 95% confidence intervals.</w:t>
       </w:r>
     </w:p>
     <w:p>
@@ -1397,7 +1403,7 @@
         <w:t xml:space="preserve">digital literacy</w:t>
       </w:r>
       <w:r>
-        <w:t xml:space="preserve"> appeared close together without a CDL approach: work on generic critical thinking, technology acceptance or the digital skills of health science students. A further 12 records were set outside formal education and 2 were book reviews.</w:t>
+        <w:t xml:space="preserve"> appeared close together without a CDL approach: work on generic critical thinking, technology acceptance or the digital skills of health science students. A further 12 records were set outside formal education and 2 were book reviews. A reading of full texts for a sample of these studies, reported at the end of this section, suggests that about two thirds of them make CDL a central concern; the figures that follow describe the 135 studies as selected.</w:t>
       </w:r>
     </w:p>
     <w:p>
@@ -1405,20 +1411,6 @@
         <w:pStyle w:val="Heading3"/>
       </w:pPr>
       <w:r>
-        <w:t xml:space="preserve">Validation on full texts</w:t>
-      </w:r>
-    </w:p>
-    <w:p>
-      <w:pPr/>
-      <w:r>
-        <w:t xml:space="preserve">[Pending. Report: texts read and replacements used; eligibility confirmed on full text (n of 40); agreement between the reviewers (κ by variable, Supplementary file S5); precision and sensitivity of each dictionary, in a new table; the three dimensions, their combinations and their distribution by period; and the outcome evaluation categories. Then qualify the results below wherever a dictionary proves imprecise.]</w:t>
-      </w:r>
-    </w:p>
-    <w:p>
-      <w:pPr>
-        <w:pStyle w:val="Heading3"/>
-      </w:pPr>
-      <w:r>
         <w:t xml:space="preserve">Growth and characteristics of the field (RQ1)</w:t>
       </w:r>
     </w:p>
@@ -1434,7 +1426,7 @@
         <w:t xml:space="preserve">p</w:t>
       </w:r>
       <w:r>
-        <w:t xml:space="preserve"> &lt; .001). Most of the field is very recent: 82 of the 135 studies (60.7%) appeared in 2024–2026.</w:t>
+        <w:t xml:space="preserve"> &lt; .001). Most of the field is very recent: 82 of the 135 studies (60.7%) appeared in 2024–2026. Growth here means growth in studies indexed under CDL. In the full-text sample, the share that made CDL a central concern was lowest in 2024–2026, so the recent rise of the field is probably overstated.</w:t>
       </w:r>
     </w:p>
     <w:p>
@@ -1629,7 +1621,7 @@
     <w:p>
       <w:pPr/>
       <w:r>
-        <w:t xml:space="preserve">Table 3 shows how the corpus is distributed by educational level and design. Higher education is the most studied level (40.7%), followed by teacher education (28.9%) and secondary education (21.5%). Early childhood and primary education account for only 10 studies (7.4%), and their share did not grow. The apparent fall of secondary education, from 44.4% to 17.1%, should be read with caution: it rests on broad terms such as </w:t>
+        <w:t xml:space="preserve">Table 3 shows how the corpus is distributed by educational level and design. Higher education is the most studied level (40.7%), followed by teacher education (28.9%) and secondary education (21.5%). Early childhood and primary education account for only 10 studies (7.4%), and their share did not grow. If anything, the code overstates them: four of the five sampled studies coded for this level were set at another. The apparent fall of secondary education, from 44.4% to 17.1%, should be read with caution: it rests on broad terms such as </w:t>
       </w:r>
       <w:r>
         <w:rPr>
@@ -1638,7 +1630,7 @@
         <w:t xml:space="preserve">adolescents</w:t>
       </w:r>
       <w:r>
-        <w:t xml:space="preserve">, and it disappears with the strict dictionary (Table 5). Qualitative designs became more frequent, rising from a third of the studies in the first period to 58.5% in the last, and so did quantitative designs and literature reviews. The share of studies that describe an intervention or a designed sequence of teaching did not increase.</w:t>
+        <w:t xml:space="preserve">, and it disappears with the strict dictionary (Table 5). Qualitative designs became more frequent, rising from a third of the studies in the first period to 58.5% in the last, and so did quantitative designs and literature reviews. The share of studies coded as describing an intervention or a designed sequence of teaching did not increase, although this code found only half of the interventions in the full-text sample.</w:t>
       </w:r>
     </w:p>
     <w:p>
@@ -2984,7 +2976,7 @@
         <w:t xml:space="preserve">Journal of Adolescent &amp; Adult Literacy</w:t>
       </w:r>
       <w:r>
-        <w:t xml:space="preserve">, a journal written largely for literacy teachers (Harrison, 2018; McArthur, 2019; Saunders et al., 2017). Both traditions fell to under a fifth of the studies in later periods, and both declines are significant.</w:t>
+        <w:t xml:space="preserve">, a journal written largely for literacy teachers (Harrison, 2018; McArthur, 2019; Saunders et al., 2017). Both traditions fell to under a fifth of the studies in later periods, and both declines are significant. The full-text check supports this caution. In the sample, the dictionaries found 2 of the 6 studies that adopt Freirean critical pedagogy as their framework, and they agreed only in part with the full texts on media literacy and multiliteracies (κ = .46 and .62).</w:t>
       </w:r>
     </w:p>
     <w:p>
@@ -3691,7 +3683,7 @@
         <w:t xml:space="preserve">p</w:t>
       </w:r>
       <w:r>
-        <w:t xml:space="preserve"> &lt; .001). Disinformation and post-truth (8 studies), privacy and surveillance (8) and hate speech and radicalisation (3) are smaller and stable lines of work.</w:t>
+        <w:t xml:space="preserve"> &lt; .001). Disinformation and post-truth (8 studies), privacy and surveillance (8) and hate speech and radicalisation (3) are smaller and stable lines of work. These counts are probably too low: in the full-text sample, the dictionaries found 1 of the 6 studies that critique disinformation and 1 of the 7 on privacy and surveillance.</w:t>
       </w:r>
     </w:p>
     <w:p>
@@ -3805,7 +3797,7 @@
     <w:p>
       <w:pPr/>
       <w:r>
-        <w:t xml:space="preserve">The main trends hold when the coding is repeated with strict dictionaries (Table 5). The rise of AI and of platforms remains significant; the strict AI dictionary, which counts only generative AI, still finds it in 26.8% of the latest studies. Social media stays flat under both dictionaries. The changes by educational level are not robust: the fall of secondary education disappears with the strict dictionary, and under that dictionary no level shows a significant trend.</w:t>
+        <w:t xml:space="preserve">The main trends hold when the coding is repeated with strict dictionaries (Table 5). The rise of AI and of platforms remains significant; the strict AI dictionary, which counts only generative AI, still finds it in 26.8% of the latest studies. Social media stays flat under both dictionaries. The changes by educational level are not robust: the fall of secondary education disappears with the strict dictionary, and under that dictionary no level shows a significant trend. The full-text check adds a different caveat. The AI dictionary was the most accurate of all, so the rise of AI as a code is not an artefact of the terms chosen; but only 5 of the 11 sampled studies coded for AI made CDL a central concern.</w:t>
       </w:r>
     </w:p>
     <w:p>
@@ -5590,7 +5582,7 @@
     <w:p>
       <w:pPr/>
       <w:r>
-        <w:t xml:space="preserve">Studies that describe an intervention or a designed teaching sequence are a minority: 26 of the 135, and 8 of them also mention quantitative measures. Outcome evaluation, quantitative measurement and causal inference should not be confused. Qualitative studies of an intervention can document learning, changes in practice or agency, and a quantitative measure does not by itself show that a practice caused a change. The coding used here shows which studies describe an intervention and which mention quantitative measures, but not which evaluate outcomes, a question that needs the full texts. Quantitative work is concentrated in higher education (18 of the 31 quantitative studies), and much of the recent effort goes into building instruments rather than evaluating teaching. Examples are the Comprehensive Digital Literacy Scale (AlGhannama et al., 2025), the Critical 3wAI Literacy Scale (Bozkurt et al., 2026) and a survey of adolescents' critical race digital literacy skills (McGee et al., 2026). In early childhood and primary education, three studies describe an intervention.</w:t>
+        <w:t xml:space="preserve">Studies that describe an intervention or a designed teaching sequence are a minority: 26 of the 135, and 8 of them also mention quantitative measures. Outcome evaluation, quantitative measurement and causal inference should not be confused. Qualitative studies of an intervention can document learning, changes in practice or agency, and a quantitative measure does not by itself show that a practice caused a change. The dictionaries show which studies describe an intervention and which mention quantitative measures, but not which evaluate outcomes; the full-text sample, reported below, answers that question for 25 studies. Quantitative work is concentrated in higher education (18 of the 31 quantitative studies), and much of the recent effort goes into building instruments rather than evaluating teaching. Examples are the Comprehensive Digital Literacy Scale (AlGhannama et al., 2025), the Critical 3wAI Literacy Scale (Bozkurt et al., 2026) and a survey of adolescents' critical race digital literacy skills (McGee et al., 2026). In early childhood and primary education, three studies describe an intervention.</w:t>
       </w:r>
     </w:p>
     <w:p>
@@ -6421,6 +6413,2546 @@
     </w:p>
     <w:p>
       <w:pPr>
+        <w:pStyle w:val="Heading3"/>
+      </w:pPr>
+      <w:r>
+        <w:t xml:space="preserve">Validation on full texts</w:t>
+      </w:r>
+    </w:p>
+    <w:p>
+      <w:pPr/>
+      <w:r>
+        <w:t xml:space="preserve">Of the 38 studies read in full, 25 (65.8%, 95% CI 50–79%) met the eligibility criteria. All 13 exclusions had the same reason: CDL was not a central focus. In some, CDL appeared only in a closing recommendation, as in a survey of students' views on regulating ChatGPT (López-Fernández et al., 2026). In others, "critical" meant judging the credibility of sources (Ketzer-Nöltge &amp; Markovic, 2022; Lalira &amp; Warouw, 2026) or holding ethical beliefs about AI (Bozkurt et al., 2026). Fifteen decisions were borderline. Excluding all of them would leave 19 eligible studies (50%); including all of them would give 34 (89%).</w:t>
+      </w:r>
+    </w:p>
+    <w:p>
+      <w:pPr/>
+      <w:r>
+        <w:t xml:space="preserve">Eligibility depended on how a study had entered the review. It was confirmed for 20 of the 25 sampled studies on which both screening passes had agreed, but for only 3 of the 10 admitted under the second branch of the adjudication rule, a title referring to a digital technology and two of the three indicators. It was also lower among studies coded for AI (5 of 11) and in the latest period (16 of 26, against 7 of 10 in 2020–2023 and both studies from 2016–2019). The numbers are small, but they point the same way: much of the recent growth of the corpus, and of its work on AI, consists of studies that mention CDL without making it their concern.</w:t>
+      </w:r>
+    </w:p>
+    <w:p>
+      <w:pPr/>
+      <w:r>
+        <w:t xml:space="preserve">Table 8 compares the dictionary codes with the full-text codes of the 25 eligible studies. The AI dictionary matched the full texts exactly (5 of 5, κ = 1.00), and the codes for secondary education, social media and race, gender and decolonial perspectives came close (κ = .80 to .88). The other dictionaries erred in one of two directions. Some assigned codes that the full text did not support: four of the five studies coded for early childhood and primary education were set at another level, and three of the four coded as conceptual were not conceptual studies. Others missed most of what the full texts contained. They found 1 of the 6 studies that critique disinformation, 1 of the 7 on privacy and surveillance, 1 of the 5 in which learners produce digital content, 2 of the 6 that adopt Freirean critical pedagogy and 5 of the 10 that describe an intervention.</w:t>
+      </w:r>
+    </w:p>
+    <w:p>
+      <w:pPr/>
+      <w:r>
+        <w:rPr>
+          <w:b/>
+        </w:rPr>
+        <w:t xml:space="preserve">Table 8.</w:t>
+      </w:r>
+      <w:r>
+        <w:t xml:space="preserve"> Dictionary codes compared with full-text codes in the eligible studies of the validation sample (n = 25)</w:t>
+      </w:r>
+    </w:p>
+    <w:tbl>
+      <w:tblPr>
+        <w:tblStyle w:val="TableGrid"/>
+        <w:tblW w:w="0" w:type="auto"/>
+        <w:tblLayout w:type="fixed"/>
+        <w:tblLook w:val="04A0" w:firstRow="1" w:lastRow="0" w:firstColumn="0" w:lastColumn="0" w:noHBand="0" w:noVBand="1"/>
+      </w:tblPr>
+      <w:tblGrid>
+        <w:gridCol w:w="2906"/>
+        <w:gridCol w:w="1146"/>
+        <w:gridCol w:w="1305"/>
+        <w:gridCol w:w="720"/>
+        <w:gridCol w:w="1225"/>
+        <w:gridCol w:w="1337"/>
+        <w:gridCol w:w="720"/>
+      </w:tblGrid>
+      <w:tr>
+        <w:trPr>
+          <w:tblHeader/>
+        </w:trPr>
+        <w:tc>
+          <w:tcPr>
+            <w:tcW w:w="2906" w:type="dxa"/>
+            <w:shd w:val="clear" w:color="auto" w:fill="F2F2F2"/>
+          </w:tcPr>
+          <w:p>
+            <w:pPr>
+              <w:spacing w:line="240" w:lineRule="auto" w:after="40"/>
+            </w:pPr>
+            <w:r>
+              <w:t xml:space="preserve">Category</w:t>
+            </w:r>
+          </w:p>
+        </w:tc>
+        <w:tc>
+          <w:tcPr>
+            <w:tcW w:w="1146" w:type="dxa"/>
+            <w:shd w:val="clear" w:color="auto" w:fill="F2F2F2"/>
+          </w:tcPr>
+          <w:p>
+            <w:pPr>
+              <w:spacing w:line="240" w:lineRule="auto" w:after="40"/>
+            </w:pPr>
+            <w:r>
+              <w:t xml:space="preserve">Full text</w:t>
+            </w:r>
+          </w:p>
+        </w:tc>
+        <w:tc>
+          <w:tcPr>
+            <w:tcW w:w="1305" w:type="dxa"/>
+            <w:shd w:val="clear" w:color="auto" w:fill="F2F2F2"/>
+          </w:tcPr>
+          <w:p>
+            <w:pPr>
+              <w:spacing w:line="240" w:lineRule="auto" w:after="40"/>
+            </w:pPr>
+            <w:r>
+              <w:t xml:space="preserve">Dictionary</w:t>
+            </w:r>
+          </w:p>
+        </w:tc>
+        <w:tc>
+          <w:tcPr>
+            <w:tcW w:w="720" w:type="dxa"/>
+            <w:shd w:val="clear" w:color="auto" w:fill="F2F2F2"/>
+          </w:tcPr>
+          <w:p>
+            <w:pPr>
+              <w:spacing w:line="240" w:lineRule="auto" w:after="40"/>
+            </w:pPr>
+            <w:r>
+              <w:t xml:space="preserve">Both</w:t>
+            </w:r>
+          </w:p>
+        </w:tc>
+        <w:tc>
+          <w:tcPr>
+            <w:tcW w:w="1225" w:type="dxa"/>
+            <w:shd w:val="clear" w:color="auto" w:fill="F2F2F2"/>
+          </w:tcPr>
+          <w:p>
+            <w:pPr>
+              <w:spacing w:line="240" w:lineRule="auto" w:after="40"/>
+            </w:pPr>
+            <w:r>
+              <w:t xml:space="preserve">Precision</w:t>
+            </w:r>
+          </w:p>
+        </w:tc>
+        <w:tc>
+          <w:tcPr>
+            <w:tcW w:w="1337" w:type="dxa"/>
+            <w:shd w:val="clear" w:color="auto" w:fill="F2F2F2"/>
+          </w:tcPr>
+          <w:p>
+            <w:pPr>
+              <w:spacing w:line="240" w:lineRule="auto" w:after="40"/>
+            </w:pPr>
+            <w:r>
+              <w:t xml:space="preserve">Sensitivity</w:t>
+            </w:r>
+          </w:p>
+        </w:tc>
+        <w:tc>
+          <w:tcPr>
+            <w:tcW w:w="720" w:type="dxa"/>
+            <w:shd w:val="clear" w:color="auto" w:fill="F2F2F2"/>
+          </w:tcPr>
+          <w:p>
+            <w:pPr>
+              <w:spacing w:line="240" w:lineRule="auto" w:after="40"/>
+            </w:pPr>
+            <w:r>
+              <w:t xml:space="preserve">κ</w:t>
+            </w:r>
+          </w:p>
+        </w:tc>
+      </w:tr>
+      <w:tr>
+        <w:tc>
+          <w:tcPr>
+            <w:tcW w:w="2906" w:type="dxa"/>
+          </w:tcPr>
+          <w:p>
+            <w:pPr>
+              <w:spacing w:line="240" w:lineRule="auto" w:after="40"/>
+            </w:pPr>
+            <w:r>
+              <w:rPr>
+                <w:b/>
+              </w:rPr>
+              <w:t xml:space="preserve">Educational level</w:t>
+            </w:r>
+          </w:p>
+        </w:tc>
+        <w:tc>
+          <w:tcPr>
+            <w:tcW w:w="1146" w:type="dxa"/>
+          </w:tcPr>
+          <w:p>
+            <w:pPr>
+              <w:spacing w:line="240" w:lineRule="auto" w:after="40"/>
+            </w:pPr>
+          </w:p>
+        </w:tc>
+        <w:tc>
+          <w:tcPr>
+            <w:tcW w:w="1305" w:type="dxa"/>
+          </w:tcPr>
+          <w:p>
+            <w:pPr>
+              <w:spacing w:line="240" w:lineRule="auto" w:after="40"/>
+            </w:pPr>
+          </w:p>
+        </w:tc>
+        <w:tc>
+          <w:tcPr>
+            <w:tcW w:w="720" w:type="dxa"/>
+          </w:tcPr>
+          <w:p>
+            <w:pPr>
+              <w:spacing w:line="240" w:lineRule="auto" w:after="40"/>
+            </w:pPr>
+          </w:p>
+        </w:tc>
+        <w:tc>
+          <w:tcPr>
+            <w:tcW w:w="1225" w:type="dxa"/>
+          </w:tcPr>
+          <w:p>
+            <w:pPr>
+              <w:spacing w:line="240" w:lineRule="auto" w:after="40"/>
+            </w:pPr>
+          </w:p>
+        </w:tc>
+        <w:tc>
+          <w:tcPr>
+            <w:tcW w:w="1337" w:type="dxa"/>
+          </w:tcPr>
+          <w:p>
+            <w:pPr>
+              <w:spacing w:line="240" w:lineRule="auto" w:after="40"/>
+            </w:pPr>
+          </w:p>
+        </w:tc>
+        <w:tc>
+          <w:tcPr>
+            <w:tcW w:w="720" w:type="dxa"/>
+          </w:tcPr>
+          <w:p>
+            <w:pPr>
+              <w:spacing w:line="240" w:lineRule="auto" w:after="40"/>
+            </w:pPr>
+          </w:p>
+        </w:tc>
+      </w:tr>
+      <w:tr>
+        <w:tc>
+          <w:tcPr>
+            <w:tcW w:w="2906" w:type="dxa"/>
+          </w:tcPr>
+          <w:p>
+            <w:pPr>
+              <w:spacing w:line="240" w:lineRule="auto" w:after="40"/>
+            </w:pPr>
+            <w:r>
+              <w:t xml:space="preserve">Early childhood and primary</w:t>
+            </w:r>
+          </w:p>
+        </w:tc>
+        <w:tc>
+          <w:tcPr>
+            <w:tcW w:w="1146" w:type="dxa"/>
+          </w:tcPr>
+          <w:p>
+            <w:pPr>
+              <w:spacing w:line="240" w:lineRule="auto" w:after="40"/>
+            </w:pPr>
+            <w:r>
+              <w:t xml:space="preserve">1</w:t>
+            </w:r>
+          </w:p>
+        </w:tc>
+        <w:tc>
+          <w:tcPr>
+            <w:tcW w:w="1305" w:type="dxa"/>
+          </w:tcPr>
+          <w:p>
+            <w:pPr>
+              <w:spacing w:line="240" w:lineRule="auto" w:after="40"/>
+            </w:pPr>
+            <w:r>
+              <w:t xml:space="preserve">5</w:t>
+            </w:r>
+          </w:p>
+        </w:tc>
+        <w:tc>
+          <w:tcPr>
+            <w:tcW w:w="720" w:type="dxa"/>
+          </w:tcPr>
+          <w:p>
+            <w:pPr>
+              <w:spacing w:line="240" w:lineRule="auto" w:after="40"/>
+            </w:pPr>
+            <w:r>
+              <w:t xml:space="preserve">1</w:t>
+            </w:r>
+          </w:p>
+        </w:tc>
+        <w:tc>
+          <w:tcPr>
+            <w:tcW w:w="1225" w:type="dxa"/>
+          </w:tcPr>
+          <w:p>
+            <w:pPr>
+              <w:spacing w:line="240" w:lineRule="auto" w:after="40"/>
+            </w:pPr>
+            <w:r>
+              <w:t xml:space="preserve">.20</w:t>
+            </w:r>
+          </w:p>
+        </w:tc>
+        <w:tc>
+          <w:tcPr>
+            <w:tcW w:w="1337" w:type="dxa"/>
+          </w:tcPr>
+          <w:p>
+            <w:pPr>
+              <w:spacing w:line="240" w:lineRule="auto" w:after="40"/>
+            </w:pPr>
+            <w:r>
+              <w:t xml:space="preserve">1.00</w:t>
+            </w:r>
+          </w:p>
+        </w:tc>
+        <w:tc>
+          <w:tcPr>
+            <w:tcW w:w="720" w:type="dxa"/>
+          </w:tcPr>
+          <w:p>
+            <w:pPr>
+              <w:spacing w:line="240" w:lineRule="auto" w:after="40"/>
+            </w:pPr>
+            <w:r>
+              <w:t xml:space="preserve">.29</w:t>
+            </w:r>
+          </w:p>
+        </w:tc>
+      </w:tr>
+      <w:tr>
+        <w:tc>
+          <w:tcPr>
+            <w:tcW w:w="2906" w:type="dxa"/>
+          </w:tcPr>
+          <w:p>
+            <w:pPr>
+              <w:spacing w:line="240" w:lineRule="auto" w:after="40"/>
+            </w:pPr>
+            <w:r>
+              <w:t xml:space="preserve">Secondary</w:t>
+            </w:r>
+          </w:p>
+        </w:tc>
+        <w:tc>
+          <w:tcPr>
+            <w:tcW w:w="1146" w:type="dxa"/>
+          </w:tcPr>
+          <w:p>
+            <w:pPr>
+              <w:spacing w:line="240" w:lineRule="auto" w:after="40"/>
+            </w:pPr>
+            <w:r>
+              <w:t xml:space="preserve">5</w:t>
+            </w:r>
+          </w:p>
+        </w:tc>
+        <w:tc>
+          <w:tcPr>
+            <w:tcW w:w="1305" w:type="dxa"/>
+          </w:tcPr>
+          <w:p>
+            <w:pPr>
+              <w:spacing w:line="240" w:lineRule="auto" w:after="40"/>
+            </w:pPr>
+            <w:r>
+              <w:t xml:space="preserve">6</w:t>
+            </w:r>
+          </w:p>
+        </w:tc>
+        <w:tc>
+          <w:tcPr>
+            <w:tcW w:w="720" w:type="dxa"/>
+          </w:tcPr>
+          <w:p>
+            <w:pPr>
+              <w:spacing w:line="240" w:lineRule="auto" w:after="40"/>
+            </w:pPr>
+            <w:r>
+              <w:t xml:space="preserve">5</w:t>
+            </w:r>
+          </w:p>
+        </w:tc>
+        <w:tc>
+          <w:tcPr>
+            <w:tcW w:w="1225" w:type="dxa"/>
+          </w:tcPr>
+          <w:p>
+            <w:pPr>
+              <w:spacing w:line="240" w:lineRule="auto" w:after="40"/>
+            </w:pPr>
+            <w:r>
+              <w:t xml:space="preserve">.83</w:t>
+            </w:r>
+          </w:p>
+        </w:tc>
+        <w:tc>
+          <w:tcPr>
+            <w:tcW w:w="1337" w:type="dxa"/>
+          </w:tcPr>
+          <w:p>
+            <w:pPr>
+              <w:spacing w:line="240" w:lineRule="auto" w:after="40"/>
+            </w:pPr>
+            <w:r>
+              <w:t xml:space="preserve">1.00</w:t>
+            </w:r>
+          </w:p>
+        </w:tc>
+        <w:tc>
+          <w:tcPr>
+            <w:tcW w:w="720" w:type="dxa"/>
+          </w:tcPr>
+          <w:p>
+            <w:pPr>
+              <w:spacing w:line="240" w:lineRule="auto" w:after="40"/>
+            </w:pPr>
+            <w:r>
+              <w:t xml:space="preserve">.88</w:t>
+            </w:r>
+          </w:p>
+        </w:tc>
+      </w:tr>
+      <w:tr>
+        <w:tc>
+          <w:tcPr>
+            <w:tcW w:w="2906" w:type="dxa"/>
+          </w:tcPr>
+          <w:p>
+            <w:pPr>
+              <w:spacing w:line="240" w:lineRule="auto" w:after="40"/>
+            </w:pPr>
+            <w:r>
+              <w:t xml:space="preserve">Higher education</w:t>
+            </w:r>
+          </w:p>
+        </w:tc>
+        <w:tc>
+          <w:tcPr>
+            <w:tcW w:w="1146" w:type="dxa"/>
+          </w:tcPr>
+          <w:p>
+            <w:pPr>
+              <w:spacing w:line="240" w:lineRule="auto" w:after="40"/>
+            </w:pPr>
+            <w:r>
+              <w:t xml:space="preserve">5</w:t>
+            </w:r>
+          </w:p>
+        </w:tc>
+        <w:tc>
+          <w:tcPr>
+            <w:tcW w:w="1305" w:type="dxa"/>
+          </w:tcPr>
+          <w:p>
+            <w:pPr>
+              <w:spacing w:line="240" w:lineRule="auto" w:after="40"/>
+            </w:pPr>
+            <w:r>
+              <w:t xml:space="preserve">8</w:t>
+            </w:r>
+          </w:p>
+        </w:tc>
+        <w:tc>
+          <w:tcPr>
+            <w:tcW w:w="720" w:type="dxa"/>
+          </w:tcPr>
+          <w:p>
+            <w:pPr>
+              <w:spacing w:line="240" w:lineRule="auto" w:after="40"/>
+            </w:pPr>
+            <w:r>
+              <w:t xml:space="preserve">5</w:t>
+            </w:r>
+          </w:p>
+        </w:tc>
+        <w:tc>
+          <w:tcPr>
+            <w:tcW w:w="1225" w:type="dxa"/>
+          </w:tcPr>
+          <w:p>
+            <w:pPr>
+              <w:spacing w:line="240" w:lineRule="auto" w:after="40"/>
+            </w:pPr>
+            <w:r>
+              <w:t xml:space="preserve">.63</w:t>
+            </w:r>
+          </w:p>
+        </w:tc>
+        <w:tc>
+          <w:tcPr>
+            <w:tcW w:w="1337" w:type="dxa"/>
+          </w:tcPr>
+          <w:p>
+            <w:pPr>
+              <w:spacing w:line="240" w:lineRule="auto" w:after="40"/>
+            </w:pPr>
+            <w:r>
+              <w:t xml:space="preserve">1.00</w:t>
+            </w:r>
+          </w:p>
+        </w:tc>
+        <w:tc>
+          <w:tcPr>
+            <w:tcW w:w="720" w:type="dxa"/>
+          </w:tcPr>
+          <w:p>
+            <w:pPr>
+              <w:spacing w:line="240" w:lineRule="auto" w:after="40"/>
+            </w:pPr>
+            <w:r>
+              <w:t xml:space="preserve">.69</w:t>
+            </w:r>
+          </w:p>
+        </w:tc>
+      </w:tr>
+      <w:tr>
+        <w:tc>
+          <w:tcPr>
+            <w:tcW w:w="2906" w:type="dxa"/>
+          </w:tcPr>
+          <w:p>
+            <w:pPr>
+              <w:spacing w:line="240" w:lineRule="auto" w:after="40"/>
+            </w:pPr>
+            <w:r>
+              <w:t xml:space="preserve">Teacher education</w:t>
+            </w:r>
+          </w:p>
+        </w:tc>
+        <w:tc>
+          <w:tcPr>
+            <w:tcW w:w="1146" w:type="dxa"/>
+          </w:tcPr>
+          <w:p>
+            <w:pPr>
+              <w:spacing w:line="240" w:lineRule="auto" w:after="40"/>
+            </w:pPr>
+            <w:r>
+              <w:t xml:space="preserve">10</w:t>
+            </w:r>
+          </w:p>
+        </w:tc>
+        <w:tc>
+          <w:tcPr>
+            <w:tcW w:w="1305" w:type="dxa"/>
+          </w:tcPr>
+          <w:p>
+            <w:pPr>
+              <w:spacing w:line="240" w:lineRule="auto" w:after="40"/>
+            </w:pPr>
+            <w:r>
+              <w:t xml:space="preserve">10</w:t>
+            </w:r>
+          </w:p>
+        </w:tc>
+        <w:tc>
+          <w:tcPr>
+            <w:tcW w:w="720" w:type="dxa"/>
+          </w:tcPr>
+          <w:p>
+            <w:pPr>
+              <w:spacing w:line="240" w:lineRule="auto" w:after="40"/>
+            </w:pPr>
+            <w:r>
+              <w:t xml:space="preserve">8</w:t>
+            </w:r>
+          </w:p>
+        </w:tc>
+        <w:tc>
+          <w:tcPr>
+            <w:tcW w:w="1225" w:type="dxa"/>
+          </w:tcPr>
+          <w:p>
+            <w:pPr>
+              <w:spacing w:line="240" w:lineRule="auto" w:after="40"/>
+            </w:pPr>
+            <w:r>
+              <w:t xml:space="preserve">.80</w:t>
+            </w:r>
+          </w:p>
+        </w:tc>
+        <w:tc>
+          <w:tcPr>
+            <w:tcW w:w="1337" w:type="dxa"/>
+          </w:tcPr>
+          <w:p>
+            <w:pPr>
+              <w:spacing w:line="240" w:lineRule="auto" w:after="40"/>
+            </w:pPr>
+            <w:r>
+              <w:t xml:space="preserve">.80</w:t>
+            </w:r>
+          </w:p>
+        </w:tc>
+        <w:tc>
+          <w:tcPr>
+            <w:tcW w:w="720" w:type="dxa"/>
+          </w:tcPr>
+          <w:p>
+            <w:pPr>
+              <w:spacing w:line="240" w:lineRule="auto" w:after="40"/>
+            </w:pPr>
+            <w:r>
+              <w:t xml:space="preserve">.67</w:t>
+            </w:r>
+          </w:p>
+        </w:tc>
+      </w:tr>
+      <w:tr>
+        <w:tc>
+          <w:tcPr>
+            <w:tcW w:w="2906" w:type="dxa"/>
+          </w:tcPr>
+          <w:p>
+            <w:pPr>
+              <w:spacing w:line="240" w:lineRule="auto" w:after="40"/>
+            </w:pPr>
+            <w:r>
+              <w:rPr>
+                <w:b/>
+              </w:rPr>
+              <w:t xml:space="preserve">Design</w:t>
+            </w:r>
+          </w:p>
+        </w:tc>
+        <w:tc>
+          <w:tcPr>
+            <w:tcW w:w="1146" w:type="dxa"/>
+          </w:tcPr>
+          <w:p>
+            <w:pPr>
+              <w:spacing w:line="240" w:lineRule="auto" w:after="40"/>
+            </w:pPr>
+          </w:p>
+        </w:tc>
+        <w:tc>
+          <w:tcPr>
+            <w:tcW w:w="1305" w:type="dxa"/>
+          </w:tcPr>
+          <w:p>
+            <w:pPr>
+              <w:spacing w:line="240" w:lineRule="auto" w:after="40"/>
+            </w:pPr>
+          </w:p>
+        </w:tc>
+        <w:tc>
+          <w:tcPr>
+            <w:tcW w:w="720" w:type="dxa"/>
+          </w:tcPr>
+          <w:p>
+            <w:pPr>
+              <w:spacing w:line="240" w:lineRule="auto" w:after="40"/>
+            </w:pPr>
+          </w:p>
+        </w:tc>
+        <w:tc>
+          <w:tcPr>
+            <w:tcW w:w="1225" w:type="dxa"/>
+          </w:tcPr>
+          <w:p>
+            <w:pPr>
+              <w:spacing w:line="240" w:lineRule="auto" w:after="40"/>
+            </w:pPr>
+          </w:p>
+        </w:tc>
+        <w:tc>
+          <w:tcPr>
+            <w:tcW w:w="1337" w:type="dxa"/>
+          </w:tcPr>
+          <w:p>
+            <w:pPr>
+              <w:spacing w:line="240" w:lineRule="auto" w:after="40"/>
+            </w:pPr>
+          </w:p>
+        </w:tc>
+        <w:tc>
+          <w:tcPr>
+            <w:tcW w:w="720" w:type="dxa"/>
+          </w:tcPr>
+          <w:p>
+            <w:pPr>
+              <w:spacing w:line="240" w:lineRule="auto" w:after="40"/>
+            </w:pPr>
+          </w:p>
+        </w:tc>
+      </w:tr>
+      <w:tr>
+        <w:tc>
+          <w:tcPr>
+            <w:tcW w:w="2906" w:type="dxa"/>
+          </w:tcPr>
+          <w:p>
+            <w:pPr>
+              <w:spacing w:line="240" w:lineRule="auto" w:after="40"/>
+            </w:pPr>
+            <w:r>
+              <w:t xml:space="preserve">Literature review</w:t>
+            </w:r>
+          </w:p>
+        </w:tc>
+        <w:tc>
+          <w:tcPr>
+            <w:tcW w:w="1146" w:type="dxa"/>
+          </w:tcPr>
+          <w:p>
+            <w:pPr>
+              <w:spacing w:line="240" w:lineRule="auto" w:after="40"/>
+            </w:pPr>
+            <w:r>
+              <w:t xml:space="preserve">2</w:t>
+            </w:r>
+          </w:p>
+        </w:tc>
+        <w:tc>
+          <w:tcPr>
+            <w:tcW w:w="1305" w:type="dxa"/>
+          </w:tcPr>
+          <w:p>
+            <w:pPr>
+              <w:spacing w:line="240" w:lineRule="auto" w:after="40"/>
+            </w:pPr>
+            <w:r>
+              <w:t xml:space="preserve">3</w:t>
+            </w:r>
+          </w:p>
+        </w:tc>
+        <w:tc>
+          <w:tcPr>
+            <w:tcW w:w="720" w:type="dxa"/>
+          </w:tcPr>
+          <w:p>
+            <w:pPr>
+              <w:spacing w:line="240" w:lineRule="auto" w:after="40"/>
+            </w:pPr>
+            <w:r>
+              <w:t xml:space="preserve">1</w:t>
+            </w:r>
+          </w:p>
+        </w:tc>
+        <w:tc>
+          <w:tcPr>
+            <w:tcW w:w="1225" w:type="dxa"/>
+          </w:tcPr>
+          <w:p>
+            <w:pPr>
+              <w:spacing w:line="240" w:lineRule="auto" w:after="40"/>
+            </w:pPr>
+            <w:r>
+              <w:t xml:space="preserve">.33</w:t>
+            </w:r>
+          </w:p>
+        </w:tc>
+        <w:tc>
+          <w:tcPr>
+            <w:tcW w:w="1337" w:type="dxa"/>
+          </w:tcPr>
+          <w:p>
+            <w:pPr>
+              <w:spacing w:line="240" w:lineRule="auto" w:after="40"/>
+            </w:pPr>
+            <w:r>
+              <w:t xml:space="preserve">.50</w:t>
+            </w:r>
+          </w:p>
+        </w:tc>
+        <w:tc>
+          <w:tcPr>
+            <w:tcW w:w="720" w:type="dxa"/>
+          </w:tcPr>
+          <w:p>
+            <w:pPr>
+              <w:spacing w:line="240" w:lineRule="auto" w:after="40"/>
+            </w:pPr>
+            <w:r>
+              <w:t xml:space="preserve">.34</w:t>
+            </w:r>
+          </w:p>
+        </w:tc>
+      </w:tr>
+      <w:tr>
+        <w:tc>
+          <w:tcPr>
+            <w:tcW w:w="2906" w:type="dxa"/>
+          </w:tcPr>
+          <w:p>
+            <w:pPr>
+              <w:spacing w:line="240" w:lineRule="auto" w:after="40"/>
+            </w:pPr>
+            <w:r>
+              <w:t xml:space="preserve">Conceptual or theoretical</w:t>
+            </w:r>
+          </w:p>
+        </w:tc>
+        <w:tc>
+          <w:tcPr>
+            <w:tcW w:w="1146" w:type="dxa"/>
+          </w:tcPr>
+          <w:p>
+            <w:pPr>
+              <w:spacing w:line="240" w:lineRule="auto" w:after="40"/>
+            </w:pPr>
+            <w:r>
+              <w:t xml:space="preserve">2</w:t>
+            </w:r>
+          </w:p>
+        </w:tc>
+        <w:tc>
+          <w:tcPr>
+            <w:tcW w:w="1305" w:type="dxa"/>
+          </w:tcPr>
+          <w:p>
+            <w:pPr>
+              <w:spacing w:line="240" w:lineRule="auto" w:after="40"/>
+            </w:pPr>
+            <w:r>
+              <w:t xml:space="preserve">4</w:t>
+            </w:r>
+          </w:p>
+        </w:tc>
+        <w:tc>
+          <w:tcPr>
+            <w:tcW w:w="720" w:type="dxa"/>
+          </w:tcPr>
+          <w:p>
+            <w:pPr>
+              <w:spacing w:line="240" w:lineRule="auto" w:after="40"/>
+            </w:pPr>
+            <w:r>
+              <w:t xml:space="preserve">1</w:t>
+            </w:r>
+          </w:p>
+        </w:tc>
+        <w:tc>
+          <w:tcPr>
+            <w:tcW w:w="1225" w:type="dxa"/>
+          </w:tcPr>
+          <w:p>
+            <w:pPr>
+              <w:spacing w:line="240" w:lineRule="auto" w:after="40"/>
+            </w:pPr>
+            <w:r>
+              <w:t xml:space="preserve">.25</w:t>
+            </w:r>
+          </w:p>
+        </w:tc>
+        <w:tc>
+          <w:tcPr>
+            <w:tcW w:w="1337" w:type="dxa"/>
+          </w:tcPr>
+          <w:p>
+            <w:pPr>
+              <w:spacing w:line="240" w:lineRule="auto" w:after="40"/>
+            </w:pPr>
+            <w:r>
+              <w:t xml:space="preserve">.50</w:t>
+            </w:r>
+          </w:p>
+        </w:tc>
+        <w:tc>
+          <w:tcPr>
+            <w:tcW w:w="720" w:type="dxa"/>
+          </w:tcPr>
+          <w:p>
+            <w:pPr>
+              <w:spacing w:line="240" w:lineRule="auto" w:after="40"/>
+            </w:pPr>
+            <w:r>
+              <w:t xml:space="preserve">.25</w:t>
+            </w:r>
+          </w:p>
+        </w:tc>
+      </w:tr>
+      <w:tr>
+        <w:tc>
+          <w:tcPr>
+            <w:tcW w:w="2906" w:type="dxa"/>
+          </w:tcPr>
+          <w:p>
+            <w:pPr>
+              <w:spacing w:line="240" w:lineRule="auto" w:after="40"/>
+            </w:pPr>
+            <w:r>
+              <w:t xml:space="preserve">Qualitative</w:t>
+            </w:r>
+          </w:p>
+        </w:tc>
+        <w:tc>
+          <w:tcPr>
+            <w:tcW w:w="1146" w:type="dxa"/>
+          </w:tcPr>
+          <w:p>
+            <w:pPr>
+              <w:spacing w:line="240" w:lineRule="auto" w:after="40"/>
+            </w:pPr>
+            <w:r>
+              <w:t xml:space="preserve">17</w:t>
+            </w:r>
+          </w:p>
+        </w:tc>
+        <w:tc>
+          <w:tcPr>
+            <w:tcW w:w="1305" w:type="dxa"/>
+          </w:tcPr>
+          <w:p>
+            <w:pPr>
+              <w:spacing w:line="240" w:lineRule="auto" w:after="40"/>
+            </w:pPr>
+            <w:r>
+              <w:t xml:space="preserve">14</w:t>
+            </w:r>
+          </w:p>
+        </w:tc>
+        <w:tc>
+          <w:tcPr>
+            <w:tcW w:w="720" w:type="dxa"/>
+          </w:tcPr>
+          <w:p>
+            <w:pPr>
+              <w:spacing w:line="240" w:lineRule="auto" w:after="40"/>
+            </w:pPr>
+            <w:r>
+              <w:t xml:space="preserve">13</w:t>
+            </w:r>
+          </w:p>
+        </w:tc>
+        <w:tc>
+          <w:tcPr>
+            <w:tcW w:w="1225" w:type="dxa"/>
+          </w:tcPr>
+          <w:p>
+            <w:pPr>
+              <w:spacing w:line="240" w:lineRule="auto" w:after="40"/>
+            </w:pPr>
+            <w:r>
+              <w:t xml:space="preserve">.93</w:t>
+            </w:r>
+          </w:p>
+        </w:tc>
+        <w:tc>
+          <w:tcPr>
+            <w:tcW w:w="1337" w:type="dxa"/>
+          </w:tcPr>
+          <w:p>
+            <w:pPr>
+              <w:spacing w:line="240" w:lineRule="auto" w:after="40"/>
+            </w:pPr>
+            <w:r>
+              <w:t xml:space="preserve">.76</w:t>
+            </w:r>
+          </w:p>
+        </w:tc>
+        <w:tc>
+          <w:tcPr>
+            <w:tcW w:w="720" w:type="dxa"/>
+          </w:tcPr>
+          <w:p>
+            <w:pPr>
+              <w:spacing w:line="240" w:lineRule="auto" w:after="40"/>
+            </w:pPr>
+            <w:r>
+              <w:t xml:space="preserve">.58</w:t>
+            </w:r>
+          </w:p>
+        </w:tc>
+      </w:tr>
+      <w:tr>
+        <w:tc>
+          <w:tcPr>
+            <w:tcW w:w="2906" w:type="dxa"/>
+          </w:tcPr>
+          <w:p>
+            <w:pPr>
+              <w:spacing w:line="240" w:lineRule="auto" w:after="40"/>
+            </w:pPr>
+            <w:r>
+              <w:t xml:space="preserve">Quantitative</w:t>
+            </w:r>
+          </w:p>
+        </w:tc>
+        <w:tc>
+          <w:tcPr>
+            <w:tcW w:w="1146" w:type="dxa"/>
+          </w:tcPr>
+          <w:p>
+            <w:pPr>
+              <w:spacing w:line="240" w:lineRule="auto" w:after="40"/>
+            </w:pPr>
+            <w:r>
+              <w:t xml:space="preserve">7</w:t>
+            </w:r>
+          </w:p>
+        </w:tc>
+        <w:tc>
+          <w:tcPr>
+            <w:tcW w:w="1305" w:type="dxa"/>
+          </w:tcPr>
+          <w:p>
+            <w:pPr>
+              <w:spacing w:line="240" w:lineRule="auto" w:after="40"/>
+            </w:pPr>
+            <w:r>
+              <w:t xml:space="preserve">6</w:t>
+            </w:r>
+          </w:p>
+        </w:tc>
+        <w:tc>
+          <w:tcPr>
+            <w:tcW w:w="720" w:type="dxa"/>
+          </w:tcPr>
+          <w:p>
+            <w:pPr>
+              <w:spacing w:line="240" w:lineRule="auto" w:after="40"/>
+            </w:pPr>
+            <w:r>
+              <w:t xml:space="preserve">4</w:t>
+            </w:r>
+          </w:p>
+        </w:tc>
+        <w:tc>
+          <w:tcPr>
+            <w:tcW w:w="1225" w:type="dxa"/>
+          </w:tcPr>
+          <w:p>
+            <w:pPr>
+              <w:spacing w:line="240" w:lineRule="auto" w:after="40"/>
+            </w:pPr>
+            <w:r>
+              <w:t xml:space="preserve">.67</w:t>
+            </w:r>
+          </w:p>
+        </w:tc>
+        <w:tc>
+          <w:tcPr>
+            <w:tcW w:w="1337" w:type="dxa"/>
+          </w:tcPr>
+          <w:p>
+            <w:pPr>
+              <w:spacing w:line="240" w:lineRule="auto" w:after="40"/>
+            </w:pPr>
+            <w:r>
+              <w:t xml:space="preserve">.57</w:t>
+            </w:r>
+          </w:p>
+        </w:tc>
+        <w:tc>
+          <w:tcPr>
+            <w:tcW w:w="720" w:type="dxa"/>
+          </w:tcPr>
+          <w:p>
+            <w:pPr>
+              <w:spacing w:line="240" w:lineRule="auto" w:after="40"/>
+            </w:pPr>
+            <w:r>
+              <w:t xml:space="preserve">.48</w:t>
+            </w:r>
+          </w:p>
+        </w:tc>
+      </w:tr>
+      <w:tr>
+        <w:tc>
+          <w:tcPr>
+            <w:tcW w:w="2906" w:type="dxa"/>
+          </w:tcPr>
+          <w:p>
+            <w:pPr>
+              <w:spacing w:line="240" w:lineRule="auto" w:after="40"/>
+            </w:pPr>
+            <w:r>
+              <w:t xml:space="preserve">Intervention or designed teaching</w:t>
+            </w:r>
+          </w:p>
+        </w:tc>
+        <w:tc>
+          <w:tcPr>
+            <w:tcW w:w="1146" w:type="dxa"/>
+          </w:tcPr>
+          <w:p>
+            <w:pPr>
+              <w:spacing w:line="240" w:lineRule="auto" w:after="40"/>
+            </w:pPr>
+            <w:r>
+              <w:t xml:space="preserve">10</w:t>
+            </w:r>
+          </w:p>
+        </w:tc>
+        <w:tc>
+          <w:tcPr>
+            <w:tcW w:w="1305" w:type="dxa"/>
+          </w:tcPr>
+          <w:p>
+            <w:pPr>
+              <w:spacing w:line="240" w:lineRule="auto" w:after="40"/>
+            </w:pPr>
+            <w:r>
+              <w:t xml:space="preserve">7</w:t>
+            </w:r>
+          </w:p>
+        </w:tc>
+        <w:tc>
+          <w:tcPr>
+            <w:tcW w:w="720" w:type="dxa"/>
+          </w:tcPr>
+          <w:p>
+            <w:pPr>
+              <w:spacing w:line="240" w:lineRule="auto" w:after="40"/>
+            </w:pPr>
+            <w:r>
+              <w:t xml:space="preserve">5</w:t>
+            </w:r>
+          </w:p>
+        </w:tc>
+        <w:tc>
+          <w:tcPr>
+            <w:tcW w:w="1225" w:type="dxa"/>
+          </w:tcPr>
+          <w:p>
+            <w:pPr>
+              <w:spacing w:line="240" w:lineRule="auto" w:after="40"/>
+            </w:pPr>
+            <w:r>
+              <w:t xml:space="preserve">.71</w:t>
+            </w:r>
+          </w:p>
+        </w:tc>
+        <w:tc>
+          <w:tcPr>
+            <w:tcW w:w="1337" w:type="dxa"/>
+          </w:tcPr>
+          <w:p>
+            <w:pPr>
+              <w:spacing w:line="240" w:lineRule="auto" w:after="40"/>
+            </w:pPr>
+            <w:r>
+              <w:t xml:space="preserve">.50</w:t>
+            </w:r>
+          </w:p>
+        </w:tc>
+        <w:tc>
+          <w:tcPr>
+            <w:tcW w:w="720" w:type="dxa"/>
+          </w:tcPr>
+          <w:p>
+            <w:pPr>
+              <w:spacing w:line="240" w:lineRule="auto" w:after="40"/>
+            </w:pPr>
+            <w:r>
+              <w:t xml:space="preserve">.39</w:t>
+            </w:r>
+          </w:p>
+        </w:tc>
+      </w:tr>
+      <w:tr>
+        <w:tc>
+          <w:tcPr>
+            <w:tcW w:w="2906" w:type="dxa"/>
+          </w:tcPr>
+          <w:p>
+            <w:pPr>
+              <w:spacing w:line="240" w:lineRule="auto" w:after="40"/>
+            </w:pPr>
+            <w:r>
+              <w:rPr>
+                <w:b/>
+              </w:rPr>
+              <w:t xml:space="preserve">Theoretical tradition</w:t>
+            </w:r>
+          </w:p>
+        </w:tc>
+        <w:tc>
+          <w:tcPr>
+            <w:tcW w:w="1146" w:type="dxa"/>
+          </w:tcPr>
+          <w:p>
+            <w:pPr>
+              <w:spacing w:line="240" w:lineRule="auto" w:after="40"/>
+            </w:pPr>
+          </w:p>
+        </w:tc>
+        <w:tc>
+          <w:tcPr>
+            <w:tcW w:w="1305" w:type="dxa"/>
+          </w:tcPr>
+          <w:p>
+            <w:pPr>
+              <w:spacing w:line="240" w:lineRule="auto" w:after="40"/>
+            </w:pPr>
+          </w:p>
+        </w:tc>
+        <w:tc>
+          <w:tcPr>
+            <w:tcW w:w="720" w:type="dxa"/>
+          </w:tcPr>
+          <w:p>
+            <w:pPr>
+              <w:spacing w:line="240" w:lineRule="auto" w:after="40"/>
+            </w:pPr>
+          </w:p>
+        </w:tc>
+        <w:tc>
+          <w:tcPr>
+            <w:tcW w:w="1225" w:type="dxa"/>
+          </w:tcPr>
+          <w:p>
+            <w:pPr>
+              <w:spacing w:line="240" w:lineRule="auto" w:after="40"/>
+            </w:pPr>
+          </w:p>
+        </w:tc>
+        <w:tc>
+          <w:tcPr>
+            <w:tcW w:w="1337" w:type="dxa"/>
+          </w:tcPr>
+          <w:p>
+            <w:pPr>
+              <w:spacing w:line="240" w:lineRule="auto" w:after="40"/>
+            </w:pPr>
+          </w:p>
+        </w:tc>
+        <w:tc>
+          <w:tcPr>
+            <w:tcW w:w="720" w:type="dxa"/>
+          </w:tcPr>
+          <w:p>
+            <w:pPr>
+              <w:spacing w:line="240" w:lineRule="auto" w:after="40"/>
+            </w:pPr>
+          </w:p>
+        </w:tc>
+      </w:tr>
+      <w:tr>
+        <w:tc>
+          <w:tcPr>
+            <w:tcW w:w="2906" w:type="dxa"/>
+          </w:tcPr>
+          <w:p>
+            <w:pPr>
+              <w:spacing w:line="240" w:lineRule="auto" w:after="40"/>
+            </w:pPr>
+            <w:r>
+              <w:t xml:space="preserve">Critical pedagogy (Freirean)</w:t>
+            </w:r>
+          </w:p>
+        </w:tc>
+        <w:tc>
+          <w:tcPr>
+            <w:tcW w:w="1146" w:type="dxa"/>
+          </w:tcPr>
+          <w:p>
+            <w:pPr>
+              <w:spacing w:line="240" w:lineRule="auto" w:after="40"/>
+            </w:pPr>
+            <w:r>
+              <w:t xml:space="preserve">6</w:t>
+            </w:r>
+          </w:p>
+        </w:tc>
+        <w:tc>
+          <w:tcPr>
+            <w:tcW w:w="1305" w:type="dxa"/>
+          </w:tcPr>
+          <w:p>
+            <w:pPr>
+              <w:spacing w:line="240" w:lineRule="auto" w:after="40"/>
+            </w:pPr>
+            <w:r>
+              <w:t xml:space="preserve">4</w:t>
+            </w:r>
+          </w:p>
+        </w:tc>
+        <w:tc>
+          <w:tcPr>
+            <w:tcW w:w="720" w:type="dxa"/>
+          </w:tcPr>
+          <w:p>
+            <w:pPr>
+              <w:spacing w:line="240" w:lineRule="auto" w:after="40"/>
+            </w:pPr>
+            <w:r>
+              <w:t xml:space="preserve">2</w:t>
+            </w:r>
+          </w:p>
+        </w:tc>
+        <w:tc>
+          <w:tcPr>
+            <w:tcW w:w="1225" w:type="dxa"/>
+          </w:tcPr>
+          <w:p>
+            <w:pPr>
+              <w:spacing w:line="240" w:lineRule="auto" w:after="40"/>
+            </w:pPr>
+            <w:r>
+              <w:t xml:space="preserve">.50</w:t>
+            </w:r>
+          </w:p>
+        </w:tc>
+        <w:tc>
+          <w:tcPr>
+            <w:tcW w:w="1337" w:type="dxa"/>
+          </w:tcPr>
+          <w:p>
+            <w:pPr>
+              <w:spacing w:line="240" w:lineRule="auto" w:after="40"/>
+            </w:pPr>
+            <w:r>
+              <w:t xml:space="preserve">.33</w:t>
+            </w:r>
+          </w:p>
+        </w:tc>
+        <w:tc>
+          <w:tcPr>
+            <w:tcW w:w="720" w:type="dxa"/>
+          </w:tcPr>
+          <w:p>
+            <w:pPr>
+              <w:spacing w:line="240" w:lineRule="auto" w:after="40"/>
+            </w:pPr>
+            <w:r>
+              <w:t xml:space="preserve">.26</w:t>
+            </w:r>
+          </w:p>
+        </w:tc>
+      </w:tr>
+      <w:tr>
+        <w:tc>
+          <w:tcPr>
+            <w:tcW w:w="2906" w:type="dxa"/>
+          </w:tcPr>
+          <w:p>
+            <w:pPr>
+              <w:spacing w:line="240" w:lineRule="auto" w:after="40"/>
+            </w:pPr>
+            <w:r>
+              <w:t xml:space="preserve">Multiliteracies and New Literacy Studies</w:t>
+            </w:r>
+          </w:p>
+        </w:tc>
+        <w:tc>
+          <w:tcPr>
+            <w:tcW w:w="1146" w:type="dxa"/>
+          </w:tcPr>
+          <w:p>
+            <w:pPr>
+              <w:spacing w:line="240" w:lineRule="auto" w:after="40"/>
+            </w:pPr>
+            <w:r>
+              <w:t xml:space="preserve">3</w:t>
+            </w:r>
+          </w:p>
+        </w:tc>
+        <w:tc>
+          <w:tcPr>
+            <w:tcW w:w="1305" w:type="dxa"/>
+          </w:tcPr>
+          <w:p>
+            <w:pPr>
+              <w:spacing w:line="240" w:lineRule="auto" w:after="40"/>
+            </w:pPr>
+            <w:r>
+              <w:t xml:space="preserve">3</w:t>
+            </w:r>
+          </w:p>
+        </w:tc>
+        <w:tc>
+          <w:tcPr>
+            <w:tcW w:w="720" w:type="dxa"/>
+          </w:tcPr>
+          <w:p>
+            <w:pPr>
+              <w:spacing w:line="240" w:lineRule="auto" w:after="40"/>
+            </w:pPr>
+            <w:r>
+              <w:t xml:space="preserve">2</w:t>
+            </w:r>
+          </w:p>
+        </w:tc>
+        <w:tc>
+          <w:tcPr>
+            <w:tcW w:w="1225" w:type="dxa"/>
+          </w:tcPr>
+          <w:p>
+            <w:pPr>
+              <w:spacing w:line="240" w:lineRule="auto" w:after="40"/>
+            </w:pPr>
+            <w:r>
+              <w:t xml:space="preserve">.67</w:t>
+            </w:r>
+          </w:p>
+        </w:tc>
+        <w:tc>
+          <w:tcPr>
+            <w:tcW w:w="1337" w:type="dxa"/>
+          </w:tcPr>
+          <w:p>
+            <w:pPr>
+              <w:spacing w:line="240" w:lineRule="auto" w:after="40"/>
+            </w:pPr>
+            <w:r>
+              <w:t xml:space="preserve">.67</w:t>
+            </w:r>
+          </w:p>
+        </w:tc>
+        <w:tc>
+          <w:tcPr>
+            <w:tcW w:w="720" w:type="dxa"/>
+          </w:tcPr>
+          <w:p>
+            <w:pPr>
+              <w:spacing w:line="240" w:lineRule="auto" w:after="40"/>
+            </w:pPr>
+            <w:r>
+              <w:t xml:space="preserve">.62</w:t>
+            </w:r>
+          </w:p>
+        </w:tc>
+      </w:tr>
+      <w:tr>
+        <w:tc>
+          <w:tcPr>
+            <w:tcW w:w="2906" w:type="dxa"/>
+          </w:tcPr>
+          <w:p>
+            <w:pPr>
+              <w:spacing w:line="240" w:lineRule="auto" w:after="40"/>
+            </w:pPr>
+            <w:r>
+              <w:t xml:space="preserve">Media literacy and educommunication</w:t>
+            </w:r>
+          </w:p>
+        </w:tc>
+        <w:tc>
+          <w:tcPr>
+            <w:tcW w:w="1146" w:type="dxa"/>
+          </w:tcPr>
+          <w:p>
+            <w:pPr>
+              <w:spacing w:line="240" w:lineRule="auto" w:after="40"/>
+            </w:pPr>
+            <w:r>
+              <w:t xml:space="preserve">2</w:t>
+            </w:r>
+          </w:p>
+        </w:tc>
+        <w:tc>
+          <w:tcPr>
+            <w:tcW w:w="1305" w:type="dxa"/>
+          </w:tcPr>
+          <w:p>
+            <w:pPr>
+              <w:spacing w:line="240" w:lineRule="auto" w:after="40"/>
+            </w:pPr>
+            <w:r>
+              <w:t xml:space="preserve">2</w:t>
+            </w:r>
+          </w:p>
+        </w:tc>
+        <w:tc>
+          <w:tcPr>
+            <w:tcW w:w="720" w:type="dxa"/>
+          </w:tcPr>
+          <w:p>
+            <w:pPr>
+              <w:spacing w:line="240" w:lineRule="auto" w:after="40"/>
+            </w:pPr>
+            <w:r>
+              <w:t xml:space="preserve">1</w:t>
+            </w:r>
+          </w:p>
+        </w:tc>
+        <w:tc>
+          <w:tcPr>
+            <w:tcW w:w="1225" w:type="dxa"/>
+          </w:tcPr>
+          <w:p>
+            <w:pPr>
+              <w:spacing w:line="240" w:lineRule="auto" w:after="40"/>
+            </w:pPr>
+            <w:r>
+              <w:t xml:space="preserve">.50</w:t>
+            </w:r>
+          </w:p>
+        </w:tc>
+        <w:tc>
+          <w:tcPr>
+            <w:tcW w:w="1337" w:type="dxa"/>
+          </w:tcPr>
+          <w:p>
+            <w:pPr>
+              <w:spacing w:line="240" w:lineRule="auto" w:after="40"/>
+            </w:pPr>
+            <w:r>
+              <w:t xml:space="preserve">.50</w:t>
+            </w:r>
+          </w:p>
+        </w:tc>
+        <w:tc>
+          <w:tcPr>
+            <w:tcW w:w="720" w:type="dxa"/>
+          </w:tcPr>
+          <w:p>
+            <w:pPr>
+              <w:spacing w:line="240" w:lineRule="auto" w:after="40"/>
+            </w:pPr>
+            <w:r>
+              <w:t xml:space="preserve">.46</w:t>
+            </w:r>
+          </w:p>
+        </w:tc>
+      </w:tr>
+      <w:tr>
+        <w:tc>
+          <w:tcPr>
+            <w:tcW w:w="2906" w:type="dxa"/>
+          </w:tcPr>
+          <w:p>
+            <w:pPr>
+              <w:spacing w:line="240" w:lineRule="auto" w:after="40"/>
+            </w:pPr>
+            <w:r>
+              <w:t xml:space="preserve">Digital citizenship</w:t>
+            </w:r>
+          </w:p>
+        </w:tc>
+        <w:tc>
+          <w:tcPr>
+            <w:tcW w:w="1146" w:type="dxa"/>
+          </w:tcPr>
+          <w:p>
+            <w:pPr>
+              <w:spacing w:line="240" w:lineRule="auto" w:after="40"/>
+            </w:pPr>
+            <w:r>
+              <w:t xml:space="preserve">3</w:t>
+            </w:r>
+          </w:p>
+        </w:tc>
+        <w:tc>
+          <w:tcPr>
+            <w:tcW w:w="1305" w:type="dxa"/>
+          </w:tcPr>
+          <w:p>
+            <w:pPr>
+              <w:spacing w:line="240" w:lineRule="auto" w:after="40"/>
+            </w:pPr>
+            <w:r>
+              <w:t xml:space="preserve">2</w:t>
+            </w:r>
+          </w:p>
+        </w:tc>
+        <w:tc>
+          <w:tcPr>
+            <w:tcW w:w="720" w:type="dxa"/>
+          </w:tcPr>
+          <w:p>
+            <w:pPr>
+              <w:spacing w:line="240" w:lineRule="auto" w:after="40"/>
+            </w:pPr>
+            <w:r>
+              <w:t xml:space="preserve">2</w:t>
+            </w:r>
+          </w:p>
+        </w:tc>
+        <w:tc>
+          <w:tcPr>
+            <w:tcW w:w="1225" w:type="dxa"/>
+          </w:tcPr>
+          <w:p>
+            <w:pPr>
+              <w:spacing w:line="240" w:lineRule="auto" w:after="40"/>
+            </w:pPr>
+            <w:r>
+              <w:t xml:space="preserve">1.00</w:t>
+            </w:r>
+          </w:p>
+        </w:tc>
+        <w:tc>
+          <w:tcPr>
+            <w:tcW w:w="1337" w:type="dxa"/>
+          </w:tcPr>
+          <w:p>
+            <w:pPr>
+              <w:spacing w:line="240" w:lineRule="auto" w:after="40"/>
+            </w:pPr>
+            <w:r>
+              <w:t xml:space="preserve">.67</w:t>
+            </w:r>
+          </w:p>
+        </w:tc>
+        <w:tc>
+          <w:tcPr>
+            <w:tcW w:w="720" w:type="dxa"/>
+          </w:tcPr>
+          <w:p>
+            <w:pPr>
+              <w:spacing w:line="240" w:lineRule="auto" w:after="40"/>
+            </w:pPr>
+            <w:r>
+              <w:t xml:space="preserve">.78</w:t>
+            </w:r>
+          </w:p>
+        </w:tc>
+      </w:tr>
+      <w:tr>
+        <w:tc>
+          <w:tcPr>
+            <w:tcW w:w="2906" w:type="dxa"/>
+          </w:tcPr>
+          <w:p>
+            <w:pPr>
+              <w:spacing w:line="240" w:lineRule="auto" w:after="40"/>
+            </w:pPr>
+            <w:r>
+              <w:t xml:space="preserve">Race, gender and decolonial perspectives</w:t>
+            </w:r>
+          </w:p>
+        </w:tc>
+        <w:tc>
+          <w:tcPr>
+            <w:tcW w:w="1146" w:type="dxa"/>
+          </w:tcPr>
+          <w:p>
+            <w:pPr>
+              <w:spacing w:line="240" w:lineRule="auto" w:after="40"/>
+            </w:pPr>
+            <w:r>
+              <w:t xml:space="preserve">4</w:t>
+            </w:r>
+          </w:p>
+        </w:tc>
+        <w:tc>
+          <w:tcPr>
+            <w:tcW w:w="1305" w:type="dxa"/>
+          </w:tcPr>
+          <w:p>
+            <w:pPr>
+              <w:spacing w:line="240" w:lineRule="auto" w:after="40"/>
+            </w:pPr>
+            <w:r>
+              <w:t xml:space="preserve">3</w:t>
+            </w:r>
+          </w:p>
+        </w:tc>
+        <w:tc>
+          <w:tcPr>
+            <w:tcW w:w="720" w:type="dxa"/>
+          </w:tcPr>
+          <w:p>
+            <w:pPr>
+              <w:spacing w:line="240" w:lineRule="auto" w:after="40"/>
+            </w:pPr>
+            <w:r>
+              <w:t xml:space="preserve">3</w:t>
+            </w:r>
+          </w:p>
+        </w:tc>
+        <w:tc>
+          <w:tcPr>
+            <w:tcW w:w="1225" w:type="dxa"/>
+          </w:tcPr>
+          <w:p>
+            <w:pPr>
+              <w:spacing w:line="240" w:lineRule="auto" w:after="40"/>
+            </w:pPr>
+            <w:r>
+              <w:t xml:space="preserve">1.00</w:t>
+            </w:r>
+          </w:p>
+        </w:tc>
+        <w:tc>
+          <w:tcPr>
+            <w:tcW w:w="1337" w:type="dxa"/>
+          </w:tcPr>
+          <w:p>
+            <w:pPr>
+              <w:spacing w:line="240" w:lineRule="auto" w:after="40"/>
+            </w:pPr>
+            <w:r>
+              <w:t xml:space="preserve">.75</w:t>
+            </w:r>
+          </w:p>
+        </w:tc>
+        <w:tc>
+          <w:tcPr>
+            <w:tcW w:w="720" w:type="dxa"/>
+          </w:tcPr>
+          <w:p>
+            <w:pPr>
+              <w:spacing w:line="240" w:lineRule="auto" w:after="40"/>
+            </w:pPr>
+            <w:r>
+              <w:t xml:space="preserve">.83</w:t>
+            </w:r>
+          </w:p>
+        </w:tc>
+      </w:tr>
+      <w:tr>
+        <w:tc>
+          <w:tcPr>
+            <w:tcW w:w="2906" w:type="dxa"/>
+          </w:tcPr>
+          <w:p>
+            <w:pPr>
+              <w:spacing w:line="240" w:lineRule="auto" w:after="40"/>
+            </w:pPr>
+            <w:r>
+              <w:rPr>
+                <w:b/>
+              </w:rPr>
+              <w:t xml:space="preserve">Object of critique, context or practice</w:t>
+            </w:r>
+          </w:p>
+        </w:tc>
+        <w:tc>
+          <w:tcPr>
+            <w:tcW w:w="1146" w:type="dxa"/>
+          </w:tcPr>
+          <w:p>
+            <w:pPr>
+              <w:spacing w:line="240" w:lineRule="auto" w:after="40"/>
+            </w:pPr>
+          </w:p>
+        </w:tc>
+        <w:tc>
+          <w:tcPr>
+            <w:tcW w:w="1305" w:type="dxa"/>
+          </w:tcPr>
+          <w:p>
+            <w:pPr>
+              <w:spacing w:line="240" w:lineRule="auto" w:after="40"/>
+            </w:pPr>
+          </w:p>
+        </w:tc>
+        <w:tc>
+          <w:tcPr>
+            <w:tcW w:w="720" w:type="dxa"/>
+          </w:tcPr>
+          <w:p>
+            <w:pPr>
+              <w:spacing w:line="240" w:lineRule="auto" w:after="40"/>
+            </w:pPr>
+          </w:p>
+        </w:tc>
+        <w:tc>
+          <w:tcPr>
+            <w:tcW w:w="1225" w:type="dxa"/>
+          </w:tcPr>
+          <w:p>
+            <w:pPr>
+              <w:spacing w:line="240" w:lineRule="auto" w:after="40"/>
+            </w:pPr>
+          </w:p>
+        </w:tc>
+        <w:tc>
+          <w:tcPr>
+            <w:tcW w:w="1337" w:type="dxa"/>
+          </w:tcPr>
+          <w:p>
+            <w:pPr>
+              <w:spacing w:line="240" w:lineRule="auto" w:after="40"/>
+            </w:pPr>
+          </w:p>
+        </w:tc>
+        <w:tc>
+          <w:tcPr>
+            <w:tcW w:w="720" w:type="dxa"/>
+          </w:tcPr>
+          <w:p>
+            <w:pPr>
+              <w:spacing w:line="240" w:lineRule="auto" w:after="40"/>
+            </w:pPr>
+          </w:p>
+        </w:tc>
+      </w:tr>
+      <w:tr>
+        <w:tc>
+          <w:tcPr>
+            <w:tcW w:w="2906" w:type="dxa"/>
+          </w:tcPr>
+          <w:p>
+            <w:pPr>
+              <w:spacing w:line="240" w:lineRule="auto" w:after="40"/>
+            </w:pPr>
+            <w:r>
+              <w:t xml:space="preserve">Artificial intelligence</w:t>
+            </w:r>
+          </w:p>
+        </w:tc>
+        <w:tc>
+          <w:tcPr>
+            <w:tcW w:w="1146" w:type="dxa"/>
+          </w:tcPr>
+          <w:p>
+            <w:pPr>
+              <w:spacing w:line="240" w:lineRule="auto" w:after="40"/>
+            </w:pPr>
+            <w:r>
+              <w:t xml:space="preserve">5</w:t>
+            </w:r>
+          </w:p>
+        </w:tc>
+        <w:tc>
+          <w:tcPr>
+            <w:tcW w:w="1305" w:type="dxa"/>
+          </w:tcPr>
+          <w:p>
+            <w:pPr>
+              <w:spacing w:line="240" w:lineRule="auto" w:after="40"/>
+            </w:pPr>
+            <w:r>
+              <w:t xml:space="preserve">5</w:t>
+            </w:r>
+          </w:p>
+        </w:tc>
+        <w:tc>
+          <w:tcPr>
+            <w:tcW w:w="720" w:type="dxa"/>
+          </w:tcPr>
+          <w:p>
+            <w:pPr>
+              <w:spacing w:line="240" w:lineRule="auto" w:after="40"/>
+            </w:pPr>
+            <w:r>
+              <w:t xml:space="preserve">5</w:t>
+            </w:r>
+          </w:p>
+        </w:tc>
+        <w:tc>
+          <w:tcPr>
+            <w:tcW w:w="1225" w:type="dxa"/>
+          </w:tcPr>
+          <w:p>
+            <w:pPr>
+              <w:spacing w:line="240" w:lineRule="auto" w:after="40"/>
+            </w:pPr>
+            <w:r>
+              <w:t xml:space="preserve">1.00</w:t>
+            </w:r>
+          </w:p>
+        </w:tc>
+        <w:tc>
+          <w:tcPr>
+            <w:tcW w:w="1337" w:type="dxa"/>
+          </w:tcPr>
+          <w:p>
+            <w:pPr>
+              <w:spacing w:line="240" w:lineRule="auto" w:after="40"/>
+            </w:pPr>
+            <w:r>
+              <w:t xml:space="preserve">1.00</w:t>
+            </w:r>
+          </w:p>
+        </w:tc>
+        <w:tc>
+          <w:tcPr>
+            <w:tcW w:w="720" w:type="dxa"/>
+          </w:tcPr>
+          <w:p>
+            <w:pPr>
+              <w:spacing w:line="240" w:lineRule="auto" w:after="40"/>
+            </w:pPr>
+            <w:r>
+              <w:t xml:space="preserve">1.00</w:t>
+            </w:r>
+          </w:p>
+        </w:tc>
+      </w:tr>
+      <w:tr>
+        <w:tc>
+          <w:tcPr>
+            <w:tcW w:w="2906" w:type="dxa"/>
+          </w:tcPr>
+          <w:p>
+            <w:pPr>
+              <w:spacing w:line="240" w:lineRule="auto" w:after="40"/>
+            </w:pPr>
+            <w:r>
+              <w:t xml:space="preserve">Disinformation and post-truth</w:t>
+            </w:r>
+          </w:p>
+        </w:tc>
+        <w:tc>
+          <w:tcPr>
+            <w:tcW w:w="1146" w:type="dxa"/>
+          </w:tcPr>
+          <w:p>
+            <w:pPr>
+              <w:spacing w:line="240" w:lineRule="auto" w:after="40"/>
+            </w:pPr>
+            <w:r>
+              <w:t xml:space="preserve">6</w:t>
+            </w:r>
+          </w:p>
+        </w:tc>
+        <w:tc>
+          <w:tcPr>
+            <w:tcW w:w="1305" w:type="dxa"/>
+          </w:tcPr>
+          <w:p>
+            <w:pPr>
+              <w:spacing w:line="240" w:lineRule="auto" w:after="40"/>
+            </w:pPr>
+            <w:r>
+              <w:t xml:space="preserve">1</w:t>
+            </w:r>
+          </w:p>
+        </w:tc>
+        <w:tc>
+          <w:tcPr>
+            <w:tcW w:w="720" w:type="dxa"/>
+          </w:tcPr>
+          <w:p>
+            <w:pPr>
+              <w:spacing w:line="240" w:lineRule="auto" w:after="40"/>
+            </w:pPr>
+            <w:r>
+              <w:t xml:space="preserve">1</w:t>
+            </w:r>
+          </w:p>
+        </w:tc>
+        <w:tc>
+          <w:tcPr>
+            <w:tcW w:w="1225" w:type="dxa"/>
+          </w:tcPr>
+          <w:p>
+            <w:pPr>
+              <w:spacing w:line="240" w:lineRule="auto" w:after="40"/>
+            </w:pPr>
+            <w:r>
+              <w:t xml:space="preserve">1.00</w:t>
+            </w:r>
+          </w:p>
+        </w:tc>
+        <w:tc>
+          <w:tcPr>
+            <w:tcW w:w="1337" w:type="dxa"/>
+          </w:tcPr>
+          <w:p>
+            <w:pPr>
+              <w:spacing w:line="240" w:lineRule="auto" w:after="40"/>
+            </w:pPr>
+            <w:r>
+              <w:t xml:space="preserve">.17</w:t>
+            </w:r>
+          </w:p>
+        </w:tc>
+        <w:tc>
+          <w:tcPr>
+            <w:tcW w:w="720" w:type="dxa"/>
+          </w:tcPr>
+          <w:p>
+            <w:pPr>
+              <w:spacing w:line="240" w:lineRule="auto" w:after="40"/>
+            </w:pPr>
+            <w:r>
+              <w:t xml:space="preserve">.23</w:t>
+            </w:r>
+          </w:p>
+        </w:tc>
+      </w:tr>
+      <w:tr>
+        <w:tc>
+          <w:tcPr>
+            <w:tcW w:w="2906" w:type="dxa"/>
+          </w:tcPr>
+          <w:p>
+            <w:pPr>
+              <w:spacing w:line="240" w:lineRule="auto" w:after="40"/>
+            </w:pPr>
+            <w:r>
+              <w:t xml:space="preserve">Social media</w:t>
+            </w:r>
+          </w:p>
+        </w:tc>
+        <w:tc>
+          <w:tcPr>
+            <w:tcW w:w="1146" w:type="dxa"/>
+          </w:tcPr>
+          <w:p>
+            <w:pPr>
+              <w:spacing w:line="240" w:lineRule="auto" w:after="40"/>
+            </w:pPr>
+            <w:r>
+              <w:t xml:space="preserve">7</w:t>
+            </w:r>
+          </w:p>
+        </w:tc>
+        <w:tc>
+          <w:tcPr>
+            <w:tcW w:w="1305" w:type="dxa"/>
+          </w:tcPr>
+          <w:p>
+            <w:pPr>
+              <w:spacing w:line="240" w:lineRule="auto" w:after="40"/>
+            </w:pPr>
+            <w:r>
+              <w:t xml:space="preserve">7</w:t>
+            </w:r>
+          </w:p>
+        </w:tc>
+        <w:tc>
+          <w:tcPr>
+            <w:tcW w:w="720" w:type="dxa"/>
+          </w:tcPr>
+          <w:p>
+            <w:pPr>
+              <w:spacing w:line="240" w:lineRule="auto" w:after="40"/>
+            </w:pPr>
+            <w:r>
+              <w:t xml:space="preserve">6</w:t>
+            </w:r>
+          </w:p>
+        </w:tc>
+        <w:tc>
+          <w:tcPr>
+            <w:tcW w:w="1225" w:type="dxa"/>
+          </w:tcPr>
+          <w:p>
+            <w:pPr>
+              <w:spacing w:line="240" w:lineRule="auto" w:after="40"/>
+            </w:pPr>
+            <w:r>
+              <w:t xml:space="preserve">.86</w:t>
+            </w:r>
+          </w:p>
+        </w:tc>
+        <w:tc>
+          <w:tcPr>
+            <w:tcW w:w="1337" w:type="dxa"/>
+          </w:tcPr>
+          <w:p>
+            <w:pPr>
+              <w:spacing w:line="240" w:lineRule="auto" w:after="40"/>
+            </w:pPr>
+            <w:r>
+              <w:t xml:space="preserve">.86</w:t>
+            </w:r>
+          </w:p>
+        </w:tc>
+        <w:tc>
+          <w:tcPr>
+            <w:tcW w:w="720" w:type="dxa"/>
+          </w:tcPr>
+          <w:p>
+            <w:pPr>
+              <w:spacing w:line="240" w:lineRule="auto" w:after="40"/>
+            </w:pPr>
+            <w:r>
+              <w:t xml:space="preserve">.80</w:t>
+            </w:r>
+          </w:p>
+        </w:tc>
+      </w:tr>
+      <w:tr>
+        <w:tc>
+          <w:tcPr>
+            <w:tcW w:w="2906" w:type="dxa"/>
+          </w:tcPr>
+          <w:p>
+            <w:pPr>
+              <w:spacing w:line="240" w:lineRule="auto" w:after="40"/>
+            </w:pPr>
+            <w:r>
+              <w:t xml:space="preserve">Algorithms, data and platforms</w:t>
+            </w:r>
+          </w:p>
+        </w:tc>
+        <w:tc>
+          <w:tcPr>
+            <w:tcW w:w="1146" w:type="dxa"/>
+          </w:tcPr>
+          <w:p>
+            <w:pPr>
+              <w:spacing w:line="240" w:lineRule="auto" w:after="40"/>
+            </w:pPr>
+            <w:r>
+              <w:t xml:space="preserve">11</w:t>
+            </w:r>
+          </w:p>
+        </w:tc>
+        <w:tc>
+          <w:tcPr>
+            <w:tcW w:w="1305" w:type="dxa"/>
+          </w:tcPr>
+          <w:p>
+            <w:pPr>
+              <w:spacing w:line="240" w:lineRule="auto" w:after="40"/>
+            </w:pPr>
+            <w:r>
+              <w:t xml:space="preserve">9</w:t>
+            </w:r>
+          </w:p>
+        </w:tc>
+        <w:tc>
+          <w:tcPr>
+            <w:tcW w:w="720" w:type="dxa"/>
+          </w:tcPr>
+          <w:p>
+            <w:pPr>
+              <w:spacing w:line="240" w:lineRule="auto" w:after="40"/>
+            </w:pPr>
+            <w:r>
+              <w:t xml:space="preserve">6</w:t>
+            </w:r>
+          </w:p>
+        </w:tc>
+        <w:tc>
+          <w:tcPr>
+            <w:tcW w:w="1225" w:type="dxa"/>
+          </w:tcPr>
+          <w:p>
+            <w:pPr>
+              <w:spacing w:line="240" w:lineRule="auto" w:after="40"/>
+            </w:pPr>
+            <w:r>
+              <w:t xml:space="preserve">.67</w:t>
+            </w:r>
+          </w:p>
+        </w:tc>
+        <w:tc>
+          <w:tcPr>
+            <w:tcW w:w="1337" w:type="dxa"/>
+          </w:tcPr>
+          <w:p>
+            <w:pPr>
+              <w:spacing w:line="240" w:lineRule="auto" w:after="40"/>
+            </w:pPr>
+            <w:r>
+              <w:t xml:space="preserve">.55</w:t>
+            </w:r>
+          </w:p>
+        </w:tc>
+        <w:tc>
+          <w:tcPr>
+            <w:tcW w:w="720" w:type="dxa"/>
+          </w:tcPr>
+          <w:p>
+            <w:pPr>
+              <w:spacing w:line="240" w:lineRule="auto" w:after="40"/>
+            </w:pPr>
+            <w:r>
+              <w:t xml:space="preserve">.34</w:t>
+            </w:r>
+          </w:p>
+        </w:tc>
+      </w:tr>
+      <w:tr>
+        <w:tc>
+          <w:tcPr>
+            <w:tcW w:w="2906" w:type="dxa"/>
+          </w:tcPr>
+          <w:p>
+            <w:pPr>
+              <w:spacing w:line="240" w:lineRule="auto" w:after="40"/>
+            </w:pPr>
+            <w:r>
+              <w:t xml:space="preserve">Privacy and surveillance</w:t>
+            </w:r>
+          </w:p>
+        </w:tc>
+        <w:tc>
+          <w:tcPr>
+            <w:tcW w:w="1146" w:type="dxa"/>
+          </w:tcPr>
+          <w:p>
+            <w:pPr>
+              <w:spacing w:line="240" w:lineRule="auto" w:after="40"/>
+            </w:pPr>
+            <w:r>
+              <w:t xml:space="preserve">7</w:t>
+            </w:r>
+          </w:p>
+        </w:tc>
+        <w:tc>
+          <w:tcPr>
+            <w:tcW w:w="1305" w:type="dxa"/>
+          </w:tcPr>
+          <w:p>
+            <w:pPr>
+              <w:spacing w:line="240" w:lineRule="auto" w:after="40"/>
+            </w:pPr>
+            <w:r>
+              <w:t xml:space="preserve">1</w:t>
+            </w:r>
+          </w:p>
+        </w:tc>
+        <w:tc>
+          <w:tcPr>
+            <w:tcW w:w="720" w:type="dxa"/>
+          </w:tcPr>
+          <w:p>
+            <w:pPr>
+              <w:spacing w:line="240" w:lineRule="auto" w:after="40"/>
+            </w:pPr>
+            <w:r>
+              <w:t xml:space="preserve">1</w:t>
+            </w:r>
+          </w:p>
+        </w:tc>
+        <w:tc>
+          <w:tcPr>
+            <w:tcW w:w="1225" w:type="dxa"/>
+          </w:tcPr>
+          <w:p>
+            <w:pPr>
+              <w:spacing w:line="240" w:lineRule="auto" w:after="40"/>
+            </w:pPr>
+            <w:r>
+              <w:t xml:space="preserve">1.00</w:t>
+            </w:r>
+          </w:p>
+        </w:tc>
+        <w:tc>
+          <w:tcPr>
+            <w:tcW w:w="1337" w:type="dxa"/>
+          </w:tcPr>
+          <w:p>
+            <w:pPr>
+              <w:spacing w:line="240" w:lineRule="auto" w:after="40"/>
+            </w:pPr>
+            <w:r>
+              <w:t xml:space="preserve">.14</w:t>
+            </w:r>
+          </w:p>
+        </w:tc>
+        <w:tc>
+          <w:tcPr>
+            <w:tcW w:w="720" w:type="dxa"/>
+          </w:tcPr>
+          <w:p>
+            <w:pPr>
+              <w:spacing w:line="240" w:lineRule="auto" w:after="40"/>
+            </w:pPr>
+            <w:r>
+              <w:t xml:space="preserve">.19</w:t>
+            </w:r>
+          </w:p>
+        </w:tc>
+      </w:tr>
+      <w:tr>
+        <w:tc>
+          <w:tcPr>
+            <w:tcW w:w="2906" w:type="dxa"/>
+          </w:tcPr>
+          <w:p>
+            <w:pPr>
+              <w:spacing w:line="240" w:lineRule="auto" w:after="40"/>
+            </w:pPr>
+            <w:r>
+              <w:t xml:space="preserve">Hate speech and radicalisation</w:t>
+            </w:r>
+          </w:p>
+        </w:tc>
+        <w:tc>
+          <w:tcPr>
+            <w:tcW w:w="1146" w:type="dxa"/>
+          </w:tcPr>
+          <w:p>
+            <w:pPr>
+              <w:spacing w:line="240" w:lineRule="auto" w:after="40"/>
+            </w:pPr>
+            <w:r>
+              <w:t xml:space="preserve">1</w:t>
+            </w:r>
+          </w:p>
+        </w:tc>
+        <w:tc>
+          <w:tcPr>
+            <w:tcW w:w="1305" w:type="dxa"/>
+          </w:tcPr>
+          <w:p>
+            <w:pPr>
+              <w:spacing w:line="240" w:lineRule="auto" w:after="40"/>
+            </w:pPr>
+            <w:r>
+              <w:t xml:space="preserve">0</w:t>
+            </w:r>
+          </w:p>
+        </w:tc>
+        <w:tc>
+          <w:tcPr>
+            <w:tcW w:w="720" w:type="dxa"/>
+          </w:tcPr>
+          <w:p>
+            <w:pPr>
+              <w:spacing w:line="240" w:lineRule="auto" w:after="40"/>
+            </w:pPr>
+            <w:r>
+              <w:t xml:space="preserve">0</w:t>
+            </w:r>
+          </w:p>
+        </w:tc>
+        <w:tc>
+          <w:tcPr>
+            <w:tcW w:w="1225" w:type="dxa"/>
+          </w:tcPr>
+          <w:p>
+            <w:pPr>
+              <w:spacing w:line="240" w:lineRule="auto" w:after="40"/>
+            </w:pPr>
+            <w:r>
+              <w:t xml:space="preserve">—</w:t>
+            </w:r>
+          </w:p>
+        </w:tc>
+        <w:tc>
+          <w:tcPr>
+            <w:tcW w:w="1337" w:type="dxa"/>
+          </w:tcPr>
+          <w:p>
+            <w:pPr>
+              <w:spacing w:line="240" w:lineRule="auto" w:after="40"/>
+            </w:pPr>
+            <w:r>
+              <w:t xml:space="preserve">.00</w:t>
+            </w:r>
+          </w:p>
+        </w:tc>
+        <w:tc>
+          <w:tcPr>
+            <w:tcW w:w="720" w:type="dxa"/>
+          </w:tcPr>
+          <w:p>
+            <w:pPr>
+              <w:spacing w:line="240" w:lineRule="auto" w:after="40"/>
+            </w:pPr>
+            <w:r>
+              <w:t xml:space="preserve">.00</w:t>
+            </w:r>
+          </w:p>
+        </w:tc>
+      </w:tr>
+      <w:tr>
+        <w:tc>
+          <w:tcPr>
+            <w:tcW w:w="2906" w:type="dxa"/>
+          </w:tcPr>
+          <w:p>
+            <w:pPr>
+              <w:spacing w:line="240" w:lineRule="auto" w:after="40"/>
+            </w:pPr>
+            <w:r>
+              <w:t xml:space="preserve">Second or foreign language education</w:t>
+            </w:r>
+          </w:p>
+        </w:tc>
+        <w:tc>
+          <w:tcPr>
+            <w:tcW w:w="1146" w:type="dxa"/>
+          </w:tcPr>
+          <w:p>
+            <w:pPr>
+              <w:spacing w:line="240" w:lineRule="auto" w:after="40"/>
+            </w:pPr>
+            <w:r>
+              <w:t xml:space="preserve">6</w:t>
+            </w:r>
+          </w:p>
+        </w:tc>
+        <w:tc>
+          <w:tcPr>
+            <w:tcW w:w="1305" w:type="dxa"/>
+          </w:tcPr>
+          <w:p>
+            <w:pPr>
+              <w:spacing w:line="240" w:lineRule="auto" w:after="40"/>
+            </w:pPr>
+            <w:r>
+              <w:t xml:space="preserve">3</w:t>
+            </w:r>
+          </w:p>
+        </w:tc>
+        <w:tc>
+          <w:tcPr>
+            <w:tcW w:w="720" w:type="dxa"/>
+          </w:tcPr>
+          <w:p>
+            <w:pPr>
+              <w:spacing w:line="240" w:lineRule="auto" w:after="40"/>
+            </w:pPr>
+            <w:r>
+              <w:t xml:space="preserve">3</w:t>
+            </w:r>
+          </w:p>
+        </w:tc>
+        <w:tc>
+          <w:tcPr>
+            <w:tcW w:w="1225" w:type="dxa"/>
+          </w:tcPr>
+          <w:p>
+            <w:pPr>
+              <w:spacing w:line="240" w:lineRule="auto" w:after="40"/>
+            </w:pPr>
+            <w:r>
+              <w:t xml:space="preserve">1.00</w:t>
+            </w:r>
+          </w:p>
+        </w:tc>
+        <w:tc>
+          <w:tcPr>
+            <w:tcW w:w="1337" w:type="dxa"/>
+          </w:tcPr>
+          <w:p>
+            <w:pPr>
+              <w:spacing w:line="240" w:lineRule="auto" w:after="40"/>
+            </w:pPr>
+            <w:r>
+              <w:t xml:space="preserve">.50</w:t>
+            </w:r>
+          </w:p>
+        </w:tc>
+        <w:tc>
+          <w:tcPr>
+            <w:tcW w:w="720" w:type="dxa"/>
+          </w:tcPr>
+          <w:p>
+            <w:pPr>
+              <w:spacing w:line="240" w:lineRule="auto" w:after="40"/>
+            </w:pPr>
+            <w:r>
+              <w:t xml:space="preserve">.60</w:t>
+            </w:r>
+          </w:p>
+        </w:tc>
+      </w:tr>
+      <w:tr>
+        <w:tc>
+          <w:tcPr>
+            <w:tcW w:w="2906" w:type="dxa"/>
+          </w:tcPr>
+          <w:p>
+            <w:pPr>
+              <w:spacing w:line="240" w:lineRule="auto" w:after="40"/>
+            </w:pPr>
+            <w:r>
+              <w:t xml:space="preserve">Student media production</w:t>
+            </w:r>
+          </w:p>
+        </w:tc>
+        <w:tc>
+          <w:tcPr>
+            <w:tcW w:w="1146" w:type="dxa"/>
+          </w:tcPr>
+          <w:p>
+            <w:pPr>
+              <w:spacing w:line="240" w:lineRule="auto" w:after="40"/>
+            </w:pPr>
+            <w:r>
+              <w:t xml:space="preserve">5</w:t>
+            </w:r>
+          </w:p>
+        </w:tc>
+        <w:tc>
+          <w:tcPr>
+            <w:tcW w:w="1305" w:type="dxa"/>
+          </w:tcPr>
+          <w:p>
+            <w:pPr>
+              <w:spacing w:line="240" w:lineRule="auto" w:after="40"/>
+            </w:pPr>
+            <w:r>
+              <w:t xml:space="preserve">1</w:t>
+            </w:r>
+          </w:p>
+        </w:tc>
+        <w:tc>
+          <w:tcPr>
+            <w:tcW w:w="720" w:type="dxa"/>
+          </w:tcPr>
+          <w:p>
+            <w:pPr>
+              <w:spacing w:line="240" w:lineRule="auto" w:after="40"/>
+            </w:pPr>
+            <w:r>
+              <w:t xml:space="preserve">1</w:t>
+            </w:r>
+          </w:p>
+        </w:tc>
+        <w:tc>
+          <w:tcPr>
+            <w:tcW w:w="1225" w:type="dxa"/>
+          </w:tcPr>
+          <w:p>
+            <w:pPr>
+              <w:spacing w:line="240" w:lineRule="auto" w:after="40"/>
+            </w:pPr>
+            <w:r>
+              <w:t xml:space="preserve">1.00</w:t>
+            </w:r>
+          </w:p>
+        </w:tc>
+        <w:tc>
+          <w:tcPr>
+            <w:tcW w:w="1337" w:type="dxa"/>
+          </w:tcPr>
+          <w:p>
+            <w:pPr>
+              <w:spacing w:line="240" w:lineRule="auto" w:after="40"/>
+            </w:pPr>
+            <w:r>
+              <w:t xml:space="preserve">.20</w:t>
+            </w:r>
+          </w:p>
+        </w:tc>
+        <w:tc>
+          <w:tcPr>
+            <w:tcW w:w="720" w:type="dxa"/>
+          </w:tcPr>
+          <w:p>
+            <w:pPr>
+              <w:spacing w:line="240" w:lineRule="auto" w:after="40"/>
+            </w:pPr>
+            <w:r>
+              <w:t xml:space="preserve">.29</w:t>
+            </w:r>
+          </w:p>
+        </w:tc>
+      </w:tr>
+    </w:tbl>
+    <w:p>
+      <w:pPr/>
+      <w:r>
+        <w:rPr>
+          <w:i/>
+        </w:rPr>
+        <w:t xml:space="preserve">Note.</w:t>
+      </w:r>
+      <w:r>
+        <w:t xml:space="preserve"> Full text: studies coded in the full-text reading. Dictionary: studies coded by the dictionaries from titles, abstracts and keywords. Both: studies coded by both. Precision = both ÷ dictionary; sensitivity = both ÷ full text; κ: Cohen's kappa. Precision is undefined when a dictionary assigned no code. The full-text codes were assigned by a single coder, a large language model applying the codebook (Supplementary files S4 and S5).</w:t>
+      </w:r>
+    </w:p>
+    <w:p>
+      <w:pPr/>
+      <w:r>
+        <w:t xml:space="preserve">Outcome evaluation was rare. Of the 25 eligible studies, 16 did not examine what participants learned, 5 offered qualitative evidence of learning or change after an intervention, 4 reported quantitative measures before and after without a comparison group, and none used a comparative design. Interventions were more frequent than the dictionaries suggest (10 of the 25), and all but one of them reported some evaluation.</w:t>
+      </w:r>
+    </w:p>
+    <w:p>
+      <w:pPr/>
+      <w:r>
+        <w:t xml:space="preserve">The three dimensions of the working definition were unevenly present. Of the 25 eligible studies, 18 addressed the textual dimension, 14 the infrastructural and 9 the transformative; 9 addressed the textual dimension alone, and 4 all three. The infrastructural dimension was more frequent in the latest period, in 10 of the 16 studies from 2024–2026 against 3 of the 7 from 2020–2023. In five of the nine studies with a transformative dimension, action was proposed or anticipated rather than documented. Four showed participants acting to change a practice or a technology, for example by reporting analyses of open data to public authorities (Atenas et al., 2023) or by redesigning lessons to resist the bias of AI recommendations (Zagami, 2026).</w:t>
+      </w:r>
+    </w:p>
+    <w:p>
+      <w:pPr>
         <w:pStyle w:val="Heading2"/>
       </w:pPr>
       <w:r>
@@ -6430,7 +8962,7 @@
     <w:p>
       <w:pPr/>
       <w:r>
-        <w:t xml:space="preserve">Research on CDL in formal education has grown by about a fifth each year and now produces more studies in a year than it did in its first four years together. The review points to three imbalances in that growth. The field follows each new technology closely, it is concentrated at the top of the education system, and it describes far more than it evaluates. A fourth finding concerns the review itself: in this field, titles are a poor guide to content.</w:t>
+        <w:t xml:space="preserve">Research on CDL in formal education has grown by about a fifth each year and now produces more studies in a year than it did in its first four years together. The review points to three imbalances in that growth. The field follows each new technology closely, it is concentrated at the top of the education system, and it describes far more than it evaluates. A fourth finding concerns the review itself: in this field, titles and abstracts are a poor guide to content, and a third of the studies read in full did not make CDL their concern.</w:t>
       </w:r>
     </w:p>
     <w:p>
@@ -6444,13 +8976,13 @@
     <w:p>
       <w:pPr/>
       <w:r>
-        <w:t xml:space="preserve">The widening of attention from social media to platforms and then to generative AI shows a field able to respond quickly. Attention to social media did not fall, so the pattern is one of accumulation rather than replacement. Within three years of the release of ChatGPT, AI had become the most frequent object of critique in the corpus. That speed has a cost. Each new technology tends to bring its own literacy, and the corpus already contains data literacy, algorithmic literacy, prompt literacy and critical AI literacy alongside CDL. If every technology gets its own framework, the field will struggle to accumulate knowledge, and teachers will face a new vocabulary every few years.</w:t>
-      </w:r>
-    </w:p>
-    <w:p>
-      <w:pPr/>
-      <w:r>
-        <w:t xml:space="preserve">The working definition used here suggests a way through. Its infrastructural dimension, which asks who owns a technology, what data it collects and whose interests it serves, does not depend on any particular device. It applies to a social network, a learning platform or a language model alike. That is the point Pangrazio (2016) and Pötzsch (2019) made before generative AI existed, and it fits the broader analyses of platformisation and datafication in education (van Dijck et al., 2018; Williamson, 2017). The co-occurrence results point in the same direction. Platforms and AI are most often studied through digital citizenship and through race, gender and decolonial perspectives, which are concerned with governance and justice rather than with reading individual texts. Social media, the older object, is still read mostly through media literacy and multiliteracies. The field seems to be moving from the critique of representation towards the critique of infrastructure, and that move is what can give it continuity.</w:t>
+        <w:t xml:space="preserve">The widening of attention from social media to platforms and then to generative AI shows a field able to respond quickly. Attention to social media did not fall, so the pattern is one of accumulation rather than replacement. Within three years of the release of ChatGPT, AI had become the most frequent object of critique in the corpus. Part of that response is nominal. Fewer than half of the sampled studies coded for AI made CDL a central concern; the others invoked it in a closing recommendation or reduced it to ethical attitudes or to checking sources. That speed has a cost. Each new technology tends to bring its own literacy, and the corpus already contains data literacy, algorithmic literacy, prompt literacy and critical AI literacy alongside CDL. If every technology gets its own framework, the field will struggle to accumulate knowledge, and teachers will face a new vocabulary every few years.</w:t>
+      </w:r>
+    </w:p>
+    <w:p>
+      <w:pPr/>
+      <w:r>
+        <w:t xml:space="preserve">The working definition used here suggests a way through. Its infrastructural dimension, which asks who owns a technology, what data it collects and whose interests it serves, does not depend on any particular device. It applies to a social network, a learning platform or a language model alike. That is the point Pangrazio (2016) and Pötzsch (2019) made before generative AI existed, and it fits the broader analyses of platformisation and datafication in education (van Dijck et al., 2018; Williamson, 2017). The co-occurrence results point in the same direction. Platforms and AI are most often studied through digital citizenship and through race, gender and decolonial perspectives, which are concerned with governance and justice rather than with reading individual texts. Social media, the older object, is still read mostly through media literacy and multiliteracies. The full texts lend this some direct support, though the numbers are small: the infrastructural dimension appeared in 10 of the 16 eligible studies from 2024–2026 and in 3 of the 7 from 2020–2023. The field seems to be moving from the critique of representation towards the critique of infrastructure, and that move is what can give it continuity.</w:t>
       </w:r>
     </w:p>
     <w:p>
@@ -6478,7 +9010,13 @@
     <w:p>
       <w:pPr/>
       <w:r>
-        <w:t xml:space="preserve">Qualitative and conceptual designs are the most frequent codes, and the share of studies that describe an intervention has not grown. Evidence of what learners gain can come from qualitative as well as quantitative designs, but few studies of either kind appear to set out to evaluate outcomes. The new instruments for CDL and critical AI literacy (AlGhannama et al., 2025; Bozkurt et al., 2026) could support comparative designs, but they also bring a risk the field should name. A literacy whose aim is to question how systems sort and score people can be reduced, in turn, to a score. Evaluation designs that combine measures with analyses of what learners produce and say would be more consistent with what CDL sets out to do.</w:t>
+        <w:t xml:space="preserve">Qualitative and conceptual designs are the most frequent codes, and the share of studies that describe an intervention has not grown. The full texts confirm the gap. Of the 25 eligible studies read, 16 did not examine what participants learned and none compared participants with a group that did not take part; the interventions that were evaluated relied on qualitative evidence or on measures taken before and after. Evidence of what learners gain can come from qualitative as well as quantitative designs, and the field has some of the first kind. What it lacks are designs that allow a change to be attributed to a practice.</w:t>
+      </w:r>
+    </w:p>
+    <w:p>
+      <w:pPr/>
+      <w:r>
+        <w:t xml:space="preserve">The transformative dimension, the one that asks learners to act, is also the least developed: it appeared in 9 of the 25 studies and was documented as practice in only 4. The new instruments for CDL and critical AI literacy (AlGhannama et al., 2025; Bozkurt et al., 2026) could support comparative designs, but they bring a risk the field should name. A literacy whose aim is to question how systems sort and score people can be reduced, in turn, to a score, and the one scale read in full here measured ethical beliefs about AI rather than any critique of power (Bozkurt et al., 2026). Evaluation designs that combine measures with analyses of what learners produce and say would be more consistent with what CDL sets out to do.</w:t>
       </w:r>
     </w:p>
     <w:p>
@@ -6520,7 +9058,13 @@
     <w:p>
       <w:pPr/>
       <w:r>
-        <w:t xml:space="preserve">The two screening passes agreed only moderately. Neither pass alone reproduced the final selection. Compared with it, the title pass would have missed 28 of the 135 included studies (20.7%) and kept 22 that were finally excluded; the abstract-and-keyword pass would have missed 22 and kept 22. Because the final selection was built from both passes, these figures show how far each pass departs from it, not independent error rates. Some studies name CDL only in their abstract or keywords, and some titles that sound critical describe something else. The second reviewer, reading the abstracts, confirmed every decision that the rule had taken on the disputed records. Reviews of CDL, and probably of other critical literacies, should not rely on titles alone. Field-level searches inside abstracts offer a reproducible second pass, but reproducibility is not validity: they locate candidate studies and do not replace reading them.</w:t>
+        <w:t xml:space="preserve">The two screening passes agreed only moderately. Neither pass alone reproduced the final selection. Compared with it, the title pass would have missed 28 of the 135 included studies (20.7%) and kept 22 that were finally excluded; the abstract-and-keyword pass would have missed 22 and kept 22. Because the final selection was built from both passes, these figures show how far each pass departs from it, not independent error rates. Some studies name CDL only in their abstract or keywords, and some titles that sound critical describe something else.</w:t>
+      </w:r>
+    </w:p>
+    <w:p>
+      <w:pPr/>
+      <w:r>
+        <w:t xml:space="preserve">The full texts give a firmer measure, and it is less reassuring than the check on abstracts. The second reviewer, reading abstracts, had confirmed every decision that the rule took on disputed records. Yet only 3 of the 10 sampled studies admitted on two indicators made CDL a central concern, against 20 of the 25 on which both passes had agreed. An abstract can combine the right terms and still describe a study of something else, such as the adoption or regulation of AI or the evaluation of sources. Reviews of CDL, and probably of other critical literacies, should not rely on titles and abstracts. Field-level searches inside abstracts offer a reproducible way to locate candidate studies, but reproducibility is not validity, and only full texts settle what a study is about.</w:t>
       </w:r>
     </w:p>
     <w:p>
@@ -6534,7 +9078,7 @@
     <w:p>
       <w:pPr/>
       <w:r>
-        <w:t xml:space="preserve">The review has five main limitations.</w:t>
+        <w:t xml:space="preserve">The review has six main limitations.</w:t>
       </w:r>
     </w:p>
     <w:p>
@@ -6552,7 +9096,7 @@
         <w:t xml:space="preserve">Full texts read only for a sample.</w:t>
       </w:r>
       <w:r>
-        <w:t xml:space="preserve"> The Scopus access available did not return the text of abstracts, so both screening passes and the charting rest on titles and on term searches in abstracts and keywords. A second reviewer read the abstracts of 169 records, and full texts were read for a random sample of 40 studies. For the other 95 studies, codes show that a term appears, not how a study treats it, and the synthesis describes what studies set out to do rather than what they found. Because the sample was drawn from open-access studies only, it over-represents open-access journals, which in this corpus publish 16 of the 19 Spanish-language studies and most of the recent ones; its estimates of dictionary accuracy may not transfer exactly to subscription journals.</w:t>
+        <w:t xml:space="preserve"> The Scopus access available did not return the text of abstracts, so both screening passes and the charting rest on titles and on term searches in abstracts and keywords. A second reviewer read the abstracts of 169 records, and full texts were read for 38 open-access studies. They show that the corpus is broader than the definition: 25 of the 38 made CDL a central concern (95% CI 50–79%), so the 135 studies are best read as research indexed under CDL, of which perhaps two thirds is CDL research in the sense used here. For the 97 studies not read, codes show that a term appears, not how a study treats it, and the synthesis describes what studies set out to do rather than what they found. Because the sample was drawn from open-access studies only, and two of its four studies from 2016–2019 could not be retrieved, its estimates may not transfer exactly to subscription journals or to the earliest years.</w:t>
       </w:r>
     </w:p>
     <w:p>
@@ -6588,7 +9132,7 @@
         <w:t xml:space="preserve">Term-based coding.</w:t>
       </w:r>
       <w:r>
-        <w:t xml:space="preserve"> Codes depend on the dictionaries, and reproducible coding is not the same as valid coding: the dictionaries locate vocabulary, and the categories they assign were not checked against the full texts. The strict dictionaries show that the main trends do not depend on the broader terms, but codes for level and design are less reliable, and 30 studies received no level code, 34 no design code and 54 no tradition code.</w:t>
+        <w:t xml:space="preserve"> Codes depend on the dictionaries, and reproducible coding is not the same as valid coding. The full-text check shows that the dictionaries for AI, secondary education and social media are reliable, but that those for disinformation, privacy, student production, Freirean pedagogy and interventions miss most cases, and that the code for early childhood and primary education is inflated (Table 8). Trends in these categories are trends in vocabulary. The strict dictionaries show that the main trends do not depend on the broader terms; even so, 30 studies received no level code, 34 no design code and 54 no tradition code.</w:t>
       </w:r>
     </w:p>
     <w:p>
@@ -6603,10 +9147,10 @@
         <w:rPr>
           <w:b/>
         </w:rPr>
-        <w:t xml:space="preserve">Coverage.</w:t>
-      </w:r>
-      <w:r>
-        <w:t xml:space="preserve"> Only Scopus was searched, and only English and Spanish were included. Web of Science, ERIC, SciELO and Redalyc, and research in Portuguese, would broaden the picture, especially for Latin America.</w:t>
+        <w:t xml:space="preserve">Full-text coding by a single automated coder.</w:t>
+      </w:r>
+      <w:r>
+        <w:t xml:space="preserve"> The full texts were coded by a large language model applying the codebook, with no second coder, so the reliability of these codes is unknown. Each code is backed by a quotation and page (Supplementary file S5) and can be audited, but none was checked by a second person. Fifteen eligibility decisions were borderline: under the most restrictive and the most inclusive reading of those cases, between 19 and 34 of the 38 studies would be eligible.</w:t>
       </w:r>
     </w:p>
     <w:p>
@@ -6621,6 +9165,24 @@
         <w:rPr>
           <w:b/>
         </w:rPr>
+        <w:t xml:space="preserve">Coverage.</w:t>
+      </w:r>
+      <w:r>
+        <w:t xml:space="preserve"> Only Scopus was searched, and only English and Spanish were included. Web of Science, ERIC, SciELO and Redalyc, and research in Portuguese, would broaden the picture, especially for Latin America.</w:t>
+      </w:r>
+    </w:p>
+    <w:p>
+      <w:pPr>
+        <w:pStyle w:val="ListParagraph"/>
+        <w:numPr>
+          <w:ilvl w:val="0"/>
+          <w:numId w:val="3"/>
+        </w:numPr>
+      </w:pPr>
+      <w:r>
+        <w:rPr>
+          <w:b/>
+        </w:rPr>
         <w:t xml:space="preserve">Time.</w:t>
       </w:r>
       <w:r>
@@ -6638,7 +9200,7 @@
     <w:p>
       <w:pPr/>
       <w:r>
-        <w:t xml:space="preserve">Between 2016 and 2026, research on critical digital literacy in formal education moved from a small niche, with two studies in 2016, to a fast-growing field, with 52 studies in 2026 alone. It has widened its attention from social media to platforms, data and artificial intelligence without leaving social media behind, and the vocabulary of media literacy that marked its early years now appears alongside that of critical pedagogy and of race, gender and decolonial perspectives. Research written in Spanish, almost absent before 2020, now makes up a fifth of the newest studies.</w:t>
+        <w:t xml:space="preserve">Between 2016 and 2026, research on critical digital literacy in formal education moved from a small niche, with two studies in 2016, to a fast-growing field, with 52 studies in 2026 alone, although a third of the studies read in full used the term without making CDL their concern. It has widened its attention from social media to platforms, data and artificial intelligence without leaving social media behind, and the vocabulary of media literacy that marked its early years now appears alongside that of critical pedagogy and of race, gender and decolonial perspectives. Research written in Spanish, almost absent before 2020, now makes up a fifth of the newest studies.</w:t>
       </w:r>
     </w:p>
     <w:p>
@@ -6664,7 +9226,7 @@
     <w:p>
       <w:pPr/>
       <w:r>
-        <w:t xml:space="preserve">The search string, the 469 records, the decisions of both screening passes, the adjudication, the coding of the 135 included studies and the code that produces them are archived as an open data set (Author, 2026) at [repository link removed for anonymous review]. Supplementary file S1 lists the included studies with their codes, and supplementary file S2 gives the decisions of both screening passes for all 469 records.</w:t>
+        <w:t xml:space="preserve">The search string, the 469 records, the decisions of both screening passes, the adjudication, the coding of the 135 included studies, the full-text validation and the code that produces them are archived as an open data set (Author, 2026) at [repository link removed for anonymous review]. Supplementary file S1 lists the included studies with their codes; supplementary file S2 gives the decisions of both screening passes for all 469 records; supplementary file S4 gives the codebook for the full-text validation; and supplementary file S5 gives the full-text codes with their supporting quotations.</w:t>
       </w:r>
     </w:p>
     <w:p>
@@ -6692,7 +9254,7 @@
     <w:p>
       <w:pPr/>
       <w:r>
-        <w:t xml:space="preserve">A large language model (Claude, Anthropic) was used for study design (drafting the search string and the screening and coding procedures), data collection (running the Scopus queries through the Scopus APIs), literature review (proposing the title-screening decisions of pass 1 and drafting the dictionaries for pass 2 and for coding), data analysis (writing the Python code for screening, coding and the statistical tests), figure creation (drawing Figures 1–5 and building the tables) and writing assistance (drafting and revising the manuscript). It was also used to check the references against Crossref, OpenAlex and ORCID records. A second, human reviewer read the abstracts of 169 records to verify the screening (see Method). The author checked the decisions, the analyses, the references and the text, and takes full responsibility for the content.</w:t>
+        <w:t xml:space="preserve">A large language model (Claude, Anthropic) was used for study design (drafting the search string and the screening and coding procedures), data collection (running the Scopus queries through the Scopus APIs and retrieving the open-access full texts of the validation sample), literature review (proposing the title-screening decisions of pass 1, drafting the dictionaries for pass 2 and for coding, and coding the full texts of the validation sample with the codebook, recording a supporting quotation and page for each code), data analysis (writing the Python code for screening, coding and the statistical tests), figure creation (drawing Figures 1–5 and building the tables) and writing assistance (drafting and revising the manuscript). It was also used to check the references against Crossref, OpenAlex and ORCID records. A second, human reviewer read the abstracts of 169 records to verify the screening (see Method). No second person coded the full texts. The author checked the decisions, the analyses, the references and the text, and takes full responsibility for the content.</w:t>
       </w:r>
     </w:p>
     <w:p>
@@ -6772,7 +9334,7 @@
         <w:t xml:space="preserve">18</w:t>
       </w:r>
       <w:r>
-        <w:t xml:space="preserve">(2), ep651. https://doi.org/10.30935/cedtech/18477</w:t>
+        <w:t xml:space="preserve">(2), Article ep651. https://doi.org/10.30935/cedtech/18477</w:t>
       </w:r>
     </w:p>
     <w:p>
@@ -6898,7 +9460,7 @@
         <w:t xml:space="preserve">15</w:t>
       </w:r>
       <w:r>
-        <w:t xml:space="preserve">(1), ep397. https://doi.org/10.30935/cedtech/12599</w:t>
+        <w:t xml:space="preserve">(1), Article ep397. https://doi.org/10.30935/cedtech/12599</w:t>
       </w:r>
     </w:p>
     <w:p>
@@ -6922,7 +9484,7 @@
         <w:t xml:space="preserve">9</w:t>
       </w:r>
       <w:r>
-        <w:t xml:space="preserve">(8), 134. https://doi.org/10.3390/SOCSCI9080134</w:t>
+        <w:t xml:space="preserve">(8), Article 134. https://doi.org/10.3390/SOCSCI9080134</w:t>
       </w:r>
     </w:p>
     <w:p>
@@ -6994,7 +9556,7 @@
         <w:t xml:space="preserve">67</w:t>
       </w:r>
       <w:r>
-        <w:t xml:space="preserve">, 101186. https://doi.org/10.1016/j.jslw.2025.101186</w:t>
+        <w:t xml:space="preserve">, Article 101186. https://doi.org/10.1016/j.jslw.2025.101186</w:t>
       </w:r>
     </w:p>
     <w:p>
@@ -7114,7 +9676,7 @@
         <w:t xml:space="preserve">25</w:t>
       </w:r>
       <w:r>
-        <w:t xml:space="preserve">(1), e32220. https://doi.org/10.15381/lengsoc.v25i1.32220</w:t>
+        <w:t xml:space="preserve">(1), Article e32220. https://doi.org/10.15381/lengsoc.v25i1.32220</w:t>
       </w:r>
     </w:p>
     <w:p>
@@ -7153,7 +9715,7 @@
         <w:t xml:space="preserve">135</w:t>
       </w:r>
       <w:r>
-        <w:t xml:space="preserve">, 103871. https://doi.org/10.1016/j.system.2025.103871</w:t>
+        <w:t xml:space="preserve">, Article 103871. https://doi.org/10.1016/j.system.2025.103871</w:t>
       </w:r>
     </w:p>
     <w:p>
@@ -7321,7 +9883,7 @@
         <w:t xml:space="preserve">135</w:t>
       </w:r>
       <w:r>
-        <w:t xml:space="preserve">, 103867. https://doi.org/10.1016/j.system.2025.103867</w:t>
+        <w:t xml:space="preserve">, Article 103867. https://doi.org/10.1016/j.system.2025.103867</w:t>
       </w:r>
     </w:p>
     <w:p>
@@ -7345,7 +9907,7 @@
         <w:t xml:space="preserve">11</w:t>
       </w:r>
       <w:r>
-        <w:t xml:space="preserve">(3), e3425. https://doi.org/10.1002/rev3.3425</w:t>
+        <w:t xml:space="preserve">(3), Article e3425. https://doi.org/10.1002/rev3.3425</w:t>
       </w:r>
     </w:p>
     <w:p>
@@ -7384,7 +9946,7 @@
         <w:t xml:space="preserve">28</w:t>
       </w:r>
       <w:r>
-        <w:t xml:space="preserve">(1), 194. https://doi.org/10.1007/s10791-025-09720-0</w:t>
+        <w:t xml:space="preserve">(1), Article 194. https://doi.org/10.1007/s10791-025-09720-0</w:t>
       </w:r>
     </w:p>
     <w:p>
@@ -7480,7 +10042,7 @@
         <w:t xml:space="preserve">137</w:t>
       </w:r>
       <w:r>
-        <w:t xml:space="preserve">, 103930. https://doi.org/10.1016/j.system.2025.103930</w:t>
+        <w:t xml:space="preserve">, Article 103930. https://doi.org/10.1016/j.system.2025.103930</w:t>
       </w:r>
     </w:p>
     <w:p>
@@ -7510,6 +10072,30 @@
     <w:p>
       <w:pPr/>
       <w:r>
+        <w:t xml:space="preserve">Lalira, J. E., &amp; Warouw, M. P. (2026). Critical digital literacy enacted by Indonesian first-year undergraduates: A corpus-assisted study. </w:t>
+      </w:r>
+      <w:r>
+        <w:rPr>
+          <w:i/>
+        </w:rPr>
+        <w:t xml:space="preserve">Reading &amp; Writing</w:t>
+      </w:r>
+      <w:r>
+        <w:t xml:space="preserve">, </w:t>
+      </w:r>
+      <w:r>
+        <w:rPr>
+          <w:i/>
+        </w:rPr>
+        <w:t xml:space="preserve">17</w:t>
+      </w:r>
+      <w:r>
+        <w:t xml:space="preserve">(1), Article a700. https://doi.org/10.4102/rw.v17i1.700</w:t>
+      </w:r>
+    </w:p>
+    <w:p>
+      <w:pPr/>
+      <w:r>
         <w:t xml:space="preserve">Lewis, C., Crampton, A., &amp; Scharber, C. (2021). The sociocultural role of imagination in critical digital literacy. </w:t>
       </w:r>
       <w:r>
@@ -7552,7 +10138,7 @@
         <w:t xml:space="preserve">16</w:t>
       </w:r>
       <w:r>
-        <w:t xml:space="preserve">(6), 2253. https://doi.org/10.3390/su16062253</w:t>
+        <w:t xml:space="preserve">(6), Article 2253. https://doi.org/10.3390/su16062253</w:t>
       </w:r>
     </w:p>
     <w:p>
@@ -7582,6 +10168,21 @@
     <w:p>
       <w:pPr/>
       <w:r>
+        <w:t xml:space="preserve">López-Fernández, R., George-Reyes, C. E., Sorhegui-Ortega, R. A., &amp; Sandoval-Benítez, L. F. (2026). Inteligencia artificial en la universidad: Análisis de género de las perspectivas éticas y regulatorias en cinco escenarios internacionales [Artificial intelligence in higher education: A gender analysis of ethical and regulatory perspectives across five international scenarios]. </w:t>
+      </w:r>
+      <w:r>
+        <w:rPr>
+          <w:i/>
+        </w:rPr>
+        <w:t xml:space="preserve">Edutec</w:t>
+      </w:r>
+      <w:r>
+        <w:t xml:space="preserve">, (96), Article 1. https://doi.org/10.21556/edutec.2026.96.4421</w:t>
+      </w:r>
+    </w:p>
+    <w:p>
+      <w:pPr/>
+      <w:r>
         <w:t xml:space="preserve">Luke, A. (2012). Critical literacy: Foundational notes. </w:t>
       </w:r>
       <w:r>
@@ -7624,7 +10225,7 @@
         <w:t xml:space="preserve">10</w:t>
       </w:r>
       <w:r>
-        <w:t xml:space="preserve">(1), 44. https://doi.org/10.1186/s40862-025-00350-z</w:t>
+        <w:t xml:space="preserve">(1), Article 44. https://doi.org/10.1186/s40862-025-00350-z</w:t>
       </w:r>
     </w:p>
     <w:p>
@@ -7759,7 +10360,7 @@
         <w:t xml:space="preserve">133</w:t>
       </w:r>
       <w:r>
-        <w:t xml:space="preserve">, 103779. https://doi.org/10.1016/j.system.2025.103779</w:t>
+        <w:t xml:space="preserve">, Article 103779. https://doi.org/10.1016/j.system.2025.103779</w:t>
       </w:r>
     </w:p>
     <w:p>
@@ -7846,7 +10447,7 @@
         <w:t xml:space="preserve">372</w:t>
       </w:r>
       <w:r>
-        <w:t xml:space="preserve">, n71. https://doi.org/10.1136/bmj.n71</w:t>
+        <w:t xml:space="preserve">, Article n71. https://doi.org/10.1136/bmj.n71</w:t>
       </w:r>
     </w:p>
     <w:p>
@@ -7963,7 +10564,7 @@
         <w:t xml:space="preserve">11</w:t>
       </w:r>
       <w:r>
-        <w:t xml:space="preserve">, 1716735. https://doi.org/10.3389/feduc.2026.1716735</w:t>
+        <w:t xml:space="preserve">, Article 1716735. https://doi.org/10.3389/feduc.2026.1716735</w:t>
       </w:r>
     </w:p>
     <w:p>
@@ -8161,7 +10762,7 @@
         <w:t xml:space="preserve">62</w:t>
       </w:r>
       <w:r>
-        <w:t xml:space="preserve">, 100776. https://doi.org/10.1016/j.linged.2019.100776</w:t>
+        <w:t xml:space="preserve">, Article 100776. https://doi.org/10.1016/j.linged.2019.100776</w:t>
       </w:r>
     </w:p>
     <w:p>
@@ -8272,7 +10873,7 @@
         <w:t xml:space="preserve">73</w:t>
       </w:r>
       <w:r>
-        <w:t xml:space="preserve">, 102871. https://doi.org/10.1016/j.compcom.2024.102871</w:t>
+        <w:t xml:space="preserve">, Article 102871. https://doi.org/10.1016/j.compcom.2024.102871</w:t>
       </w:r>
     </w:p>
     <w:p>
@@ -8335,7 +10936,7 @@
         <w:t xml:space="preserve">81</w:t>
       </w:r>
       <w:r>
-        <w:t xml:space="preserve">, 101676. https://doi.org/10.1016/j.jeap.2026.101676</w:t>
+        <w:t xml:space="preserve">, Article 101676. https://doi.org/10.1016/j.jeap.2026.101676</w:t>
       </w:r>
     </w:p>
     <w:p>
@@ -8383,7 +10984,7 @@
         <w:t xml:space="preserve">136</w:t>
       </w:r>
       <w:r>
-        <w:t xml:space="preserve">, 103896. https://doi.org/10.1016/j.system.2025.103896</w:t>
+        <w:t xml:space="preserve">, Article 103896. https://doi.org/10.1016/j.system.2025.103896</w:t>
       </w:r>
     </w:p>
     <w:p>
@@ -8422,7 +11023,7 @@
         <w:t xml:space="preserve">17</w:t>
       </w:r>
       <w:r>
-        <w:t xml:space="preserve">(1), 12. https://doi.org/10.3390/info17010012</w:t>
+        <w:t xml:space="preserve">(1), Article 12. https://doi.org/10.3390/info17010012</w:t>
       </w:r>
     </w:p>
     <w:p>

</xml_diff>

<commit_message>
Versión lista para enviar: descripciones cotejadas, página de título completa
- Cotejo de las descripciones de los 61 estudios citados con su texto completo
  o su resumen; corrige cuatro descripciones y retira Lo et al. (2024) de la
  tabla 6 (también en el libro de Excel).
- Página de título con afiliación, correo, financiación y enlace a los datos.
- Word del manuscrito, página de título, carta y S4 regenerados.

Co-Authored-By: Claude Opus 5.5 <noreply@anthropic.com>
Claude-Session: https://claude.ai/code/session_01W48ggkE3iqcgcPHVfB8T9P
</commit_message>
<xml_diff>
--- a/revision-adc/manuscrito-review-of-education.docx
+++ b/revision-adc/manuscrito-review-of-education.docx
@@ -1309,7 +1309,7 @@
     <w:p>
       <w:pPr/>
       <w:r>
-        <w:t xml:space="preserve">The narrative synthesis describes what the studies set out to do: their aims, settings and pedagogical approaches. It does not report their findings, because full texts were not appraised. As is usual in scoping reviews, the methodological quality of the studies was not assessed (Tricco et al., 2018).</w:t>
+        <w:t xml:space="preserve">The narrative synthesis describes what the studies set out to do: their aims, settings and pedagogical approaches. It does not report their findings, because most full texts were not read. As is usual in scoping reviews, the methodological quality of the studies was not assessed (Tricco et al., 2018).</w:t>
       </w:r>
     </w:p>
     <w:p>
@@ -1621,7 +1621,7 @@
     <w:p>
       <w:pPr/>
       <w:r>
-        <w:t xml:space="preserve">Table 3 shows how the corpus is distributed by educational level and design. Higher education is the most studied level (40.7%), followed by teacher education (28.9%) and secondary education (21.5%). Early childhood and primary education account for only 10 studies (7.4%), and their share did not grow. If anything, the code overstates them: four of the five sampled studies coded for this level were set at another. The apparent fall of secondary education, from 44.4% to 17.1%, should be read with caution: it rests on broad terms such as </w:t>
+        <w:t xml:space="preserve">Table 3 shows how the corpus is distributed by educational level and design. Higher education is the most studied level (40.7%), followed by teacher education (28.9%) and secondary education (21.5%). Early childhood and primary education account for only 10 studies (7.4%), and their share did not grow. If anything, the code overstates them: four of the five sampled studies coded for this level were set at another level. The apparent fall of secondary education, from 44.4% to 17.1%, should be read with caution: it rests on broad terms such as </w:t>
       </w:r>
       <w:r>
         <w:rPr>
@@ -2976,7 +2976,7 @@
         <w:t xml:space="preserve">Journal of Adolescent &amp; Adult Literacy</w:t>
       </w:r>
       <w:r>
-        <w:t xml:space="preserve">, a journal written largely for literacy teachers (Harrison, 2018; McArthur, 2019; Saunders et al., 2017). Both traditions fell to under a fifth of the studies in later periods, and both declines are significant. The full-text check supports this caution. In the sample, the dictionaries found 2 of the 6 studies that adopt Freirean critical pedagogy as their framework, and they agreed only in part with the full texts on media literacy and multiliteracies (κ = .46 and .62).</w:t>
+        <w:t xml:space="preserve">, a journal written largely for literacy teachers (Harrison, 2018; McArthur, 2019; Saunders et al., 2017). Both traditions fell to under a fifth of the studies in later periods, and both declines are significant. The full-text check supports reading these codes as vocabulary. In the sample, the dictionaries found 2 of the 6 studies that adopt Freirean critical pedagogy as their framework, and they agreed only in part with the full texts on media literacy and multiliteracies (κ = .46 and .62).</w:t>
       </w:r>
     </w:p>
     <w:p>
@@ -3615,7 +3615,7 @@
     <w:p>
       <w:pPr/>
       <w:r>
-        <w:t xml:space="preserve">Two traditions gained ground without reaching significance. Freirean critical pedagogy rose from one study to 14.6% of the last period. It appears in proposals for a pedagogy of the "digitally oppressed" (Farag et al., 2022), in calls for an emancipatory critical digital pedagogy in universities (Gutiérrez-Ujaque, 2024) and in work on critical digital teaching competence for future primary teachers (Castañeda &amp; Villar-Onrubia, 2023). Race, gender and decolonial perspectives appear across the whole period and cluster in recent work on AI. Examples include the critical race algorithmic literacies that Black students used to resist AI-mediated racism at school (Tanksley, 2024), a survey of U.S. adolescents' critical race digital literacy skills (McGee et al., 2026), language decolonisation among Arab bilingual learners writing with AI (Alhabbash et al., 2026) and the gendered self-surveillance of adolescents on platforms (Regueira et al., 2026).</w:t>
+        <w:t xml:space="preserve">Two traditions gained ground without reaching significance. Freirean critical pedagogy rose from one study to 14.6% of the last period. It appears in proposals for a pedagogy of the "digitally oppressed" (Farag et al., 2022), in calls for an emancipatory critical digital pedagogy in universities (Gutiérrez-Ujaque, 2024) and in a translation workshop on a cyberbullying campaign (Damaskinidis et al., 2026). Race, gender and decolonial perspectives appear across the whole period and cluster in recent work on AI. Examples include the critical race algorithmic literacies that Black students used to resist AI-mediated racism at school (Tanksley, 2024), a survey of U.S. adolescents' critical race digital literacy skills (McGee et al., 2026), language decolonisation among Arab bilingual learners writing with AI (Alhabbash et al., 2026) and the gendered self-surveillance of adolescents on platforms (Regueira et al., 2026).</w:t>
       </w:r>
     </w:p>
     <w:p>
@@ -5450,7 +5450,7 @@
               <w:spacing w:line="240" w:lineRule="auto" w:after="40"/>
             </w:pPr>
             <w:r>
-              <w:t xml:space="preserve">Video production in elementary teacher education (Watt, 2019); digital storytelling on District Six (Noble &amp; Gachago, 2022); bilingual Vine making (de los Ríos, 2018); a poster campaign on cyberbullying (Damaskinidis et al., 2026)</w:t>
+              <w:t xml:space="preserve">Video production in elementary teacher education (Watt, 2019); digital storytelling on District Six (Noble &amp; Gachago, 2022); bilingual Vine making (de los Ríos, 2018); translating a poster campaign on cyberbullying (Damaskinidis et al., 2026)</w:t>
             </w:r>
           </w:p>
         </w:tc>
@@ -5532,7 +5532,7 @@
               <w:spacing w:line="240" w:lineRule="auto" w:after="40"/>
             </w:pPr>
             <w:r>
-              <w:t xml:space="preserve">Co-design around an indie video game (Jiménez Torras et al., 2026); conspiracy theories in English classes (Gerlach et al., 2025); reflection notebooks on misinformation (Spracklin &amp; Espina, 2025); service learning with preschool teachers (Lo et al., 2024)</w:t>
+              <w:t xml:space="preserve">Co-designing a module with indie video games (Jiménez Torras et al., 2026); conspiracy theories in English classes (Gerlach et al., 2025); reflection notebooks on misinformation (Spracklin &amp; Espina, 2025); rating classroom tools for privacy with future primary teachers (Castañeda &amp; Villar-Onrubia, 2023)</w:t>
             </w:r>
           </w:p>
         </w:tc>
@@ -5588,7 +5588,7 @@
     <w:p>
       <w:pPr/>
       <w:r>
-        <w:t xml:space="preserve">Teachers are the focus of 39 studies (28.9%), many of them in initial teacher education. Some ask how teachers understand CDL and how it shows in their practice (Gouseti et al., 2024) or measure the skills and attitudes of future teachers (Castellví et al., 2020; Santisteban et al., 2020). Others study how teacher educators build CDL into their own work, through inquiry groups (Lohnes Watulak, 2016), scalar analyses of teacher education programmes (Stewart et al., 2021) or collaborative autoethnography (Kim et al., 2026). Since 2025 a new strand asks what generative AI means for teacher preparation, from novice teachers planning lessons with ChatGPT (Javahery et al., 2025) to bias in AI-supported differentiation (Zagami, 2026). Several studies question how CDL fits within the use-centred digital competence frameworks that organise teacher education (Castañeda &amp; Villar-Onrubia, 2023; Salazar-Jiménez et al., 2026), and some propose frameworks of their own, for instance for second-language teacher education in the Global South (Mahapatra &amp; Koltovskaia, 2025).</w:t>
+        <w:t xml:space="preserve">Teachers are the focus of 39 studies (28.9%), many of them in initial teacher education. Some ask how teachers understand CDL and how it shows in their practice (Gouseti et al., 2024) or measure the skills and attitudes of future teachers (Castellví et al., 2020; Santisteban et al., 2020). Others study how teacher educators build CDL into their own work, through inquiry groups (Lohnes Watulak, 2016), scalar analyses of teacher education programmes (Stewart et al., 2021) or collaborative autoethnography (Kim et al., 2026). Since 2025 a new strand asks what generative AI means for teacher preparation, from novice teachers planning lessons with ChatGPT (Javahery et al., 2025) to bias in AI-supported differentiation (Zagami, 2026). Several studies question how CDL fits within the use-centred digital competence frameworks that organise teacher education (Castañeda &amp; Villar-Onrubia, 2023) or examine the tensions of teaching digital citizenship in initial teacher education (Salazar-Jiménez et al., 2026), and some propose frameworks of their own, for instance for second-language teacher education in the Global South (Mahapatra &amp; Koltovskaia, 2025).</w:t>
       </w:r>
     </w:p>
     <w:p>
@@ -8976,7 +8976,7 @@
     <w:p>
       <w:pPr/>
       <w:r>
-        <w:t xml:space="preserve">The widening of attention from social media to platforms and then to generative AI shows a field able to respond quickly. Attention to social media did not fall, so the pattern is one of accumulation rather than replacement. Within three years of the release of ChatGPT, AI had become the most frequent object of critique in the corpus. Part of that response is nominal. Fewer than half of the sampled studies coded for AI made CDL a central concern; the others invoked it in a closing recommendation or reduced it to ethical attitudes or to checking sources. That speed has a cost. Each new technology tends to bring its own literacy, and the corpus already contains data literacy, algorithmic literacy, prompt literacy and critical AI literacy alongside CDL. If every technology gets its own framework, the field will struggle to accumulate knowledge, and teachers will face a new vocabulary every few years.</w:t>
+        <w:t xml:space="preserve">The widening of attention from social media to platforms and then to generative AI shows a field able to respond quickly. Attention to social media did not fall, so the pattern is one of accumulation rather than replacement. Within three years of the release of ChatGPT, AI had become the most frequent object of critique in the corpus. That speed has a cost. Each new technology tends to bring its own literacy, and the corpus already contains data literacy, algorithmic literacy, prompt literacy and critical AI literacy alongside CDL. If every technology gets its own framework, the field will struggle to accumulate knowledge, and teachers will face a new vocabulary every few years. Part of the response is also nominal: fewer than half of the sampled studies coded for AI made CDL a central concern, and the others invoked it in a closing recommendation or reduced it to ethical attitudes or to checking sources.</w:t>
       </w:r>
     </w:p>
     <w:p>
@@ -9016,7 +9016,13 @@
     <w:p>
       <w:pPr/>
       <w:r>
-        <w:t xml:space="preserve">The transformative dimension, the one that asks learners to act, is also the least developed: it appeared in 9 of the 25 studies and was documented as practice in only 4. The new instruments for CDL and critical AI literacy (AlGhannama et al., 2025; Bozkurt et al., 2026) could support comparative designs, but they bring a risk the field should name. A literacy whose aim is to question how systems sort and score people can be reduced, in turn, to a score, and the one scale read in full here measured ethical beliefs about AI rather than any critique of power (Bozkurt et al., 2026). Evaluation designs that combine measures with analyses of what learners produce and say would be more consistent with what CDL sets out to do.</w:t>
+        <w:t xml:space="preserve">The new instruments for CDL and critical AI literacy (AlGhannama et al., 2025; Bozkurt et al., 2026) could support comparative designs, but they bring a risk the field should name. A literacy whose aim is to question how systems sort and score people can be reduced, in turn, to a score, and the one scale read in full here measured ethical beliefs about AI rather than any critique of power (Bozkurt et al., 2026). Evaluation designs that combine measures with analyses of what learners produce and say would be more consistent with what CDL sets out to do.</w:t>
+      </w:r>
+    </w:p>
+    <w:p>
+      <w:pPr/>
+      <w:r>
+        <w:t xml:space="preserve">The transformative dimension, the one that asks learners to act, is the least developed of the three: it appeared in 9 of the 25 eligible studies and was documented as practice in only 4. Evaluating CDL will also mean finding out whether learners can do what that dimension asks.</w:t>
       </w:r>
     </w:p>
     <w:p>
@@ -9226,7 +9232,7 @@
     <w:p>
       <w:pPr/>
       <w:r>
-        <w:t xml:space="preserve">The search string, the 469 records, the decisions of both screening passes, the adjudication, the coding of the 135 included studies, the full-text validation and the code that produces them are archived as an open data set (Author, 2026) at [repository link removed for anonymous review]. Supplementary file S1 lists the included studies with their codes; supplementary file S2 gives the decisions of both screening passes for all 469 records; supplementary file S4 gives the codebook for the full-text validation; and supplementary file S5 gives the full-text codes with their supporting quotations.</w:t>
+        <w:t xml:space="preserve">The search string, the 469 records, the decisions of both screening passes, the adjudication, the coding of the 135 included studies, the full-text validation and the code that produces them are archived as an open data set (Author, 2026) at [repository link removed for anonymous review]. Supplementary file S1 lists the included studies with their codes; supplementary file S2 gives the decisions of both screening passes for all 469 records; supplementary file S3 gives the PRISMA-ScR checklist; supplementary file S4 gives the codebook for the full-text validation; and supplementary file S5 gives the full-text codes with their supporting quotations.</w:t>
       </w:r>
     </w:p>
     <w:p>
@@ -10115,30 +10121,6 @@
       </w:r>
       <w:r>
         <w:t xml:space="preserve">(2), 154–172. https://doi.org/10.1080/1554480X.2021.1914056</w:t>
-      </w:r>
-    </w:p>
-    <w:p>
-      <w:pPr/>
-      <w:r>
-        <w:t xml:space="preserve">Lo, H.-C., Wang, T.-H., &amp; Chen, R.-S. (2024). Enhancing critical digital literacy of preservice preschool teachers through service learning: The moderator of online social capital. </w:t>
-      </w:r>
-      <w:r>
-        <w:rPr>
-          <w:i/>
-        </w:rPr>
-        <w:t xml:space="preserve">Sustainability</w:t>
-      </w:r>
-      <w:r>
-        <w:t xml:space="preserve">, </w:t>
-      </w:r>
-      <w:r>
-        <w:rPr>
-          <w:i/>
-        </w:rPr>
-        <w:t xml:space="preserve">16</w:t>
-      </w:r>
-      <w:r>
-        <w:t xml:space="preserve">(6), Article 2253. https://doi.org/10.3390/su16062253</w:t>
       </w:r>
     </w:p>
     <w:p>

</xml_diff>